<commit_message>
P9 — render dan validasi
</commit_message>
<xml_diff>
--- a/9. Worksheet_PABW_Pertemuan9 - ID.docx
+++ b/9. Worksheet_PABW_Pertemuan9 - ID.docx
@@ -126,7 +126,47 @@
           <w:color w:val="5A6080"/>
           <w:sz w:val="18"/>
         </w:rPr>
-        <w:t>Pengembangan Aplikasi Berbasis Web  ·  SIF302  ·  Semester Gasal 2026/2027</w:t>
+        <w:t xml:space="preserve">Pengembangan </w:t>
+      </w:r>
+      <w:proofErr w:type="spellStart"/>
+      <w:r>
+        <w:rPr>
+          <w:rFonts w:cs="Carlito"/>
+          <w:i/>
+          <w:color w:val="5A6080"/>
+          <w:sz w:val="18"/>
+        </w:rPr>
+        <w:t>Aplikasi</w:t>
+      </w:r>
+      <w:proofErr w:type="spellEnd"/>
+      <w:r>
+        <w:rPr>
+          <w:rFonts w:cs="Carlito"/>
+          <w:i/>
+          <w:color w:val="5A6080"/>
+          <w:sz w:val="18"/>
+        </w:rPr>
+        <w:t xml:space="preserve"> </w:t>
+      </w:r>
+      <w:proofErr w:type="spellStart"/>
+      <w:r>
+        <w:rPr>
+          <w:rFonts w:cs="Carlito"/>
+          <w:i/>
+          <w:color w:val="5A6080"/>
+          <w:sz w:val="18"/>
+        </w:rPr>
+        <w:t>Berbasis</w:t>
+      </w:r>
+      <w:proofErr w:type="spellEnd"/>
+      <w:r>
+        <w:rPr>
+          <w:rFonts w:cs="Carlito"/>
+          <w:i/>
+          <w:color w:val="5A6080"/>
+          <w:sz w:val="18"/>
+        </w:rPr>
+        <w:t xml:space="preserve"> Web  ·  SIF302  ·  Semester Gasal 2026/2027</w:t>
       </w:r>
     </w:p>
     <w:tbl>
@@ -407,6 +447,7 @@
             <w:pPr>
               <w:spacing w:before="20" w:after="20"/>
             </w:pPr>
+            <w:proofErr w:type="spellStart"/>
             <w:r>
               <w:rPr>
                 <w:rFonts w:cs="Carlito"/>
@@ -414,8 +455,29 @@
                 <w:color w:val="FFFFFF"/>
                 <w:sz w:val="19"/>
               </w:rPr>
-              <w:t>Capaian pembelajaran</w:t>
-            </w:r>
+              <w:t>Capaian</w:t>
+            </w:r>
+            <w:proofErr w:type="spellEnd"/>
+            <w:r>
+              <w:rPr>
+                <w:rFonts w:cs="Carlito"/>
+                <w:b/>
+                <w:color w:val="FFFFFF"/>
+                <w:sz w:val="19"/>
+              </w:rPr>
+              <w:t xml:space="preserve"> </w:t>
+            </w:r>
+            <w:proofErr w:type="spellStart"/>
+            <w:r>
+              <w:rPr>
+                <w:rFonts w:cs="Carlito"/>
+                <w:b/>
+                <w:color w:val="FFFFFF"/>
+                <w:sz w:val="19"/>
+              </w:rPr>
+              <w:t>pembelajaran</w:t>
+            </w:r>
+            <w:proofErr w:type="spellEnd"/>
           </w:p>
         </w:tc>
         <w:tc>
@@ -1569,7 +1631,39 @@
                 <w:rFonts w:cs="Carlito"/>
                 <w:sz w:val="18"/>
               </w:rPr>
-              <w:t>Tiga kasus ditangani + tangkapan layar</w:t>
+              <w:t xml:space="preserve">Tiga </w:t>
+            </w:r>
+            <w:proofErr w:type="spellStart"/>
+            <w:r>
+              <w:rPr>
+                <w:rFonts w:cs="Carlito"/>
+                <w:sz w:val="18"/>
+              </w:rPr>
+              <w:t>kasus</w:t>
+            </w:r>
+            <w:proofErr w:type="spellEnd"/>
+            <w:r>
+              <w:rPr>
+                <w:rFonts w:cs="Carlito"/>
+                <w:sz w:val="18"/>
+              </w:rPr>
+              <w:t xml:space="preserve"> </w:t>
+            </w:r>
+            <w:proofErr w:type="spellStart"/>
+            <w:r>
+              <w:rPr>
+                <w:rFonts w:cs="Carlito"/>
+                <w:sz w:val="18"/>
+              </w:rPr>
+              <w:t>ditangani</w:t>
+            </w:r>
+            <w:proofErr w:type="spellEnd"/>
+            <w:r>
+              <w:rPr>
+                <w:rFonts w:cs="Carlito"/>
+                <w:sz w:val="18"/>
+              </w:rPr>
+              <w:t xml:space="preserve"> + tangkapan layar</w:t>
             </w:r>
           </w:p>
         </w:tc>
@@ -1915,12 +2009,37 @@
           <w:lang w:val="de-DE"/>
         </w:rPr>
       </w:pPr>
+      <w:proofErr w:type="spellStart"/>
       <w:r>
         <w:rPr>
           <w:rFonts w:cs="Carlito"/>
           <w:sz w:val="20"/>
         </w:rPr>
-        <w:t xml:space="preserve">Sampai Pertemuan 8 data Anda sudah tersusun, tetapi hanya terlihat di Console. </w:t>
+        <w:t>Sampai</w:t>
+      </w:r>
+      <w:proofErr w:type="spellEnd"/>
+      <w:r>
+        <w:rPr>
+          <w:rFonts w:cs="Carlito"/>
+          <w:sz w:val="20"/>
+        </w:rPr>
+        <w:t xml:space="preserve"> </w:t>
+      </w:r>
+      <w:proofErr w:type="spellStart"/>
+      <w:r>
+        <w:rPr>
+          <w:rFonts w:cs="Carlito"/>
+          <w:sz w:val="20"/>
+        </w:rPr>
+        <w:t>Pertemuan</w:t>
+      </w:r>
+      <w:proofErr w:type="spellEnd"/>
+      <w:r>
+        <w:rPr>
+          <w:rFonts w:cs="Carlito"/>
+          <w:sz w:val="20"/>
+        </w:rPr>
+        <w:t xml:space="preserve"> 8 data Anda sudah tersusun, tetapi hanya terlihat di Console. </w:t>
       </w:r>
       <w:r>
         <w:rPr>
@@ -1966,12 +2085,69 @@
         </w:rPr>
         <w:t xml:space="preserve">Buka halaman Anda, klik kanan pada satu bagian, lalu pilih Inspect. Panel Elements menampilkan halaman sebagai pohon bersarang. Bentuk yang terlihat di situ adalah bentuk yang dipegang JavaScript — bukan berkas HTML yang Anda tulis. </w:t>
       </w:r>
+      <w:proofErr w:type="spellStart"/>
       <w:r>
         <w:rPr>
           <w:rFonts w:cs="Carlito"/>
           <w:sz w:val="20"/>
         </w:rPr>
-        <w:t>Sebelum menulis pemilih, pastikan nama id atau kelasnya ada di panel itu.</w:t>
+        <w:t>Sebelum</w:t>
+      </w:r>
+      <w:proofErr w:type="spellEnd"/>
+      <w:r>
+        <w:rPr>
+          <w:rFonts w:cs="Carlito"/>
+          <w:sz w:val="20"/>
+        </w:rPr>
+        <w:t xml:space="preserve"> </w:t>
+      </w:r>
+      <w:proofErr w:type="spellStart"/>
+      <w:r>
+        <w:rPr>
+          <w:rFonts w:cs="Carlito"/>
+          <w:sz w:val="20"/>
+        </w:rPr>
+        <w:t>menulis</w:t>
+      </w:r>
+      <w:proofErr w:type="spellEnd"/>
+      <w:r>
+        <w:rPr>
+          <w:rFonts w:cs="Carlito"/>
+          <w:sz w:val="20"/>
+        </w:rPr>
+        <w:t xml:space="preserve"> </w:t>
+      </w:r>
+      <w:proofErr w:type="spellStart"/>
+      <w:r>
+        <w:rPr>
+          <w:rFonts w:cs="Carlito"/>
+          <w:sz w:val="20"/>
+        </w:rPr>
+        <w:t>pemilih</w:t>
+      </w:r>
+      <w:proofErr w:type="spellEnd"/>
+      <w:r>
+        <w:rPr>
+          <w:rFonts w:cs="Carlito"/>
+          <w:sz w:val="20"/>
+        </w:rPr>
+        <w:t xml:space="preserve">, </w:t>
+      </w:r>
+      <w:proofErr w:type="spellStart"/>
+      <w:r>
+        <w:rPr>
+          <w:rFonts w:cs="Carlito"/>
+          <w:sz w:val="20"/>
+        </w:rPr>
+        <w:t>pastikan</w:t>
+      </w:r>
+      <w:proofErr w:type="spellEnd"/>
+      <w:r>
+        <w:rPr>
+          <w:rFonts w:cs="Carlito"/>
+          <w:sz w:val="20"/>
+        </w:rPr>
+        <w:t xml:space="preserve"> nama id atau kelasnya ada di panel itu.</w:t>
       </w:r>
     </w:p>
     <w:tbl>
@@ -2171,12 +2347,21 @@
             <w:pPr>
               <w:spacing w:before="20" w:after="20" w:line="252" w:lineRule="auto"/>
             </w:pPr>
-            <w:r>
-              <w:rPr>
-                <w:rFonts w:cs="Carlito"/>
-                <w:sz w:val="18"/>
-              </w:rPr>
-              <w:t>querySelectorAll(".filter")</w:t>
+            <w:proofErr w:type="spellStart"/>
+            <w:r>
+              <w:rPr>
+                <w:rFonts w:cs="Carlito"/>
+                <w:sz w:val="18"/>
+              </w:rPr>
+              <w:t>querySelectorAll</w:t>
+            </w:r>
+            <w:proofErr w:type="spellEnd"/>
+            <w:r>
+              <w:rPr>
+                <w:rFonts w:cs="Carlito"/>
+                <w:sz w:val="18"/>
+              </w:rPr>
+              <w:t>(".filter")</w:t>
             </w:r>
           </w:p>
         </w:tc>
@@ -2251,12 +2436,21 @@
             <w:pPr>
               <w:spacing w:before="20" w:after="20" w:line="252" w:lineRule="auto"/>
             </w:pPr>
-            <w:r>
-              <w:rPr>
-                <w:rFonts w:cs="Carlito"/>
-                <w:sz w:val="18"/>
-              </w:rPr>
-              <w:t>elemen.closest("button")</w:t>
+            <w:proofErr w:type="spellStart"/>
+            <w:r>
+              <w:rPr>
+                <w:rFonts w:cs="Carlito"/>
+                <w:sz w:val="18"/>
+              </w:rPr>
+              <w:t>elemen.closest</w:t>
+            </w:r>
+            <w:proofErr w:type="spellEnd"/>
+            <w:r>
+              <w:rPr>
+                <w:rFonts w:cs="Carlito"/>
+                <w:sz w:val="18"/>
+              </w:rPr>
+              <w:t>("button")</w:t>
             </w:r>
           </w:p>
         </w:tc>
@@ -2331,12 +2525,37 @@
             <w:pPr>
               <w:spacing w:before="20" w:after="20" w:line="252" w:lineRule="auto"/>
             </w:pPr>
-            <w:r>
-              <w:rPr>
-                <w:rFonts w:cs="Carlito"/>
-                <w:sz w:val="18"/>
-              </w:rPr>
-              <w:t>Array.from(hasil)</w:t>
+            <w:proofErr w:type="spellStart"/>
+            <w:r>
+              <w:rPr>
+                <w:rFonts w:cs="Carlito"/>
+                <w:sz w:val="18"/>
+              </w:rPr>
+              <w:t>Array.from</w:t>
+            </w:r>
+            <w:proofErr w:type="spellEnd"/>
+            <w:r>
+              <w:rPr>
+                <w:rFonts w:cs="Carlito"/>
+                <w:sz w:val="18"/>
+              </w:rPr>
+              <w:t>(</w:t>
+            </w:r>
+            <w:proofErr w:type="spellStart"/>
+            <w:r>
+              <w:rPr>
+                <w:rFonts w:cs="Carlito"/>
+                <w:sz w:val="18"/>
+              </w:rPr>
+              <w:t>hasil</w:t>
+            </w:r>
+            <w:proofErr w:type="spellEnd"/>
+            <w:r>
+              <w:rPr>
+                <w:rFonts w:cs="Carlito"/>
+                <w:sz w:val="18"/>
+              </w:rPr>
+              <w:t>)</w:t>
             </w:r>
           </w:p>
         </w:tc>
@@ -2578,8 +2797,19 @@
                 <w:color w:val="FFFFFF"/>
                 <w:sz w:val="18"/>
               </w:rPr>
-              <w:t>Bagian halaman</w:t>
-            </w:r>
+              <w:t xml:space="preserve">Bagian </w:t>
+            </w:r>
+            <w:proofErr w:type="spellStart"/>
+            <w:r>
+              <w:rPr>
+                <w:rFonts w:cs="Carlito"/>
+                <w:b/>
+                <w:color w:val="FFFFFF"/>
+                <w:sz w:val="18"/>
+              </w:rPr>
+              <w:t>halaman</w:t>
+            </w:r>
+            <w:proofErr w:type="spellEnd"/>
           </w:p>
         </w:tc>
         <w:tc>
@@ -2597,6 +2827,7 @@
             <w:pPr>
               <w:spacing w:before="20" w:after="20"/>
             </w:pPr>
+            <w:proofErr w:type="spellStart"/>
             <w:r>
               <w:rPr>
                 <w:rFonts w:cs="Carlito"/>
@@ -2604,8 +2835,49 @@
                 <w:color w:val="FFFFFF"/>
                 <w:sz w:val="18"/>
               </w:rPr>
-              <w:t>Pemilih yang saya pakai</w:t>
-            </w:r>
+              <w:t>Pemilih</w:t>
+            </w:r>
+            <w:proofErr w:type="spellEnd"/>
+            <w:r>
+              <w:rPr>
+                <w:rFonts w:cs="Carlito"/>
+                <w:b/>
+                <w:color w:val="FFFFFF"/>
+                <w:sz w:val="18"/>
+              </w:rPr>
+              <w:t xml:space="preserve"> yang </w:t>
+            </w:r>
+            <w:proofErr w:type="spellStart"/>
+            <w:r>
+              <w:rPr>
+                <w:rFonts w:cs="Carlito"/>
+                <w:b/>
+                <w:color w:val="FFFFFF"/>
+                <w:sz w:val="18"/>
+              </w:rPr>
+              <w:t>saya</w:t>
+            </w:r>
+            <w:proofErr w:type="spellEnd"/>
+            <w:r>
+              <w:rPr>
+                <w:rFonts w:cs="Carlito"/>
+                <w:b/>
+                <w:color w:val="FFFFFF"/>
+                <w:sz w:val="18"/>
+              </w:rPr>
+              <w:t xml:space="preserve"> </w:t>
+            </w:r>
+            <w:proofErr w:type="spellStart"/>
+            <w:r>
+              <w:rPr>
+                <w:rFonts w:cs="Carlito"/>
+                <w:b/>
+                <w:color w:val="FFFFFF"/>
+                <w:sz w:val="18"/>
+              </w:rPr>
+              <w:t>pakai</w:t>
+            </w:r>
+            <w:proofErr w:type="spellEnd"/>
           </w:p>
         </w:tc>
         <w:tc>
@@ -2623,6 +2895,7 @@
             <w:pPr>
               <w:spacing w:before="20" w:after="20"/>
             </w:pPr>
+            <w:proofErr w:type="spellStart"/>
             <w:r>
               <w:rPr>
                 <w:rFonts w:cs="Carlito"/>
@@ -2630,8 +2903,29 @@
                 <w:color w:val="FFFFFF"/>
                 <w:sz w:val="18"/>
               </w:rPr>
-              <w:t>Diisi apa</w:t>
-            </w:r>
+              <w:t>Diisi</w:t>
+            </w:r>
+            <w:proofErr w:type="spellEnd"/>
+            <w:r>
+              <w:rPr>
+                <w:rFonts w:cs="Carlito"/>
+                <w:b/>
+                <w:color w:val="FFFFFF"/>
+                <w:sz w:val="18"/>
+              </w:rPr>
+              <w:t xml:space="preserve"> </w:t>
+            </w:r>
+            <w:proofErr w:type="spellStart"/>
+            <w:r>
+              <w:rPr>
+                <w:rFonts w:cs="Carlito"/>
+                <w:b/>
+                <w:color w:val="FFFFFF"/>
+                <w:sz w:val="18"/>
+              </w:rPr>
+              <w:t>apa</w:t>
+            </w:r>
+            <w:proofErr w:type="spellEnd"/>
           </w:p>
         </w:tc>
         <w:tc>
@@ -2656,8 +2950,19 @@
                 <w:color w:val="FFFFFF"/>
                 <w:sz w:val="18"/>
               </w:rPr>
-              <w:t>Nama variabel</w:t>
-            </w:r>
+              <w:t xml:space="preserve">Nama </w:t>
+            </w:r>
+            <w:proofErr w:type="spellStart"/>
+            <w:r>
+              <w:rPr>
+                <w:rFonts w:cs="Carlito"/>
+                <w:b/>
+                <w:color w:val="FFFFFF"/>
+                <w:sz w:val="18"/>
+              </w:rPr>
+              <w:t>variabel</w:t>
+            </w:r>
+            <w:proofErr w:type="spellEnd"/>
           </w:p>
         </w:tc>
       </w:tr>
@@ -2686,8 +2991,17 @@
                 <w:rFonts w:cs="Carlito"/>
                 <w:sz w:val="18"/>
               </w:rPr>
-              <w:t>Daftar proyek</w:t>
-            </w:r>
+              <w:t xml:space="preserve">Daftar </w:t>
+            </w:r>
+            <w:proofErr w:type="spellStart"/>
+            <w:r>
+              <w:rPr>
+                <w:rFonts w:cs="Carlito"/>
+                <w:sz w:val="18"/>
+              </w:rPr>
+              <w:t>proyek</w:t>
+            </w:r>
+            <w:proofErr w:type="spellEnd"/>
           </w:p>
         </w:tc>
         <w:tc>
@@ -2740,35 +3054,62 @@
                 <w:sz w:val="20"/>
                 <w:szCs w:val="20"/>
               </w:rPr>
-              <w:t>Wadah kartu proyek</w:t>
-            </w:r>
-          </w:p>
-        </w:tc>
-        <w:tc>
-          <w:tcPr>
-            <w:tcW w:w="2238" w:type="dxa"/>
-            <w:tcBorders>
-              <w:top w:val="single" w:sz="6" w:space="0" w:color="D8DEE9"/>
-              <w:left w:val="single" w:sz="6" w:space="0" w:color="D8DEE9"/>
-              <w:bottom w:val="single" w:sz="6" w:space="0" w:color="D8DEE9"/>
-              <w:right w:val="single" w:sz="6" w:space="0" w:color="D8DEE9"/>
-            </w:tcBorders>
-          </w:tcPr>
-          <w:p>
-            <w:pPr>
-              <w:spacing w:before="20" w:after="20" w:line="252" w:lineRule="auto"/>
+              <w:t xml:space="preserve">Wadah </w:t>
+            </w:r>
+            <w:proofErr w:type="spellStart"/>
+            <w:r>
               <w:rPr>
                 <w:sz w:val="20"/>
                 <w:szCs w:val="20"/>
               </w:rPr>
-            </w:pPr>
+              <w:t>kartu</w:t>
+            </w:r>
+            <w:proofErr w:type="spellEnd"/>
             <w:r>
               <w:rPr>
                 <w:sz w:val="20"/>
                 <w:szCs w:val="20"/>
               </w:rPr>
+              <w:t xml:space="preserve"> </w:t>
+            </w:r>
+            <w:proofErr w:type="spellStart"/>
+            <w:r>
+              <w:rPr>
+                <w:sz w:val="20"/>
+                <w:szCs w:val="20"/>
+              </w:rPr>
+              <w:t>proyek</w:t>
+            </w:r>
+            <w:proofErr w:type="spellEnd"/>
+          </w:p>
+        </w:tc>
+        <w:tc>
+          <w:tcPr>
+            <w:tcW w:w="2238" w:type="dxa"/>
+            <w:tcBorders>
+              <w:top w:val="single" w:sz="6" w:space="0" w:color="D8DEE9"/>
+              <w:left w:val="single" w:sz="6" w:space="0" w:color="D8DEE9"/>
+              <w:bottom w:val="single" w:sz="6" w:space="0" w:color="D8DEE9"/>
+              <w:right w:val="single" w:sz="6" w:space="0" w:color="D8DEE9"/>
+            </w:tcBorders>
+          </w:tcPr>
+          <w:p>
+            <w:pPr>
+              <w:spacing w:before="20" w:after="20" w:line="252" w:lineRule="auto"/>
+              <w:rPr>
+                <w:sz w:val="20"/>
+                <w:szCs w:val="20"/>
+              </w:rPr>
+            </w:pPr>
+            <w:proofErr w:type="spellStart"/>
+            <w:r>
+              <w:rPr>
+                <w:sz w:val="20"/>
+                <w:szCs w:val="20"/>
+              </w:rPr>
               <w:t>daftarProyekEl</w:t>
             </w:r>
+            <w:proofErr w:type="spellEnd"/>
           </w:p>
         </w:tc>
       </w:tr>
@@ -2862,40 +3203,76 @@
                 <w:szCs w:val="20"/>
               </w:rPr>
             </w:pPr>
+            <w:proofErr w:type="spellStart"/>
             <w:r>
               <w:rPr>
                 <w:sz w:val="20"/>
                 <w:szCs w:val="20"/>
               </w:rPr>
-              <w:t>Tombol filter kategori proyek</w:t>
-            </w:r>
-          </w:p>
-        </w:tc>
-        <w:tc>
-          <w:tcPr>
-            <w:tcW w:w="2238" w:type="dxa"/>
-            <w:tcBorders>
-              <w:top w:val="single" w:sz="6" w:space="0" w:color="D8DEE9"/>
-              <w:left w:val="single" w:sz="6" w:space="0" w:color="D8DEE9"/>
-              <w:bottom w:val="single" w:sz="6" w:space="0" w:color="D8DEE9"/>
-              <w:right w:val="single" w:sz="6" w:space="0" w:color="D8DEE9"/>
-            </w:tcBorders>
-          </w:tcPr>
-          <w:p>
-            <w:pPr>
-              <w:spacing w:before="20" w:after="20" w:line="252" w:lineRule="auto"/>
+              <w:t>Tombol</w:t>
+            </w:r>
+            <w:proofErr w:type="spellEnd"/>
+            <w:r>
               <w:rPr>
                 <w:sz w:val="20"/>
                 <w:szCs w:val="20"/>
               </w:rPr>
-            </w:pPr>
+              <w:t xml:space="preserve"> filter </w:t>
+            </w:r>
+            <w:proofErr w:type="spellStart"/>
             <w:r>
               <w:rPr>
                 <w:sz w:val="20"/>
                 <w:szCs w:val="20"/>
               </w:rPr>
+              <w:t>kategori</w:t>
+            </w:r>
+            <w:proofErr w:type="spellEnd"/>
+            <w:r>
+              <w:rPr>
+                <w:sz w:val="20"/>
+                <w:szCs w:val="20"/>
+              </w:rPr>
+              <w:t xml:space="preserve"> </w:t>
+            </w:r>
+            <w:proofErr w:type="spellStart"/>
+            <w:r>
+              <w:rPr>
+                <w:sz w:val="20"/>
+                <w:szCs w:val="20"/>
+              </w:rPr>
+              <w:t>proyek</w:t>
+            </w:r>
+            <w:proofErr w:type="spellEnd"/>
+          </w:p>
+        </w:tc>
+        <w:tc>
+          <w:tcPr>
+            <w:tcW w:w="2238" w:type="dxa"/>
+            <w:tcBorders>
+              <w:top w:val="single" w:sz="6" w:space="0" w:color="D8DEE9"/>
+              <w:left w:val="single" w:sz="6" w:space="0" w:color="D8DEE9"/>
+              <w:bottom w:val="single" w:sz="6" w:space="0" w:color="D8DEE9"/>
+              <w:right w:val="single" w:sz="6" w:space="0" w:color="D8DEE9"/>
+            </w:tcBorders>
+          </w:tcPr>
+          <w:p>
+            <w:pPr>
+              <w:spacing w:before="20" w:after="20" w:line="252" w:lineRule="auto"/>
+              <w:rPr>
+                <w:sz w:val="20"/>
+                <w:szCs w:val="20"/>
+              </w:rPr>
+            </w:pPr>
+            <w:proofErr w:type="spellStart"/>
+            <w:r>
+              <w:rPr>
+                <w:sz w:val="20"/>
+                <w:szCs w:val="20"/>
+              </w:rPr>
               <w:t>tombolFilter</w:t>
             </w:r>
+            <w:proofErr w:type="spellEnd"/>
           </w:p>
         </w:tc>
       </w:tr>
@@ -2973,40 +3350,108 @@
                 <w:szCs w:val="20"/>
               </w:rPr>
             </w:pPr>
+            <w:proofErr w:type="spellStart"/>
             <w:r>
               <w:rPr>
                 <w:sz w:val="20"/>
                 <w:szCs w:val="20"/>
               </w:rPr>
-              <w:t>Pesan saat tidak ada proyek yang cocok</w:t>
-            </w:r>
-          </w:p>
-        </w:tc>
-        <w:tc>
-          <w:tcPr>
-            <w:tcW w:w="2238" w:type="dxa"/>
-            <w:tcBorders>
-              <w:top w:val="single" w:sz="6" w:space="0" w:color="D8DEE9"/>
-              <w:left w:val="single" w:sz="6" w:space="0" w:color="D8DEE9"/>
-              <w:bottom w:val="single" w:sz="6" w:space="0" w:color="D8DEE9"/>
-              <w:right w:val="single" w:sz="6" w:space="0" w:color="D8DEE9"/>
-            </w:tcBorders>
-          </w:tcPr>
-          <w:p>
-            <w:pPr>
-              <w:spacing w:before="20" w:after="20" w:line="252" w:lineRule="auto"/>
+              <w:t>Pesan</w:t>
+            </w:r>
+            <w:proofErr w:type="spellEnd"/>
+            <w:r>
               <w:rPr>
                 <w:sz w:val="20"/>
                 <w:szCs w:val="20"/>
               </w:rPr>
-            </w:pPr>
+              <w:t xml:space="preserve"> saat </w:t>
+            </w:r>
+            <w:proofErr w:type="spellStart"/>
             <w:r>
               <w:rPr>
                 <w:sz w:val="20"/>
                 <w:szCs w:val="20"/>
               </w:rPr>
+              <w:t>tidak</w:t>
+            </w:r>
+            <w:proofErr w:type="spellEnd"/>
+            <w:r>
+              <w:rPr>
+                <w:sz w:val="20"/>
+                <w:szCs w:val="20"/>
+              </w:rPr>
+              <w:t xml:space="preserve"> </w:t>
+            </w:r>
+            <w:proofErr w:type="spellStart"/>
+            <w:r>
+              <w:rPr>
+                <w:sz w:val="20"/>
+                <w:szCs w:val="20"/>
+              </w:rPr>
+              <w:t>ada</w:t>
+            </w:r>
+            <w:proofErr w:type="spellEnd"/>
+            <w:r>
+              <w:rPr>
+                <w:sz w:val="20"/>
+                <w:szCs w:val="20"/>
+              </w:rPr>
+              <w:t xml:space="preserve"> </w:t>
+            </w:r>
+            <w:proofErr w:type="spellStart"/>
+            <w:r>
+              <w:rPr>
+                <w:sz w:val="20"/>
+                <w:szCs w:val="20"/>
+              </w:rPr>
+              <w:t>proyek</w:t>
+            </w:r>
+            <w:proofErr w:type="spellEnd"/>
+            <w:r>
+              <w:rPr>
+                <w:sz w:val="20"/>
+                <w:szCs w:val="20"/>
+              </w:rPr>
+              <w:t xml:space="preserve"> yang </w:t>
+            </w:r>
+            <w:proofErr w:type="spellStart"/>
+            <w:r>
+              <w:rPr>
+                <w:sz w:val="20"/>
+                <w:szCs w:val="20"/>
+              </w:rPr>
+              <w:t>cocok</w:t>
+            </w:r>
+            <w:proofErr w:type="spellEnd"/>
+          </w:p>
+        </w:tc>
+        <w:tc>
+          <w:tcPr>
+            <w:tcW w:w="2238" w:type="dxa"/>
+            <w:tcBorders>
+              <w:top w:val="single" w:sz="6" w:space="0" w:color="D8DEE9"/>
+              <w:left w:val="single" w:sz="6" w:space="0" w:color="D8DEE9"/>
+              <w:bottom w:val="single" w:sz="6" w:space="0" w:color="D8DEE9"/>
+              <w:right w:val="single" w:sz="6" w:space="0" w:color="D8DEE9"/>
+            </w:tcBorders>
+          </w:tcPr>
+          <w:p>
+            <w:pPr>
+              <w:spacing w:before="20" w:after="20" w:line="252" w:lineRule="auto"/>
+              <w:rPr>
+                <w:sz w:val="20"/>
+                <w:szCs w:val="20"/>
+              </w:rPr>
+            </w:pPr>
+            <w:proofErr w:type="spellStart"/>
+            <w:r>
+              <w:rPr>
+                <w:sz w:val="20"/>
+                <w:szCs w:val="20"/>
+              </w:rPr>
               <w:t>pesanKosongEl</w:t>
             </w:r>
+            <w:proofErr w:type="spellEnd"/>
           </w:p>
         </w:tc>
       </w:tr>
@@ -3153,33 +3598,33 @@
                 <w:sz w:val="20"/>
                 <w:szCs w:val="20"/>
               </w:rPr>
-              <w:t>Form untuk diisi</w:t>
-            </w:r>
-          </w:p>
-          <w:p>
-            <w:pPr>
-              <w:spacing w:before="20" w:after="20" w:line="252" w:lineRule="auto"/>
+              <w:t xml:space="preserve">Form </w:t>
+            </w:r>
+            <w:proofErr w:type="spellStart"/>
+            <w:r>
               <w:rPr>
                 <w:sz w:val="20"/>
                 <w:szCs w:val="20"/>
               </w:rPr>
-            </w:pPr>
-          </w:p>
-          <w:p>
-            <w:pPr>
-              <w:spacing w:before="20" w:after="20" w:line="252" w:lineRule="auto"/>
+              <w:t>untuk</w:t>
+            </w:r>
+            <w:proofErr w:type="spellEnd"/>
+            <w:r>
               <w:rPr>
                 <w:sz w:val="20"/>
                 <w:szCs w:val="20"/>
               </w:rPr>
-            </w:pPr>
+              <w:t xml:space="preserve"> </w:t>
+            </w:r>
+            <w:proofErr w:type="spellStart"/>
             <w:r>
               <w:rPr>
                 <w:sz w:val="20"/>
                 <w:szCs w:val="20"/>
               </w:rPr>
-              <w:t>Input nama sertifikasi</w:t>
-            </w:r>
+              <w:t>diisi</w:t>
+            </w:r>
+            <w:proofErr w:type="spellEnd"/>
           </w:p>
           <w:p>
             <w:pPr>
@@ -3189,41 +3634,32 @@
                 <w:szCs w:val="20"/>
               </w:rPr>
             </w:pPr>
-            <w:r>
+          </w:p>
+          <w:p>
+            <w:pPr>
+              <w:spacing w:before="20" w:after="20" w:line="252" w:lineRule="auto"/>
               <w:rPr>
                 <w:sz w:val="20"/>
                 <w:szCs w:val="20"/>
               </w:rPr>
-              <w:t>Input tanggal sertifikasi</w:t>
-            </w:r>
-          </w:p>
-          <w:p>
-            <w:pPr>
-              <w:spacing w:before="20" w:after="20" w:line="252" w:lineRule="auto"/>
+            </w:pPr>
+            <w:r>
               <w:rPr>
                 <w:sz w:val="20"/>
                 <w:szCs w:val="20"/>
               </w:rPr>
-            </w:pPr>
+              <w:t xml:space="preserve">Input nama </w:t>
+            </w:r>
+            <w:proofErr w:type="spellStart"/>
             <w:r>
               <w:rPr>
                 <w:sz w:val="20"/>
                 <w:szCs w:val="20"/>
               </w:rPr>
-              <w:t>Input deskripsi sertifikasi</w:t>
-            </w:r>
-          </w:p>
-        </w:tc>
-        <w:tc>
-          <w:tcPr>
-            <w:tcW w:w="2238" w:type="dxa"/>
-            <w:tcBorders>
-              <w:top w:val="single" w:sz="6" w:space="0" w:color="D8DEE9"/>
-              <w:left w:val="single" w:sz="6" w:space="0" w:color="D8DEE9"/>
-              <w:bottom w:val="single" w:sz="6" w:space="0" w:color="D8DEE9"/>
-              <w:right w:val="single" w:sz="6" w:space="0" w:color="D8DEE9"/>
-            </w:tcBorders>
-          </w:tcPr>
+              <w:t>sertifikasi</w:t>
+            </w:r>
+            <w:proofErr w:type="spellEnd"/>
+          </w:p>
           <w:p>
             <w:pPr>
               <w:spacing w:before="20" w:after="20" w:line="252" w:lineRule="auto"/>
@@ -3237,33 +3673,33 @@
                 <w:sz w:val="20"/>
                 <w:szCs w:val="20"/>
               </w:rPr>
-              <w:t>formSertifikasi</w:t>
-            </w:r>
-          </w:p>
-          <w:p>
-            <w:pPr>
-              <w:spacing w:before="20" w:after="20" w:line="252" w:lineRule="auto"/>
+              <w:t xml:space="preserve">Input </w:t>
+            </w:r>
+            <w:proofErr w:type="spellStart"/>
+            <w:r>
               <w:rPr>
                 <w:sz w:val="20"/>
                 <w:szCs w:val="20"/>
               </w:rPr>
-            </w:pPr>
-          </w:p>
-          <w:p>
-            <w:pPr>
-              <w:spacing w:before="20" w:after="20" w:line="252" w:lineRule="auto"/>
+              <w:t>tanggal</w:t>
+            </w:r>
+            <w:proofErr w:type="spellEnd"/>
+            <w:r>
               <w:rPr>
                 <w:sz w:val="20"/>
                 <w:szCs w:val="20"/>
               </w:rPr>
-            </w:pPr>
+              <w:t xml:space="preserve"> </w:t>
+            </w:r>
+            <w:proofErr w:type="spellStart"/>
             <w:r>
               <w:rPr>
                 <w:sz w:val="20"/>
                 <w:szCs w:val="20"/>
               </w:rPr>
-              <w:t>namaSertifikasiEl</w:t>
-            </w:r>
+              <w:t>sertifikasi</w:t>
+            </w:r>
+            <w:proofErr w:type="spellEnd"/>
           </w:p>
           <w:p>
             <w:pPr>
@@ -3278,31 +3714,132 @@
                 <w:sz w:val="20"/>
                 <w:szCs w:val="20"/>
               </w:rPr>
-              <w:t>tang</w:t>
-            </w:r>
+              <w:t xml:space="preserve">Input </w:t>
+            </w:r>
+            <w:proofErr w:type="spellStart"/>
             <w:r>
               <w:rPr>
                 <w:sz w:val="20"/>
                 <w:szCs w:val="20"/>
               </w:rPr>
-              <w:t>galSertifikasiEl</w:t>
-            </w:r>
-          </w:p>
-          <w:p>
-            <w:pPr>
-              <w:spacing w:before="20" w:after="20" w:line="252" w:lineRule="auto"/>
+              <w:t>deskripsi</w:t>
+            </w:r>
+            <w:proofErr w:type="spellEnd"/>
+            <w:r>
               <w:rPr>
                 <w:sz w:val="20"/>
                 <w:szCs w:val="20"/>
               </w:rPr>
-            </w:pPr>
+              <w:t xml:space="preserve"> </w:t>
+            </w:r>
+            <w:proofErr w:type="spellStart"/>
             <w:r>
               <w:rPr>
                 <w:sz w:val="20"/>
                 <w:szCs w:val="20"/>
               </w:rPr>
+              <w:t>sertifikasi</w:t>
+            </w:r>
+            <w:proofErr w:type="spellEnd"/>
+          </w:p>
+        </w:tc>
+        <w:tc>
+          <w:tcPr>
+            <w:tcW w:w="2238" w:type="dxa"/>
+            <w:tcBorders>
+              <w:top w:val="single" w:sz="6" w:space="0" w:color="D8DEE9"/>
+              <w:left w:val="single" w:sz="6" w:space="0" w:color="D8DEE9"/>
+              <w:bottom w:val="single" w:sz="6" w:space="0" w:color="D8DEE9"/>
+              <w:right w:val="single" w:sz="6" w:space="0" w:color="D8DEE9"/>
+            </w:tcBorders>
+          </w:tcPr>
+          <w:p>
+            <w:pPr>
+              <w:spacing w:before="20" w:after="20" w:line="252" w:lineRule="auto"/>
+              <w:rPr>
+                <w:sz w:val="20"/>
+                <w:szCs w:val="20"/>
+              </w:rPr>
+            </w:pPr>
+            <w:proofErr w:type="spellStart"/>
+            <w:r>
+              <w:rPr>
+                <w:sz w:val="20"/>
+                <w:szCs w:val="20"/>
+              </w:rPr>
+              <w:t>formSertifikasi</w:t>
+            </w:r>
+            <w:proofErr w:type="spellEnd"/>
+          </w:p>
+          <w:p>
+            <w:pPr>
+              <w:spacing w:before="20" w:after="20" w:line="252" w:lineRule="auto"/>
+              <w:rPr>
+                <w:sz w:val="20"/>
+                <w:szCs w:val="20"/>
+              </w:rPr>
+            </w:pPr>
+          </w:p>
+          <w:p>
+            <w:pPr>
+              <w:spacing w:before="20" w:after="20" w:line="252" w:lineRule="auto"/>
+              <w:rPr>
+                <w:sz w:val="20"/>
+                <w:szCs w:val="20"/>
+              </w:rPr>
+            </w:pPr>
+            <w:proofErr w:type="spellStart"/>
+            <w:r>
+              <w:rPr>
+                <w:sz w:val="20"/>
+                <w:szCs w:val="20"/>
+              </w:rPr>
+              <w:t>namaSertifikasiEl</w:t>
+            </w:r>
+            <w:proofErr w:type="spellEnd"/>
+          </w:p>
+          <w:p>
+            <w:pPr>
+              <w:spacing w:before="20" w:after="20" w:line="252" w:lineRule="auto"/>
+              <w:rPr>
+                <w:sz w:val="20"/>
+                <w:szCs w:val="20"/>
+              </w:rPr>
+            </w:pPr>
+            <w:proofErr w:type="spellStart"/>
+            <w:r>
+              <w:rPr>
+                <w:sz w:val="20"/>
+                <w:szCs w:val="20"/>
+              </w:rPr>
+              <w:t>tang</w:t>
+            </w:r>
+            <w:r>
+              <w:rPr>
+                <w:sz w:val="20"/>
+                <w:szCs w:val="20"/>
+              </w:rPr>
+              <w:t>galSertifikasiEl</w:t>
+            </w:r>
+            <w:proofErr w:type="spellEnd"/>
+          </w:p>
+          <w:p>
+            <w:pPr>
+              <w:spacing w:before="20" w:after="20" w:line="252" w:lineRule="auto"/>
+              <w:rPr>
+                <w:sz w:val="20"/>
+                <w:szCs w:val="20"/>
+              </w:rPr>
+            </w:pPr>
+            <w:proofErr w:type="spellStart"/>
+            <w:r>
+              <w:rPr>
+                <w:sz w:val="20"/>
+                <w:szCs w:val="20"/>
+              </w:rPr>
               <w:t>deskripsiSertifikasiEl</w:t>
             </w:r>
+            <w:proofErr w:type="spellEnd"/>
           </w:p>
         </w:tc>
       </w:tr>
@@ -3330,13 +3867,63 @@
                 <w:sz w:val="18"/>
               </w:rPr>
             </w:pPr>
-            <w:r>
-              <w:rPr>
-                <w:rFonts w:cs="Carlito"/>
-                <w:sz w:val="18"/>
-              </w:rPr>
-              <w:t>Pesan galat tiap kolom</w:t>
-            </w:r>
+            <w:proofErr w:type="spellStart"/>
+            <w:r>
+              <w:rPr>
+                <w:rFonts w:cs="Carlito"/>
+                <w:sz w:val="18"/>
+              </w:rPr>
+              <w:t>Pesan</w:t>
+            </w:r>
+            <w:proofErr w:type="spellEnd"/>
+            <w:r>
+              <w:rPr>
+                <w:rFonts w:cs="Carlito"/>
+                <w:sz w:val="18"/>
+              </w:rPr>
+              <w:t xml:space="preserve"> </w:t>
+            </w:r>
+            <w:proofErr w:type="spellStart"/>
+            <w:r>
+              <w:rPr>
+                <w:rFonts w:cs="Carlito"/>
+                <w:sz w:val="18"/>
+              </w:rPr>
+              <w:t>galat</w:t>
+            </w:r>
+            <w:proofErr w:type="spellEnd"/>
+            <w:r>
+              <w:rPr>
+                <w:rFonts w:cs="Carlito"/>
+                <w:sz w:val="18"/>
+              </w:rPr>
+              <w:t xml:space="preserve"> </w:t>
+            </w:r>
+            <w:proofErr w:type="spellStart"/>
+            <w:r>
+              <w:rPr>
+                <w:rFonts w:cs="Carlito"/>
+                <w:sz w:val="18"/>
+              </w:rPr>
+              <w:t>tiap</w:t>
+            </w:r>
+            <w:proofErr w:type="spellEnd"/>
+            <w:r>
+              <w:rPr>
+                <w:rFonts w:cs="Carlito"/>
+                <w:sz w:val="18"/>
+              </w:rPr>
+              <w:t xml:space="preserve"> </w:t>
+            </w:r>
+            <w:proofErr w:type="spellStart"/>
+            <w:r>
+              <w:rPr>
+                <w:rFonts w:cs="Carlito"/>
+                <w:sz w:val="18"/>
+              </w:rPr>
+              <w:t>kolom</w:t>
+            </w:r>
+            <w:proofErr w:type="spellEnd"/>
           </w:p>
         </w:tc>
         <w:tc>
@@ -3362,62 +3949,98 @@
                 <w:sz w:val="20"/>
                 <w:szCs w:val="20"/>
               </w:rPr>
-              <w:t>.pesan-galat</w:t>
-            </w:r>
-          </w:p>
-        </w:tc>
-        <w:tc>
-          <w:tcPr>
-            <w:tcW w:w="2693" w:type="dxa"/>
-            <w:tcBorders>
-              <w:top w:val="single" w:sz="6" w:space="0" w:color="D8DEE9"/>
-              <w:left w:val="single" w:sz="6" w:space="0" w:color="D8DEE9"/>
-              <w:bottom w:val="single" w:sz="6" w:space="0" w:color="D8DEE9"/>
-              <w:right w:val="single" w:sz="6" w:space="0" w:color="D8DEE9"/>
-            </w:tcBorders>
-          </w:tcPr>
-          <w:p>
-            <w:pPr>
-              <w:spacing w:before="20" w:after="20" w:line="252" w:lineRule="auto"/>
+              <w:t>.</w:t>
+            </w:r>
+            <w:proofErr w:type="spellStart"/>
+            <w:r>
               <w:rPr>
                 <w:sz w:val="20"/>
                 <w:szCs w:val="20"/>
               </w:rPr>
-            </w:pPr>
-            <w:r>
+              <w:t>pesan-galat</w:t>
+            </w:r>
+            <w:proofErr w:type="spellEnd"/>
+          </w:p>
+        </w:tc>
+        <w:tc>
+          <w:tcPr>
+            <w:tcW w:w="2693" w:type="dxa"/>
+            <w:tcBorders>
+              <w:top w:val="single" w:sz="6" w:space="0" w:color="D8DEE9"/>
+              <w:left w:val="single" w:sz="6" w:space="0" w:color="D8DEE9"/>
+              <w:bottom w:val="single" w:sz="6" w:space="0" w:color="D8DEE9"/>
+              <w:right w:val="single" w:sz="6" w:space="0" w:color="D8DEE9"/>
+            </w:tcBorders>
+          </w:tcPr>
+          <w:p>
+            <w:pPr>
+              <w:spacing w:before="20" w:after="20" w:line="252" w:lineRule="auto"/>
               <w:rPr>
                 <w:sz w:val="20"/>
                 <w:szCs w:val="20"/>
               </w:rPr>
-              <w:t>Pesan validasi setiap input form</w:t>
-            </w:r>
-          </w:p>
-        </w:tc>
-        <w:tc>
-          <w:tcPr>
-            <w:tcW w:w="2238" w:type="dxa"/>
-            <w:tcBorders>
-              <w:top w:val="single" w:sz="6" w:space="0" w:color="D8DEE9"/>
-              <w:left w:val="single" w:sz="6" w:space="0" w:color="D8DEE9"/>
-              <w:bottom w:val="single" w:sz="6" w:space="0" w:color="D8DEE9"/>
-              <w:right w:val="single" w:sz="6" w:space="0" w:color="D8DEE9"/>
-            </w:tcBorders>
-          </w:tcPr>
-          <w:p>
-            <w:pPr>
-              <w:spacing w:before="20" w:after="20" w:line="252" w:lineRule="auto"/>
+            </w:pPr>
+            <w:proofErr w:type="spellStart"/>
+            <w:r>
               <w:rPr>
                 <w:sz w:val="20"/>
                 <w:szCs w:val="20"/>
               </w:rPr>
-            </w:pPr>
+              <w:t>Pesan</w:t>
+            </w:r>
+            <w:proofErr w:type="spellEnd"/>
             <w:r>
               <w:rPr>
                 <w:sz w:val="20"/>
                 <w:szCs w:val="20"/>
               </w:rPr>
+              <w:t xml:space="preserve"> </w:t>
+            </w:r>
+            <w:proofErr w:type="spellStart"/>
+            <w:r>
+              <w:rPr>
+                <w:sz w:val="20"/>
+                <w:szCs w:val="20"/>
+              </w:rPr>
+              <w:t>validasi</w:t>
+            </w:r>
+            <w:proofErr w:type="spellEnd"/>
+            <w:r>
+              <w:rPr>
+                <w:sz w:val="20"/>
+                <w:szCs w:val="20"/>
+              </w:rPr>
+              <w:t xml:space="preserve"> setiap input form</w:t>
+            </w:r>
+          </w:p>
+        </w:tc>
+        <w:tc>
+          <w:tcPr>
+            <w:tcW w:w="2238" w:type="dxa"/>
+            <w:tcBorders>
+              <w:top w:val="single" w:sz="6" w:space="0" w:color="D8DEE9"/>
+              <w:left w:val="single" w:sz="6" w:space="0" w:color="D8DEE9"/>
+              <w:bottom w:val="single" w:sz="6" w:space="0" w:color="D8DEE9"/>
+              <w:right w:val="single" w:sz="6" w:space="0" w:color="D8DEE9"/>
+            </w:tcBorders>
+          </w:tcPr>
+          <w:p>
+            <w:pPr>
+              <w:spacing w:before="20" w:after="20" w:line="252" w:lineRule="auto"/>
+              <w:rPr>
+                <w:sz w:val="20"/>
+                <w:szCs w:val="20"/>
+              </w:rPr>
+            </w:pPr>
+            <w:proofErr w:type="spellStart"/>
+            <w:r>
+              <w:rPr>
+                <w:sz w:val="20"/>
+                <w:szCs w:val="20"/>
+              </w:rPr>
               <w:t>pesanGalat</w:t>
             </w:r>
+            <w:proofErr w:type="spellEnd"/>
           </w:p>
         </w:tc>
       </w:tr>
@@ -3455,12 +4078,37 @@
         </w:rPr>
         <w:t xml:space="preserve">Buat berkas baru bernama js/dom.js, lalu tambahkan satu baris &lt;script&gt; lagi sebelum &lt;/body&gt;. Berkas app.js dari Pertemuan 8 tidak diubah — ia tetap memuat data dan fungsi. </w:t>
       </w:r>
+      <w:proofErr w:type="spellStart"/>
       <w:r>
         <w:rPr>
           <w:rFonts w:cs="Carlito"/>
           <w:sz w:val="20"/>
         </w:rPr>
-        <w:t>Berkas dom.js memakai data itu untuk mengisi halaman.</w:t>
+        <w:t>Berkas</w:t>
+      </w:r>
+      <w:proofErr w:type="spellEnd"/>
+      <w:r>
+        <w:rPr>
+          <w:rFonts w:cs="Carlito"/>
+          <w:sz w:val="20"/>
+        </w:rPr>
+        <w:t xml:space="preserve"> dom.js </w:t>
+      </w:r>
+      <w:proofErr w:type="spellStart"/>
+      <w:r>
+        <w:rPr>
+          <w:rFonts w:cs="Carlito"/>
+          <w:sz w:val="20"/>
+        </w:rPr>
+        <w:t>memakai</w:t>
+      </w:r>
+      <w:proofErr w:type="spellEnd"/>
+      <w:r>
+        <w:rPr>
+          <w:rFonts w:cs="Carlito"/>
+          <w:sz w:val="20"/>
+        </w:rPr>
+        <w:t xml:space="preserve"> data itu untuk mengisi halaman.</w:t>
       </w:r>
     </w:p>
     <w:tbl>
@@ -3679,7 +4327,39 @@
                 <w:rFonts w:cs="Carlito"/>
                 <w:sz w:val="18"/>
               </w:rPr>
-              <w:t>app.js menyimpan data dan fungsi murni; dom.js menyentuh halaman. Batas ini yang dipecah lagi di Pertemuan 11</w:t>
+              <w:t xml:space="preserve">app.js </w:t>
+            </w:r>
+            <w:proofErr w:type="spellStart"/>
+            <w:r>
+              <w:rPr>
+                <w:rFonts w:cs="Carlito"/>
+                <w:sz w:val="18"/>
+              </w:rPr>
+              <w:t>menyimpan</w:t>
+            </w:r>
+            <w:proofErr w:type="spellEnd"/>
+            <w:r>
+              <w:rPr>
+                <w:rFonts w:cs="Carlito"/>
+                <w:sz w:val="18"/>
+              </w:rPr>
+              <w:t xml:space="preserve"> data dan </w:t>
+            </w:r>
+            <w:proofErr w:type="spellStart"/>
+            <w:r>
+              <w:rPr>
+                <w:rFonts w:cs="Carlito"/>
+                <w:sz w:val="18"/>
+              </w:rPr>
+              <w:t>fungsi</w:t>
+            </w:r>
+            <w:proofErr w:type="spellEnd"/>
+            <w:r>
+              <w:rPr>
+                <w:rFonts w:cs="Carlito"/>
+                <w:sz w:val="18"/>
+              </w:rPr>
+              <w:t xml:space="preserve"> murni; dom.js menyentuh halaman. Batas ini yang dipecah lagi di Pertemuan 11</w:t>
             </w:r>
           </w:p>
         </w:tc>
@@ -3812,8 +4492,17 @@
                 <w:rFonts w:cs="Carlito"/>
                 <w:sz w:val="18"/>
               </w:rPr>
-              <w:t>type="module" pada keduanya</w:t>
-            </w:r>
+              <w:t xml:space="preserve">type="module" pada </w:t>
+            </w:r>
+            <w:proofErr w:type="spellStart"/>
+            <w:r>
+              <w:rPr>
+                <w:rFonts w:cs="Carlito"/>
+                <w:sz w:val="18"/>
+              </w:rPr>
+              <w:t>keduanya</w:t>
+            </w:r>
+            <w:proofErr w:type="spellEnd"/>
           </w:p>
         </w:tc>
         <w:tc>
@@ -3862,7 +4551,55 @@
                 <w:rFonts w:cs="Carlito"/>
                 <w:sz w:val="18"/>
               </w:rPr>
-              <w:t>Nama variabel bocor ke jendela peramban; import tidak bisa dipakai</w:t>
+              <w:t xml:space="preserve">Nama </w:t>
+            </w:r>
+            <w:proofErr w:type="spellStart"/>
+            <w:r>
+              <w:rPr>
+                <w:rFonts w:cs="Carlito"/>
+                <w:sz w:val="18"/>
+              </w:rPr>
+              <w:t>variabel</w:t>
+            </w:r>
+            <w:proofErr w:type="spellEnd"/>
+            <w:r>
+              <w:rPr>
+                <w:rFonts w:cs="Carlito"/>
+                <w:sz w:val="18"/>
+              </w:rPr>
+              <w:t xml:space="preserve"> bocor </w:t>
+            </w:r>
+            <w:proofErr w:type="spellStart"/>
+            <w:r>
+              <w:rPr>
+                <w:rFonts w:cs="Carlito"/>
+                <w:sz w:val="18"/>
+              </w:rPr>
+              <w:t>ke</w:t>
+            </w:r>
+            <w:proofErr w:type="spellEnd"/>
+            <w:r>
+              <w:rPr>
+                <w:rFonts w:cs="Carlito"/>
+                <w:sz w:val="18"/>
+              </w:rPr>
+              <w:t xml:space="preserve"> </w:t>
+            </w:r>
+            <w:proofErr w:type="spellStart"/>
+            <w:r>
+              <w:rPr>
+                <w:rFonts w:cs="Carlito"/>
+                <w:sz w:val="18"/>
+              </w:rPr>
+              <w:t>jendela</w:t>
+            </w:r>
+            <w:proofErr w:type="spellEnd"/>
+            <w:r>
+              <w:rPr>
+                <w:rFonts w:cs="Carlito"/>
+                <w:sz w:val="18"/>
+              </w:rPr>
+              <w:t xml:space="preserve"> peramban; import tidak bisa dipakai</w:t>
             </w:r>
           </w:p>
         </w:tc>
@@ -3986,9 +4723,11 @@
             <w:pPr>
               <w:spacing w:before="20" w:after="20" w:line="252" w:lineRule="auto"/>
             </w:pPr>
+            <w:proofErr w:type="spellStart"/>
             <w:r>
               <w:t>Sudah</w:t>
             </w:r>
+            <w:proofErr w:type="spellEnd"/>
           </w:p>
         </w:tc>
       </w:tr>
@@ -4035,9 +4774,11 @@
             <w:pPr>
               <w:spacing w:before="20" w:after="20" w:line="252" w:lineRule="auto"/>
             </w:pPr>
+            <w:proofErr w:type="spellStart"/>
             <w:r>
               <w:t>Sudah</w:t>
             </w:r>
+            <w:proofErr w:type="spellEnd"/>
           </w:p>
         </w:tc>
       </w:tr>
@@ -4084,9 +4825,11 @@
             <w:pPr>
               <w:spacing w:before="20" w:after="20" w:line="252" w:lineRule="auto"/>
             </w:pPr>
+            <w:proofErr w:type="spellStart"/>
             <w:r>
               <w:t>Sudah</w:t>
             </w:r>
+            <w:proofErr w:type="spellEnd"/>
           </w:p>
         </w:tc>
       </w:tr>
@@ -4133,9 +4876,11 @@
             <w:pPr>
               <w:spacing w:before="20" w:after="20" w:line="252" w:lineRule="auto"/>
             </w:pPr>
+            <w:proofErr w:type="spellStart"/>
             <w:r>
               <w:t>Sudah</w:t>
             </w:r>
+            <w:proofErr w:type="spellEnd"/>
           </w:p>
         </w:tc>
       </w:tr>
@@ -4252,7 +4997,27 @@
                 <w:color w:val="1B6B3A"/>
                 <w:sz w:val="20"/>
               </w:rPr>
-              <w:t xml:space="preserve">Tulis pemilihnya di Console, lalu bandingkan hasilnya dengan panel Elements. </w:t>
+              <w:t xml:space="preserve">Tulis </w:t>
+            </w:r>
+            <w:proofErr w:type="spellStart"/>
+            <w:r>
+              <w:rPr>
+                <w:rFonts w:cs="Carlito"/>
+                <w:b/>
+                <w:color w:val="1B6B3A"/>
+                <w:sz w:val="20"/>
+              </w:rPr>
+              <w:t>pemilihnya</w:t>
+            </w:r>
+            <w:proofErr w:type="spellEnd"/>
+            <w:r>
+              <w:rPr>
+                <w:rFonts w:cs="Carlito"/>
+                <w:b/>
+                <w:color w:val="1B6B3A"/>
+                <w:sz w:val="20"/>
+              </w:rPr>
+              <w:t xml:space="preserve"> di Console, lalu bandingkan hasilnya dengan panel Elements. </w:t>
             </w:r>
             <w:r>
               <w:rPr>
@@ -4819,12 +5584,69 @@
             <w:pPr>
               <w:spacing w:before="20" w:after="20" w:line="252" w:lineRule="auto"/>
             </w:pPr>
-            <w:r>
-              <w:rPr>
-                <w:rFonts w:cs="Carlito"/>
-                <w:sz w:val="18"/>
-              </w:rPr>
-              <w:t>Elemen yang dibuat tidak muncul sampai dimasukkan ke wadah</w:t>
+            <w:proofErr w:type="spellStart"/>
+            <w:r>
+              <w:rPr>
+                <w:rFonts w:cs="Carlito"/>
+                <w:sz w:val="18"/>
+              </w:rPr>
+              <w:t>Elemen</w:t>
+            </w:r>
+            <w:proofErr w:type="spellEnd"/>
+            <w:r>
+              <w:rPr>
+                <w:rFonts w:cs="Carlito"/>
+                <w:sz w:val="18"/>
+              </w:rPr>
+              <w:t xml:space="preserve"> yang </w:t>
+            </w:r>
+            <w:proofErr w:type="spellStart"/>
+            <w:r>
+              <w:rPr>
+                <w:rFonts w:cs="Carlito"/>
+                <w:sz w:val="18"/>
+              </w:rPr>
+              <w:t>dibuat</w:t>
+            </w:r>
+            <w:proofErr w:type="spellEnd"/>
+            <w:r>
+              <w:rPr>
+                <w:rFonts w:cs="Carlito"/>
+                <w:sz w:val="18"/>
+              </w:rPr>
+              <w:t xml:space="preserve"> </w:t>
+            </w:r>
+            <w:proofErr w:type="spellStart"/>
+            <w:r>
+              <w:rPr>
+                <w:rFonts w:cs="Carlito"/>
+                <w:sz w:val="18"/>
+              </w:rPr>
+              <w:t>tidak</w:t>
+            </w:r>
+            <w:proofErr w:type="spellEnd"/>
+            <w:r>
+              <w:rPr>
+                <w:rFonts w:cs="Carlito"/>
+                <w:sz w:val="18"/>
+              </w:rPr>
+              <w:t xml:space="preserve"> </w:t>
+            </w:r>
+            <w:proofErr w:type="spellStart"/>
+            <w:r>
+              <w:rPr>
+                <w:rFonts w:cs="Carlito"/>
+                <w:sz w:val="18"/>
+              </w:rPr>
+              <w:t>muncul</w:t>
+            </w:r>
+            <w:proofErr w:type="spellEnd"/>
+            <w:r>
+              <w:rPr>
+                <w:rFonts w:cs="Carlito"/>
+                <w:sz w:val="18"/>
+              </w:rPr>
+              <w:t xml:space="preserve"> sampai dimasukkan ke wadah</w:t>
             </w:r>
           </w:p>
         </w:tc>
@@ -5340,7 +6162,39 @@
           <w:rFonts w:cs="Carlito"/>
           <w:sz w:val="20"/>
         </w:rPr>
-        <w:t>Baris pengosongan itu wajib ada di baris pertama fungsi render, sebelum apa pun ditambahkan.</w:t>
+        <w:t xml:space="preserve">Baris </w:t>
+      </w:r>
+      <w:proofErr w:type="spellStart"/>
+      <w:r>
+        <w:rPr>
+          <w:rFonts w:cs="Carlito"/>
+          <w:sz w:val="20"/>
+        </w:rPr>
+        <w:t>pengosongan</w:t>
+      </w:r>
+      <w:proofErr w:type="spellEnd"/>
+      <w:r>
+        <w:rPr>
+          <w:rFonts w:cs="Carlito"/>
+          <w:sz w:val="20"/>
+        </w:rPr>
+        <w:t xml:space="preserve"> itu </w:t>
+      </w:r>
+      <w:proofErr w:type="spellStart"/>
+      <w:r>
+        <w:rPr>
+          <w:rFonts w:cs="Carlito"/>
+          <w:sz w:val="20"/>
+        </w:rPr>
+        <w:t>wajib</w:t>
+      </w:r>
+      <w:proofErr w:type="spellEnd"/>
+      <w:r>
+        <w:rPr>
+          <w:rFonts w:cs="Carlito"/>
+          <w:sz w:val="20"/>
+        </w:rPr>
+        <w:t xml:space="preserve"> ada di baris pertama fungsi render, sebelum apa pun ditambahkan.</w:t>
       </w:r>
     </w:p>
     <w:tbl>
@@ -5515,7 +6369,71 @@
                 <w:rFonts w:cs="Carlito"/>
                 <w:sz w:val="18"/>
               </w:rPr>
-              <w:t>Paling ringkas; cukup untuk pekerjaan hari ini</w:t>
+              <w:t xml:space="preserve">Paling </w:t>
+            </w:r>
+            <w:proofErr w:type="spellStart"/>
+            <w:r>
+              <w:rPr>
+                <w:rFonts w:cs="Carlito"/>
+                <w:sz w:val="18"/>
+              </w:rPr>
+              <w:t>ringkas</w:t>
+            </w:r>
+            <w:proofErr w:type="spellEnd"/>
+            <w:r>
+              <w:rPr>
+                <w:rFonts w:cs="Carlito"/>
+                <w:sz w:val="18"/>
+              </w:rPr>
+              <w:t xml:space="preserve">; </w:t>
+            </w:r>
+            <w:proofErr w:type="spellStart"/>
+            <w:r>
+              <w:rPr>
+                <w:rFonts w:cs="Carlito"/>
+                <w:sz w:val="18"/>
+              </w:rPr>
+              <w:t>cukup</w:t>
+            </w:r>
+            <w:proofErr w:type="spellEnd"/>
+            <w:r>
+              <w:rPr>
+                <w:rFonts w:cs="Carlito"/>
+                <w:sz w:val="18"/>
+              </w:rPr>
+              <w:t xml:space="preserve"> </w:t>
+            </w:r>
+            <w:proofErr w:type="spellStart"/>
+            <w:r>
+              <w:rPr>
+                <w:rFonts w:cs="Carlito"/>
+                <w:sz w:val="18"/>
+              </w:rPr>
+              <w:t>untuk</w:t>
+            </w:r>
+            <w:proofErr w:type="spellEnd"/>
+            <w:r>
+              <w:rPr>
+                <w:rFonts w:cs="Carlito"/>
+                <w:sz w:val="18"/>
+              </w:rPr>
+              <w:t xml:space="preserve"> </w:t>
+            </w:r>
+            <w:proofErr w:type="spellStart"/>
+            <w:r>
+              <w:rPr>
+                <w:rFonts w:cs="Carlito"/>
+                <w:sz w:val="18"/>
+              </w:rPr>
+              <w:t>pekerjaan</w:t>
+            </w:r>
+            <w:proofErr w:type="spellEnd"/>
+            <w:r>
+              <w:rPr>
+                <w:rFonts w:cs="Carlito"/>
+                <w:sz w:val="18"/>
+              </w:rPr>
+              <w:t xml:space="preserve"> hari ini</w:t>
             </w:r>
           </w:p>
         </w:tc>
@@ -5759,8 +6677,19 @@
                 <w:color w:val="FFFFFF"/>
                 <w:sz w:val="18"/>
               </w:rPr>
-              <w:t>Yang diperiksa</w:t>
-            </w:r>
+              <w:t xml:space="preserve">Yang </w:t>
+            </w:r>
+            <w:proofErr w:type="spellStart"/>
+            <w:r>
+              <w:rPr>
+                <w:rFonts w:cs="Carlito"/>
+                <w:b/>
+                <w:color w:val="FFFFFF"/>
+                <w:sz w:val="18"/>
+              </w:rPr>
+              <w:t>diperiksa</w:t>
+            </w:r>
+            <w:proofErr w:type="spellEnd"/>
           </w:p>
         </w:tc>
         <w:tc>
@@ -5971,7 +6900,23 @@
                 <w:sz w:val="20"/>
                 <w:szCs w:val="20"/>
               </w:rPr>
-              <w:t>'Halaman CV responsif P6'</w:t>
+              <w:t xml:space="preserve">'Halaman CV </w:t>
+            </w:r>
+            <w:proofErr w:type="spellStart"/>
+            <w:r>
+              <w:rPr>
+                <w:sz w:val="20"/>
+                <w:szCs w:val="20"/>
+              </w:rPr>
+              <w:t>responsif</w:t>
+            </w:r>
+            <w:proofErr w:type="spellEnd"/>
+            <w:r>
+              <w:rPr>
+                <w:sz w:val="20"/>
+                <w:szCs w:val="20"/>
+              </w:rPr>
+              <w:t xml:space="preserve"> P6'</w:t>
             </w:r>
           </w:p>
         </w:tc>
@@ -6051,14 +6996,94 @@
                 <w:sz w:val="20"/>
                 <w:szCs w:val="20"/>
               </w:rPr>
-              <w:t>"&lt;em&gt;uji&lt;/em&gt;"</w:t>
-            </w:r>
+              <w:t>"&lt;</w:t>
+            </w:r>
+            <w:proofErr w:type="spellStart"/>
             <w:r>
               <w:rPr>
                 <w:sz w:val="20"/>
                 <w:szCs w:val="20"/>
               </w:rPr>
-              <w:t xml:space="preserve"> muncul, bukan elemen &lt;em&gt; </w:t>
+              <w:t>em</w:t>
+            </w:r>
+            <w:proofErr w:type="spellEnd"/>
+            <w:r>
+              <w:rPr>
+                <w:sz w:val="20"/>
+                <w:szCs w:val="20"/>
+              </w:rPr>
+              <w:t>&gt;uji&lt;/</w:t>
+            </w:r>
+            <w:proofErr w:type="spellStart"/>
+            <w:r>
+              <w:rPr>
+                <w:sz w:val="20"/>
+                <w:szCs w:val="20"/>
+              </w:rPr>
+              <w:t>em</w:t>
+            </w:r>
+            <w:proofErr w:type="spellEnd"/>
+            <w:r>
+              <w:rPr>
+                <w:sz w:val="20"/>
+                <w:szCs w:val="20"/>
+              </w:rPr>
+              <w:t>&gt;"</w:t>
+            </w:r>
+            <w:r>
+              <w:rPr>
+                <w:sz w:val="20"/>
+                <w:szCs w:val="20"/>
+              </w:rPr>
+              <w:t xml:space="preserve"> </w:t>
+            </w:r>
+            <w:proofErr w:type="spellStart"/>
+            <w:r>
+              <w:rPr>
+                <w:sz w:val="20"/>
+                <w:szCs w:val="20"/>
+              </w:rPr>
+              <w:t>muncul</w:t>
+            </w:r>
+            <w:proofErr w:type="spellEnd"/>
+            <w:r>
+              <w:rPr>
+                <w:sz w:val="20"/>
+                <w:szCs w:val="20"/>
+              </w:rPr>
+              <w:t xml:space="preserve">, bukan </w:t>
+            </w:r>
+            <w:proofErr w:type="spellStart"/>
+            <w:r>
+              <w:rPr>
+                <w:sz w:val="20"/>
+                <w:szCs w:val="20"/>
+              </w:rPr>
+              <w:t>elemen</w:t>
+            </w:r>
+            <w:proofErr w:type="spellEnd"/>
+            <w:r>
+              <w:rPr>
+                <w:sz w:val="20"/>
+                <w:szCs w:val="20"/>
+              </w:rPr>
+              <w:t xml:space="preserve"> &lt;</w:t>
+            </w:r>
+            <w:proofErr w:type="spellStart"/>
+            <w:r>
+              <w:rPr>
+                <w:sz w:val="20"/>
+                <w:szCs w:val="20"/>
+              </w:rPr>
+              <w:t>em</w:t>
+            </w:r>
+            <w:proofErr w:type="spellEnd"/>
+            <w:r>
+              <w:rPr>
+                <w:sz w:val="20"/>
+                <w:szCs w:val="20"/>
+              </w:rPr>
+              <w:t xml:space="preserve">&gt; </w:t>
             </w:r>
           </w:p>
         </w:tc>
@@ -6930,6 +7955,7 @@
             <w:pPr>
               <w:spacing w:before="20" w:after="20" w:line="252" w:lineRule="auto"/>
             </w:pPr>
+            <w:proofErr w:type="spellStart"/>
             <w:r>
               <w:rPr>
                 <w:rFonts w:cs="Carlito"/>
@@ -6937,6 +7963,7 @@
               </w:rPr>
               <w:t>event.currentTarget</w:t>
             </w:r>
+            <w:proofErr w:type="spellEnd"/>
           </w:p>
         </w:tc>
         <w:tc>
@@ -7086,6 +8113,7 @@
             <w:pPr>
               <w:spacing w:before="20" w:after="20" w:line="252" w:lineRule="auto"/>
             </w:pPr>
+            <w:proofErr w:type="spellStart"/>
             <w:r>
               <w:rPr>
                 <w:rFonts w:cs="Carlito"/>
@@ -7093,6 +8121,7 @@
               </w:rPr>
               <w:t>dataset.kategori</w:t>
             </w:r>
+            <w:proofErr w:type="spellEnd"/>
           </w:p>
         </w:tc>
         <w:tc>
@@ -7326,6 +8355,7 @@
             <w:pPr>
               <w:spacing w:before="20" w:after="20"/>
             </w:pPr>
+            <w:proofErr w:type="spellStart"/>
             <w:r>
               <w:rPr>
                 <w:rFonts w:cs="Carlito"/>
@@ -7335,6 +8365,7 @@
               </w:rPr>
               <w:t>Keadaan</w:t>
             </w:r>
+            <w:proofErr w:type="spellEnd"/>
           </w:p>
         </w:tc>
         <w:tc>
@@ -7460,13 +8491,47 @@
                 <w:szCs w:val="20"/>
               </w:rPr>
             </w:pPr>
+            <w:proofErr w:type="spellStart"/>
             <w:r>
               <w:rPr>
                 <w:sz w:val="20"/>
                 <w:szCs w:val="20"/>
               </w:rPr>
-              <w:t>Semua proyek tampil</w:t>
-            </w:r>
+              <w:t>Semua</w:t>
+            </w:r>
+            <w:proofErr w:type="spellEnd"/>
+            <w:r>
+              <w:rPr>
+                <w:sz w:val="20"/>
+                <w:szCs w:val="20"/>
+              </w:rPr>
+              <w:t xml:space="preserve"> </w:t>
+            </w:r>
+            <w:proofErr w:type="spellStart"/>
+            <w:r>
+              <w:rPr>
+                <w:sz w:val="20"/>
+                <w:szCs w:val="20"/>
+              </w:rPr>
+              <w:t>proyek</w:t>
+            </w:r>
+            <w:proofErr w:type="spellEnd"/>
+            <w:r>
+              <w:rPr>
+                <w:sz w:val="20"/>
+                <w:szCs w:val="20"/>
+              </w:rPr>
+              <w:t xml:space="preserve"> </w:t>
+            </w:r>
+            <w:proofErr w:type="spellStart"/>
+            <w:r>
+              <w:rPr>
+                <w:sz w:val="20"/>
+                <w:szCs w:val="20"/>
+              </w:rPr>
+              <w:t>tampil</w:t>
+            </w:r>
+            <w:proofErr w:type="spellEnd"/>
           </w:p>
         </w:tc>
       </w:tr>
@@ -7540,13 +8605,63 @@
                 <w:szCs w:val="20"/>
               </w:rPr>
             </w:pPr>
+            <w:proofErr w:type="spellStart"/>
             <w:r>
               <w:rPr>
                 <w:sz w:val="20"/>
                 <w:szCs w:val="20"/>
               </w:rPr>
-              <w:t>Proyek tampil sesuai kategori</w:t>
-            </w:r>
+              <w:t>Proyek</w:t>
+            </w:r>
+            <w:proofErr w:type="spellEnd"/>
+            <w:r>
+              <w:rPr>
+                <w:sz w:val="20"/>
+                <w:szCs w:val="20"/>
+              </w:rPr>
+              <w:t xml:space="preserve"> </w:t>
+            </w:r>
+            <w:proofErr w:type="spellStart"/>
+            <w:r>
+              <w:rPr>
+                <w:sz w:val="20"/>
+                <w:szCs w:val="20"/>
+              </w:rPr>
+              <w:t>tampil</w:t>
+            </w:r>
+            <w:proofErr w:type="spellEnd"/>
+            <w:r>
+              <w:rPr>
+                <w:sz w:val="20"/>
+                <w:szCs w:val="20"/>
+              </w:rPr>
+              <w:t xml:space="preserve"> </w:t>
+            </w:r>
+            <w:proofErr w:type="spellStart"/>
+            <w:r>
+              <w:rPr>
+                <w:sz w:val="20"/>
+                <w:szCs w:val="20"/>
+              </w:rPr>
+              <w:t>sesuai</w:t>
+            </w:r>
+            <w:proofErr w:type="spellEnd"/>
+            <w:r>
+              <w:rPr>
+                <w:sz w:val="20"/>
+                <w:szCs w:val="20"/>
+              </w:rPr>
+              <w:t xml:space="preserve"> </w:t>
+            </w:r>
+            <w:proofErr w:type="spellStart"/>
+            <w:r>
+              <w:rPr>
+                <w:sz w:val="20"/>
+                <w:szCs w:val="20"/>
+              </w:rPr>
+              <w:t>kategori</w:t>
+            </w:r>
+            <w:proofErr w:type="spellEnd"/>
           </w:p>
         </w:tc>
       </w:tr>
@@ -7625,7 +8740,71 @@
                 <w:sz w:val="20"/>
                 <w:szCs w:val="20"/>
               </w:rPr>
-              <w:t>“Tidak ada proyek untuk ditampilkan”</w:t>
+              <w:t xml:space="preserve">“Tidak </w:t>
+            </w:r>
+            <w:proofErr w:type="spellStart"/>
+            <w:r>
+              <w:rPr>
+                <w:sz w:val="20"/>
+                <w:szCs w:val="20"/>
+              </w:rPr>
+              <w:t>ada</w:t>
+            </w:r>
+            <w:proofErr w:type="spellEnd"/>
+            <w:r>
+              <w:rPr>
+                <w:sz w:val="20"/>
+                <w:szCs w:val="20"/>
+              </w:rPr>
+              <w:t xml:space="preserve"> </w:t>
+            </w:r>
+            <w:proofErr w:type="spellStart"/>
+            <w:r>
+              <w:rPr>
+                <w:sz w:val="20"/>
+                <w:szCs w:val="20"/>
+              </w:rPr>
+              <w:t>proyek</w:t>
+            </w:r>
+            <w:proofErr w:type="spellEnd"/>
+            <w:r>
+              <w:rPr>
+                <w:sz w:val="20"/>
+                <w:szCs w:val="20"/>
+              </w:rPr>
+              <w:t xml:space="preserve"> </w:t>
+            </w:r>
+            <w:proofErr w:type="spellStart"/>
+            <w:r>
+              <w:rPr>
+                <w:sz w:val="20"/>
+                <w:szCs w:val="20"/>
+              </w:rPr>
+              <w:t>untuk</w:t>
+            </w:r>
+            <w:proofErr w:type="spellEnd"/>
+            <w:r>
+              <w:rPr>
+                <w:sz w:val="20"/>
+                <w:szCs w:val="20"/>
+              </w:rPr>
+              <w:t xml:space="preserve"> </w:t>
+            </w:r>
+            <w:proofErr w:type="spellStart"/>
+            <w:r>
+              <w:rPr>
+                <w:sz w:val="20"/>
+                <w:szCs w:val="20"/>
+              </w:rPr>
+              <w:t>ditampilkan</w:t>
+            </w:r>
+            <w:proofErr w:type="spellEnd"/>
+            <w:r>
+              <w:rPr>
+                <w:sz w:val="20"/>
+                <w:szCs w:val="20"/>
+              </w:rPr>
+              <w:t>”</w:t>
             </w:r>
           </w:p>
         </w:tc>
@@ -7705,8 +8884,49 @@
                 <w:sz w:val="20"/>
                 <w:szCs w:val="20"/>
               </w:rPr>
-              <w:t>Tidak ada kartu berlipat</w:t>
-            </w:r>
+              <w:t xml:space="preserve">Tidak </w:t>
+            </w:r>
+            <w:proofErr w:type="spellStart"/>
+            <w:r>
+              <w:rPr>
+                <w:sz w:val="20"/>
+                <w:szCs w:val="20"/>
+              </w:rPr>
+              <w:t>ada</w:t>
+            </w:r>
+            <w:proofErr w:type="spellEnd"/>
+            <w:r>
+              <w:rPr>
+                <w:sz w:val="20"/>
+                <w:szCs w:val="20"/>
+              </w:rPr>
+              <w:t xml:space="preserve"> </w:t>
+            </w:r>
+            <w:proofErr w:type="spellStart"/>
+            <w:r>
+              <w:rPr>
+                <w:sz w:val="20"/>
+                <w:szCs w:val="20"/>
+              </w:rPr>
+              <w:t>kartu</w:t>
+            </w:r>
+            <w:proofErr w:type="spellEnd"/>
+            <w:r>
+              <w:rPr>
+                <w:sz w:val="20"/>
+                <w:szCs w:val="20"/>
+              </w:rPr>
+              <w:t xml:space="preserve"> </w:t>
+            </w:r>
+            <w:proofErr w:type="spellStart"/>
+            <w:r>
+              <w:rPr>
+                <w:sz w:val="20"/>
+                <w:szCs w:val="20"/>
+              </w:rPr>
+              <w:t>berlipat</w:t>
+            </w:r>
+            <w:proofErr w:type="spellEnd"/>
           </w:p>
         </w:tc>
       </w:tr>
@@ -8378,6 +9598,7 @@
             <w:pPr>
               <w:spacing w:before="20" w:after="20"/>
             </w:pPr>
+            <w:proofErr w:type="spellStart"/>
             <w:r>
               <w:rPr>
                 <w:rFonts w:cs="Carlito"/>
@@ -8387,6 +9608,7 @@
               </w:rPr>
               <w:t>Aturan</w:t>
             </w:r>
+            <w:proofErr w:type="spellEnd"/>
           </w:p>
         </w:tc>
         <w:tc>
@@ -8661,12 +9883,69 @@
             <w:pPr>
               <w:spacing w:before="20" w:after="20" w:line="252" w:lineRule="auto"/>
             </w:pPr>
-            <w:r>
-              <w:rPr>
-                <w:rFonts w:cs="Carlito"/>
-                <w:sz w:val="18"/>
-              </w:rPr>
-              <w:t>Pengguna tidak boleh melihat halaman yang diam</w:t>
+            <w:proofErr w:type="spellStart"/>
+            <w:r>
+              <w:rPr>
+                <w:rFonts w:cs="Carlito"/>
+                <w:sz w:val="18"/>
+              </w:rPr>
+              <w:t>Pengguna</w:t>
+            </w:r>
+            <w:proofErr w:type="spellEnd"/>
+            <w:r>
+              <w:rPr>
+                <w:rFonts w:cs="Carlito"/>
+                <w:sz w:val="18"/>
+              </w:rPr>
+              <w:t xml:space="preserve"> </w:t>
+            </w:r>
+            <w:proofErr w:type="spellStart"/>
+            <w:r>
+              <w:rPr>
+                <w:rFonts w:cs="Carlito"/>
+                <w:sz w:val="18"/>
+              </w:rPr>
+              <w:t>tidak</w:t>
+            </w:r>
+            <w:proofErr w:type="spellEnd"/>
+            <w:r>
+              <w:rPr>
+                <w:rFonts w:cs="Carlito"/>
+                <w:sz w:val="18"/>
+              </w:rPr>
+              <w:t xml:space="preserve"> </w:t>
+            </w:r>
+            <w:proofErr w:type="spellStart"/>
+            <w:r>
+              <w:rPr>
+                <w:rFonts w:cs="Carlito"/>
+                <w:sz w:val="18"/>
+              </w:rPr>
+              <w:t>boleh</w:t>
+            </w:r>
+            <w:proofErr w:type="spellEnd"/>
+            <w:r>
+              <w:rPr>
+                <w:rFonts w:cs="Carlito"/>
+                <w:sz w:val="18"/>
+              </w:rPr>
+              <w:t xml:space="preserve"> </w:t>
+            </w:r>
+            <w:proofErr w:type="spellStart"/>
+            <w:r>
+              <w:rPr>
+                <w:rFonts w:cs="Carlito"/>
+                <w:sz w:val="18"/>
+              </w:rPr>
+              <w:t>melihat</w:t>
+            </w:r>
+            <w:proofErr w:type="spellEnd"/>
+            <w:r>
+              <w:rPr>
+                <w:rFonts w:cs="Carlito"/>
+                <w:sz w:val="18"/>
+              </w:rPr>
+              <w:t xml:space="preserve"> halaman yang diam</w:t>
             </w:r>
           </w:p>
         </w:tc>
@@ -8818,12 +10097,69 @@
         </w:rPr>
         <w:t xml:space="preserve">Form sudah ada di halaman Anda sejak Pertemuan 3. Sekarang ia diberi tiga hal: preventDefault supaya halaman tidak dimuat ulang, validasi yang berjalan saat pengguna mengetik, dan pesan galat per kolom. </w:t>
       </w:r>
+      <w:proofErr w:type="spellStart"/>
       <w:r>
         <w:rPr>
           <w:rFonts w:cs="Carlito"/>
           <w:sz w:val="20"/>
         </w:rPr>
-        <w:t>Pesannya menyebut cara memperbaiki, bukan menyalahkan.</w:t>
+        <w:t>Pesannya</w:t>
+      </w:r>
+      <w:proofErr w:type="spellEnd"/>
+      <w:r>
+        <w:rPr>
+          <w:rFonts w:cs="Carlito"/>
+          <w:sz w:val="20"/>
+        </w:rPr>
+        <w:t xml:space="preserve"> </w:t>
+      </w:r>
+      <w:proofErr w:type="spellStart"/>
+      <w:r>
+        <w:rPr>
+          <w:rFonts w:cs="Carlito"/>
+          <w:sz w:val="20"/>
+        </w:rPr>
+        <w:t>menyebut</w:t>
+      </w:r>
+      <w:proofErr w:type="spellEnd"/>
+      <w:r>
+        <w:rPr>
+          <w:rFonts w:cs="Carlito"/>
+          <w:sz w:val="20"/>
+        </w:rPr>
+        <w:t xml:space="preserve"> </w:t>
+      </w:r>
+      <w:proofErr w:type="spellStart"/>
+      <w:r>
+        <w:rPr>
+          <w:rFonts w:cs="Carlito"/>
+          <w:sz w:val="20"/>
+        </w:rPr>
+        <w:t>cara</w:t>
+      </w:r>
+      <w:proofErr w:type="spellEnd"/>
+      <w:r>
+        <w:rPr>
+          <w:rFonts w:cs="Carlito"/>
+          <w:sz w:val="20"/>
+        </w:rPr>
+        <w:t xml:space="preserve"> </w:t>
+      </w:r>
+      <w:proofErr w:type="spellStart"/>
+      <w:r>
+        <w:rPr>
+          <w:rFonts w:cs="Carlito"/>
+          <w:sz w:val="20"/>
+        </w:rPr>
+        <w:t>memperbaiki</w:t>
+      </w:r>
+      <w:proofErr w:type="spellEnd"/>
+      <w:r>
+        <w:rPr>
+          <w:rFonts w:cs="Carlito"/>
+          <w:sz w:val="20"/>
+        </w:rPr>
+        <w:t>, bukan menyalahkan.</w:t>
       </w:r>
     </w:p>
     <w:tbl>
@@ -9099,12 +10435,21 @@
             <w:pPr>
               <w:spacing w:before="20" w:after="20" w:line="252" w:lineRule="auto"/>
             </w:pPr>
-            <w:r>
-              <w:rPr>
-                <w:rFonts w:cs="Carlito"/>
-                <w:sz w:val="18"/>
-              </w:rPr>
-              <w:t>setAttribute("aria-invalid", "true")</w:t>
+            <w:proofErr w:type="spellStart"/>
+            <w:r>
+              <w:rPr>
+                <w:rFonts w:cs="Carlito"/>
+                <w:sz w:val="18"/>
+              </w:rPr>
+              <w:t>setAttribute</w:t>
+            </w:r>
+            <w:proofErr w:type="spellEnd"/>
+            <w:r>
+              <w:rPr>
+                <w:rFonts w:cs="Carlito"/>
+                <w:sz w:val="18"/>
+              </w:rPr>
+              <w:t>("aria-invalid", "true")</w:t>
             </w:r>
           </w:p>
         </w:tc>
@@ -9179,13 +10524,31 @@
             <w:pPr>
               <w:spacing w:before="20" w:after="20" w:line="252" w:lineRule="auto"/>
             </w:pPr>
-            <w:r>
-              <w:rPr>
-                <w:rFonts w:cs="Carlito"/>
-                <w:sz w:val="18"/>
-              </w:rPr>
-              <w:t>tombol.disabled = !sah</w:t>
-            </w:r>
+            <w:proofErr w:type="spellStart"/>
+            <w:r>
+              <w:rPr>
+                <w:rFonts w:cs="Carlito"/>
+                <w:sz w:val="18"/>
+              </w:rPr>
+              <w:t>tombol.disabled</w:t>
+            </w:r>
+            <w:proofErr w:type="spellEnd"/>
+            <w:r>
+              <w:rPr>
+                <w:rFonts w:cs="Carlito"/>
+                <w:sz w:val="18"/>
+              </w:rPr>
+              <w:t xml:space="preserve"> = !</w:t>
+            </w:r>
+            <w:proofErr w:type="spellStart"/>
+            <w:r>
+              <w:rPr>
+                <w:rFonts w:cs="Carlito"/>
+                <w:sz w:val="18"/>
+              </w:rPr>
+              <w:t>sah</w:t>
+            </w:r>
+            <w:proofErr w:type="spellEnd"/>
           </w:p>
         </w:tc>
         <w:tc>
@@ -9259,12 +10622,21 @@
             <w:pPr>
               <w:spacing w:before="20" w:after="20" w:line="252" w:lineRule="auto"/>
             </w:pPr>
-            <w:r>
-              <w:rPr>
-                <w:rFonts w:cs="Carlito"/>
-                <w:sz w:val="18"/>
-              </w:rPr>
-              <w:t>kolom.focus()</w:t>
+            <w:proofErr w:type="spellStart"/>
+            <w:r>
+              <w:rPr>
+                <w:rFonts w:cs="Carlito"/>
+                <w:sz w:val="18"/>
+              </w:rPr>
+              <w:t>kolom.focus</w:t>
+            </w:r>
+            <w:proofErr w:type="spellEnd"/>
+            <w:r>
+              <w:rPr>
+                <w:rFonts w:cs="Carlito"/>
+                <w:sz w:val="18"/>
+              </w:rPr>
+              <w:t>()</w:t>
             </w:r>
           </w:p>
         </w:tc>
@@ -9343,7 +10715,61 @@
           <w:b/>
           <w:color w:val="003796"/>
         </w:rPr>
-        <w:t>D.3  Periksa hasil kerja Anda</w:t>
+        <w:t xml:space="preserve">D.3  </w:t>
+      </w:r>
+      <w:proofErr w:type="spellStart"/>
+      <w:r>
+        <w:rPr>
+          <w:rFonts w:cs="Carlito"/>
+          <w:b/>
+          <w:color w:val="003796"/>
+        </w:rPr>
+        <w:t>Periksa</w:t>
+      </w:r>
+      <w:proofErr w:type="spellEnd"/>
+      <w:r>
+        <w:rPr>
+          <w:rFonts w:cs="Carlito"/>
+          <w:b/>
+          <w:color w:val="003796"/>
+        </w:rPr>
+        <w:t xml:space="preserve"> </w:t>
+      </w:r>
+      <w:proofErr w:type="spellStart"/>
+      <w:r>
+        <w:rPr>
+          <w:rFonts w:cs="Carlito"/>
+          <w:b/>
+          <w:color w:val="003796"/>
+        </w:rPr>
+        <w:t>hasil</w:t>
+      </w:r>
+      <w:proofErr w:type="spellEnd"/>
+      <w:r>
+        <w:rPr>
+          <w:rFonts w:cs="Carlito"/>
+          <w:b/>
+          <w:color w:val="003796"/>
+        </w:rPr>
+        <w:t xml:space="preserve"> </w:t>
+      </w:r>
+      <w:proofErr w:type="spellStart"/>
+      <w:r>
+        <w:rPr>
+          <w:rFonts w:cs="Carlito"/>
+          <w:b/>
+          <w:color w:val="003796"/>
+        </w:rPr>
+        <w:t>kerja</w:t>
+      </w:r>
+      <w:proofErr w:type="spellEnd"/>
+      <w:r>
+        <w:rPr>
+          <w:rFonts w:cs="Carlito"/>
+          <w:b/>
+          <w:color w:val="003796"/>
+        </w:rPr>
+        <w:t xml:space="preserve"> Anda</w:t>
       </w:r>
     </w:p>
     <w:tbl>
@@ -9508,7 +10934,84 @@
           <w:p>
             <w:pPr>
               <w:spacing w:before="20" w:after="20" w:line="252" w:lineRule="auto"/>
-            </w:pPr>
+              <w:rPr>
+                <w:sz w:val="18"/>
+                <w:szCs w:val="18"/>
+                <w:lang w:val="en-ID"/>
+              </w:rPr>
+            </w:pPr>
+            <w:r>
+              <w:rPr>
+                <w:sz w:val="18"/>
+                <w:szCs w:val="18"/>
+                <w:lang w:val="en-ID"/>
+              </w:rPr>
+              <w:t xml:space="preserve">Halaman </w:t>
+            </w:r>
+            <w:proofErr w:type="spellStart"/>
+            <w:r>
+              <w:rPr>
+                <w:sz w:val="18"/>
+                <w:szCs w:val="18"/>
+                <w:lang w:val="en-ID"/>
+              </w:rPr>
+              <w:t>tetap</w:t>
+            </w:r>
+            <w:proofErr w:type="spellEnd"/>
+            <w:r>
+              <w:rPr>
+                <w:sz w:val="18"/>
+                <w:szCs w:val="18"/>
+                <w:lang w:val="en-ID"/>
+              </w:rPr>
+              <w:t xml:space="preserve"> dan </w:t>
+            </w:r>
+            <w:proofErr w:type="spellStart"/>
+            <w:r>
+              <w:rPr>
+                <w:sz w:val="18"/>
+                <w:szCs w:val="18"/>
+                <w:lang w:val="en-ID"/>
+              </w:rPr>
+              <w:t>pesan</w:t>
+            </w:r>
+            <w:proofErr w:type="spellEnd"/>
+            <w:r>
+              <w:rPr>
+                <w:sz w:val="18"/>
+                <w:szCs w:val="18"/>
+                <w:lang w:val="en-ID"/>
+              </w:rPr>
+              <w:t xml:space="preserve"> </w:t>
+            </w:r>
+            <w:proofErr w:type="spellStart"/>
+            <w:r>
+              <w:rPr>
+                <w:sz w:val="18"/>
+                <w:szCs w:val="18"/>
+                <w:lang w:val="en-ID"/>
+              </w:rPr>
+              <w:t>galat</w:t>
+            </w:r>
+            <w:proofErr w:type="spellEnd"/>
+            <w:r>
+              <w:rPr>
+                <w:sz w:val="18"/>
+                <w:szCs w:val="18"/>
+                <w:lang w:val="en-ID"/>
+              </w:rPr>
+              <w:t xml:space="preserve"> </w:t>
+            </w:r>
+            <w:proofErr w:type="spellStart"/>
+            <w:r>
+              <w:rPr>
+                <w:sz w:val="18"/>
+                <w:szCs w:val="18"/>
+                <w:lang w:val="en-ID"/>
+              </w:rPr>
+              <w:t>muncul</w:t>
+            </w:r>
+            <w:proofErr w:type="spellEnd"/>
           </w:p>
         </w:tc>
       </w:tr>
@@ -9532,13 +11035,47 @@
             <w:pPr>
               <w:spacing w:before="20" w:after="20" w:line="252" w:lineRule="auto"/>
             </w:pPr>
-            <w:r>
-              <w:rPr>
-                <w:rFonts w:cs="Carlito"/>
-                <w:sz w:val="18"/>
-              </w:rPr>
-              <w:t>Perbaiki satu kolom</w:t>
-            </w:r>
+            <w:proofErr w:type="spellStart"/>
+            <w:r>
+              <w:rPr>
+                <w:rFonts w:cs="Carlito"/>
+                <w:sz w:val="18"/>
+              </w:rPr>
+              <w:t>Perbaiki</w:t>
+            </w:r>
+            <w:proofErr w:type="spellEnd"/>
+            <w:r>
+              <w:rPr>
+                <w:rFonts w:cs="Carlito"/>
+                <w:sz w:val="18"/>
+              </w:rPr>
+              <w:t xml:space="preserve"> </w:t>
+            </w:r>
+            <w:proofErr w:type="spellStart"/>
+            <w:r>
+              <w:rPr>
+                <w:rFonts w:cs="Carlito"/>
+                <w:sz w:val="18"/>
+              </w:rPr>
+              <w:t>satu</w:t>
+            </w:r>
+            <w:proofErr w:type="spellEnd"/>
+            <w:r>
+              <w:rPr>
+                <w:rFonts w:cs="Carlito"/>
+                <w:sz w:val="18"/>
+              </w:rPr>
+              <w:t xml:space="preserve"> </w:t>
+            </w:r>
+            <w:proofErr w:type="spellStart"/>
+            <w:r>
+              <w:rPr>
+                <w:rFonts w:cs="Carlito"/>
+                <w:sz w:val="18"/>
+              </w:rPr>
+              <w:t>kolom</w:t>
+            </w:r>
+            <w:proofErr w:type="spellEnd"/>
           </w:p>
         </w:tc>
         <w:tc>
@@ -9577,7 +11114,52 @@
           <w:p>
             <w:pPr>
               <w:spacing w:before="20" w:after="20" w:line="252" w:lineRule="auto"/>
-            </w:pPr>
+              <w:rPr>
+                <w:sz w:val="18"/>
+                <w:szCs w:val="18"/>
+              </w:rPr>
+            </w:pPr>
+            <w:proofErr w:type="spellStart"/>
+            <w:r>
+              <w:rPr>
+                <w:sz w:val="18"/>
+                <w:szCs w:val="18"/>
+              </w:rPr>
+              <w:t>Pesan</w:t>
+            </w:r>
+            <w:proofErr w:type="spellEnd"/>
+            <w:r>
+              <w:rPr>
+                <w:sz w:val="18"/>
+                <w:szCs w:val="18"/>
+              </w:rPr>
+              <w:t xml:space="preserve"> </w:t>
+            </w:r>
+            <w:proofErr w:type="spellStart"/>
+            <w:r>
+              <w:rPr>
+                <w:sz w:val="18"/>
+                <w:szCs w:val="18"/>
+              </w:rPr>
+              <w:t>galat</w:t>
+            </w:r>
+            <w:proofErr w:type="spellEnd"/>
+            <w:r>
+              <w:rPr>
+                <w:sz w:val="18"/>
+                <w:szCs w:val="18"/>
+              </w:rPr>
+              <w:t xml:space="preserve"> </w:t>
+            </w:r>
+            <w:proofErr w:type="spellStart"/>
+            <w:r>
+              <w:rPr>
+                <w:sz w:val="18"/>
+                <w:szCs w:val="18"/>
+              </w:rPr>
+              <w:t>hilang</w:t>
+            </w:r>
+            <w:proofErr w:type="spellEnd"/>
           </w:p>
         </w:tc>
       </w:tr>
@@ -9646,7 +11228,52 @@
           <w:p>
             <w:pPr>
               <w:spacing w:before="20" w:after="20" w:line="252" w:lineRule="auto"/>
-            </w:pPr>
+              <w:rPr>
+                <w:sz w:val="18"/>
+                <w:szCs w:val="18"/>
+              </w:rPr>
+            </w:pPr>
+            <w:proofErr w:type="spellStart"/>
+            <w:r>
+              <w:rPr>
+                <w:sz w:val="18"/>
+                <w:szCs w:val="18"/>
+              </w:rPr>
+              <w:t>Pesan</w:t>
+            </w:r>
+            <w:proofErr w:type="spellEnd"/>
+            <w:r>
+              <w:rPr>
+                <w:sz w:val="18"/>
+                <w:szCs w:val="18"/>
+              </w:rPr>
+              <w:t xml:space="preserve"> </w:t>
+            </w:r>
+            <w:proofErr w:type="spellStart"/>
+            <w:r>
+              <w:rPr>
+                <w:sz w:val="18"/>
+                <w:szCs w:val="18"/>
+              </w:rPr>
+              <w:t>galat</w:t>
+            </w:r>
+            <w:proofErr w:type="spellEnd"/>
+            <w:r>
+              <w:rPr>
+                <w:sz w:val="18"/>
+                <w:szCs w:val="18"/>
+              </w:rPr>
+              <w:t xml:space="preserve"> </w:t>
+            </w:r>
+            <w:proofErr w:type="spellStart"/>
+            <w:r>
+              <w:rPr>
+                <w:sz w:val="18"/>
+                <w:szCs w:val="18"/>
+              </w:rPr>
+              <w:t>tetap</w:t>
+            </w:r>
+            <w:proofErr w:type="spellEnd"/>
           </w:p>
         </w:tc>
       </w:tr>
@@ -9720,9 +11347,217 @@
             <w:pPr>
               <w:spacing w:before="20" w:after="20" w:line="252" w:lineRule="auto"/>
               <w:rPr>
+                <w:sz w:val="18"/>
+                <w:szCs w:val="18"/>
+                <w:lang w:val="en-ID"/>
+              </w:rPr>
+            </w:pPr>
+            <w:r>
+              <w:rPr>
+                <w:sz w:val="18"/>
+                <w:szCs w:val="18"/>
+                <w:lang w:val="en-ID"/>
+              </w:rPr>
+              <w:t xml:space="preserve">Hasil </w:t>
+            </w:r>
+            <w:proofErr w:type="spellStart"/>
+            <w:r>
+              <w:rPr>
+                <w:sz w:val="18"/>
+                <w:szCs w:val="18"/>
+                <w:lang w:val="en-ID"/>
+              </w:rPr>
+              <w:t>cek</w:t>
+            </w:r>
+            <w:proofErr w:type="spellEnd"/>
+            <w:r>
+              <w:rPr>
+                <w:sz w:val="18"/>
+                <w:szCs w:val="18"/>
+                <w:lang w:val="en-ID"/>
+              </w:rPr>
+              <w:t xml:space="preserve"> console </w:t>
+            </w:r>
+            <w:proofErr w:type="spellStart"/>
+            <w:r>
+              <w:rPr>
+                <w:sz w:val="18"/>
+                <w:szCs w:val="18"/>
+                <w:lang w:val="en-ID"/>
+              </w:rPr>
+              <w:t>saat</w:t>
+            </w:r>
+            <w:proofErr w:type="spellEnd"/>
+            <w:r>
+              <w:rPr>
+                <w:sz w:val="18"/>
+                <w:szCs w:val="18"/>
+                <w:lang w:val="en-ID"/>
+              </w:rPr>
+              <w:t xml:space="preserve"> </w:t>
+            </w:r>
+            <w:proofErr w:type="spellStart"/>
+            <w:r>
+              <w:rPr>
+                <w:sz w:val="18"/>
+                <w:szCs w:val="18"/>
+                <w:lang w:val="en-ID"/>
+              </w:rPr>
+              <w:t>masih</w:t>
+            </w:r>
+            <w:proofErr w:type="spellEnd"/>
+            <w:r>
+              <w:rPr>
+                <w:sz w:val="18"/>
+                <w:szCs w:val="18"/>
+                <w:lang w:val="en-ID"/>
+              </w:rPr>
+              <w:t xml:space="preserve"> </w:t>
+            </w:r>
+            <w:proofErr w:type="spellStart"/>
+            <w:r>
+              <w:rPr>
+                <w:sz w:val="18"/>
+                <w:szCs w:val="18"/>
+                <w:lang w:val="en-ID"/>
+              </w:rPr>
+              <w:t>ada</w:t>
+            </w:r>
+            <w:proofErr w:type="spellEnd"/>
+            <w:r>
+              <w:rPr>
+                <w:sz w:val="18"/>
+                <w:szCs w:val="18"/>
+                <w:lang w:val="en-ID"/>
+              </w:rPr>
+              <w:t xml:space="preserve"> </w:t>
+            </w:r>
+            <w:proofErr w:type="spellStart"/>
+            <w:r>
+              <w:rPr>
+                <w:sz w:val="18"/>
+                <w:szCs w:val="18"/>
+                <w:lang w:val="en-ID"/>
+              </w:rPr>
+              <w:t>pesan</w:t>
+            </w:r>
+            <w:proofErr w:type="spellEnd"/>
+            <w:r>
+              <w:rPr>
+                <w:sz w:val="18"/>
+                <w:szCs w:val="18"/>
+                <w:lang w:val="en-ID"/>
+              </w:rPr>
+              <w:t xml:space="preserve"> </w:t>
+            </w:r>
+            <w:proofErr w:type="spellStart"/>
+            <w:r>
+              <w:rPr>
+                <w:sz w:val="18"/>
+                <w:szCs w:val="18"/>
+                <w:lang w:val="en-ID"/>
+              </w:rPr>
+              <w:t>galat</w:t>
+            </w:r>
+            <w:proofErr w:type="spellEnd"/>
+            <w:r>
+              <w:rPr>
+                <w:sz w:val="18"/>
+                <w:szCs w:val="18"/>
+                <w:lang w:val="en-ID"/>
+              </w:rPr>
+              <w:t>:</w:t>
+            </w:r>
+          </w:p>
+          <w:p>
+            <w:pPr>
+              <w:spacing w:before="20" w:after="20" w:line="252" w:lineRule="auto"/>
+              <w:rPr>
+                <w:sz w:val="18"/>
+                <w:szCs w:val="18"/>
+                <w:lang w:val="en-ID"/>
+              </w:rPr>
+            </w:pPr>
+            <w:r>
+              <w:rPr>
+                <w:sz w:val="18"/>
+                <w:szCs w:val="18"/>
+                <w:lang w:val="en-ID"/>
+              </w:rPr>
+              <w:t>&gt;</w:t>
+            </w:r>
+            <w:proofErr w:type="spellStart"/>
+            <w:r>
+              <w:rPr>
+                <w:sz w:val="18"/>
+                <w:szCs w:val="18"/>
+                <w:lang w:val="en-ID"/>
+              </w:rPr>
+              <w:t>document.querySelector</w:t>
+            </w:r>
+            <w:proofErr w:type="spellEnd"/>
+            <w:r>
+              <w:rPr>
+                <w:sz w:val="18"/>
+                <w:szCs w:val="18"/>
+                <w:lang w:val="en-ID"/>
+              </w:rPr>
+              <w:t>("#form-</w:t>
+            </w:r>
+            <w:proofErr w:type="spellStart"/>
+            <w:r>
+              <w:rPr>
+                <w:sz w:val="18"/>
+                <w:szCs w:val="18"/>
+                <w:lang w:val="en-ID"/>
+              </w:rPr>
+              <w:t>sertifikasi</w:t>
+            </w:r>
+            <w:proofErr w:type="spellEnd"/>
+            <w:r>
+              <w:rPr>
+                <w:sz w:val="18"/>
+                <w:szCs w:val="18"/>
+                <w:lang w:val="en-ID"/>
+              </w:rPr>
+              <w:t xml:space="preserve"> button[type='submit']").disabled</w:t>
+            </w:r>
+          </w:p>
+          <w:p>
+            <w:pPr>
+              <w:spacing w:before="20" w:after="20" w:line="252" w:lineRule="auto"/>
+              <w:rPr>
+                <w:sz w:val="18"/>
+                <w:szCs w:val="18"/>
+                <w:lang w:val="en-ID"/>
+              </w:rPr>
+            </w:pPr>
+          </w:p>
+          <w:p>
+            <w:pPr>
+              <w:spacing w:before="20" w:after="20" w:line="252" w:lineRule="auto"/>
+              <w:rPr>
+                <w:sz w:val="18"/>
+                <w:szCs w:val="18"/>
                 <w:lang w:val="de-DE"/>
               </w:rPr>
             </w:pPr>
+            <w:r>
+              <w:rPr>
+                <w:sz w:val="18"/>
+                <w:szCs w:val="18"/>
+                <w:lang w:val="de-DE"/>
+              </w:rPr>
+              <w:t>&gt;</w:t>
+            </w:r>
+            <w:r>
+              <w:rPr>
+                <w:sz w:val="18"/>
+                <w:szCs w:val="18"/>
+                <w:lang w:val="de-DE"/>
+              </w:rPr>
+              <w:t>true</w:t>
+            </w:r>
           </w:p>
         </w:tc>
       </w:tr>
@@ -10163,7 +11998,23 @@
           <w:rFonts w:cs="Carlito"/>
           <w:sz w:val="20"/>
         </w:rPr>
-        <w:t>Panel Event Listeners menunjukkan pendengar mana yang menempel pada elemen mana.</w:t>
+        <w:t xml:space="preserve">Panel Event Listeners </w:t>
+      </w:r>
+      <w:proofErr w:type="spellStart"/>
+      <w:r>
+        <w:rPr>
+          <w:rFonts w:cs="Carlito"/>
+          <w:sz w:val="20"/>
+        </w:rPr>
+        <w:t>menunjukkan</w:t>
+      </w:r>
+      <w:proofErr w:type="spellEnd"/>
+      <w:r>
+        <w:rPr>
+          <w:rFonts w:cs="Carlito"/>
+          <w:sz w:val="20"/>
+        </w:rPr>
+        <w:t xml:space="preserve"> pendengar mana yang menempel pada elemen mana.</w:t>
       </w:r>
     </w:p>
     <w:tbl>
@@ -10443,12 +12294,37 @@
             <w:pPr>
               <w:spacing w:before="20" w:after="20" w:line="252" w:lineRule="auto"/>
             </w:pPr>
-            <w:r>
-              <w:rPr>
-                <w:rFonts w:cs="Carlito"/>
-                <w:sz w:val="18"/>
-              </w:rPr>
-              <w:t>monitorEvents(el)</w:t>
+            <w:proofErr w:type="spellStart"/>
+            <w:r>
+              <w:rPr>
+                <w:rFonts w:cs="Carlito"/>
+                <w:sz w:val="18"/>
+              </w:rPr>
+              <w:t>monitorEvents</w:t>
+            </w:r>
+            <w:proofErr w:type="spellEnd"/>
+            <w:r>
+              <w:rPr>
+                <w:rFonts w:cs="Carlito"/>
+                <w:sz w:val="18"/>
+              </w:rPr>
+              <w:t>(</w:t>
+            </w:r>
+            <w:proofErr w:type="spellStart"/>
+            <w:r>
+              <w:rPr>
+                <w:rFonts w:cs="Carlito"/>
+                <w:sz w:val="18"/>
+              </w:rPr>
+              <w:t>el</w:t>
+            </w:r>
+            <w:proofErr w:type="spellEnd"/>
+            <w:r>
+              <w:rPr>
+                <w:rFonts w:cs="Carlito"/>
+                <w:sz w:val="18"/>
+              </w:rPr>
+              <w:t>)</w:t>
             </w:r>
           </w:p>
         </w:tc>
@@ -10615,12 +12491,69 @@
         </w:rPr>
         <w:t xml:space="preserve">Urutan pemeriksaan di bawah ini disusun dari yang paling sering terjadi. </w:t>
       </w:r>
+      <w:proofErr w:type="spellStart"/>
       <w:r>
         <w:rPr>
           <w:rFonts w:cs="Carlito"/>
           <w:sz w:val="20"/>
         </w:rPr>
-        <w:t>Kerjakan berurutan; jangan melompat ke sebab yang paling rumit.</w:t>
+        <w:t>Kerjakan</w:t>
+      </w:r>
+      <w:proofErr w:type="spellEnd"/>
+      <w:r>
+        <w:rPr>
+          <w:rFonts w:cs="Carlito"/>
+          <w:sz w:val="20"/>
+        </w:rPr>
+        <w:t xml:space="preserve"> </w:t>
+      </w:r>
+      <w:proofErr w:type="spellStart"/>
+      <w:r>
+        <w:rPr>
+          <w:rFonts w:cs="Carlito"/>
+          <w:sz w:val="20"/>
+        </w:rPr>
+        <w:t>berurutan</w:t>
+      </w:r>
+      <w:proofErr w:type="spellEnd"/>
+      <w:r>
+        <w:rPr>
+          <w:rFonts w:cs="Carlito"/>
+          <w:sz w:val="20"/>
+        </w:rPr>
+        <w:t xml:space="preserve">; </w:t>
+      </w:r>
+      <w:proofErr w:type="spellStart"/>
+      <w:r>
+        <w:rPr>
+          <w:rFonts w:cs="Carlito"/>
+          <w:sz w:val="20"/>
+        </w:rPr>
+        <w:t>jangan</w:t>
+      </w:r>
+      <w:proofErr w:type="spellEnd"/>
+      <w:r>
+        <w:rPr>
+          <w:rFonts w:cs="Carlito"/>
+          <w:sz w:val="20"/>
+        </w:rPr>
+        <w:t xml:space="preserve"> </w:t>
+      </w:r>
+      <w:proofErr w:type="spellStart"/>
+      <w:r>
+        <w:rPr>
+          <w:rFonts w:cs="Carlito"/>
+          <w:sz w:val="20"/>
+        </w:rPr>
+        <w:t>melompat</w:t>
+      </w:r>
+      <w:proofErr w:type="spellEnd"/>
+      <w:r>
+        <w:rPr>
+          <w:rFonts w:cs="Carlito"/>
+          <w:sz w:val="20"/>
+        </w:rPr>
+        <w:t xml:space="preserve"> ke sebab yang paling rumit.</w:t>
       </w:r>
     </w:p>
     <w:tbl>
@@ -10790,12 +12723,37 @@
             <w:pPr>
               <w:spacing w:before="20" w:after="20" w:line="252" w:lineRule="auto"/>
             </w:pPr>
-            <w:r>
-              <w:rPr>
-                <w:rFonts w:cs="Carlito"/>
-                <w:sz w:val="18"/>
-              </w:rPr>
-              <w:t>Periksa urutan &lt;script&gt;: app.js lalu dom.js, keduanya sebelum &lt;/body&gt;</w:t>
+            <w:proofErr w:type="spellStart"/>
+            <w:r>
+              <w:rPr>
+                <w:rFonts w:cs="Carlito"/>
+                <w:sz w:val="18"/>
+              </w:rPr>
+              <w:t>Periksa</w:t>
+            </w:r>
+            <w:proofErr w:type="spellEnd"/>
+            <w:r>
+              <w:rPr>
+                <w:rFonts w:cs="Carlito"/>
+                <w:sz w:val="18"/>
+              </w:rPr>
+              <w:t xml:space="preserve"> </w:t>
+            </w:r>
+            <w:proofErr w:type="spellStart"/>
+            <w:r>
+              <w:rPr>
+                <w:rFonts w:cs="Carlito"/>
+                <w:sz w:val="18"/>
+              </w:rPr>
+              <w:t>urutan</w:t>
+            </w:r>
+            <w:proofErr w:type="spellEnd"/>
+            <w:r>
+              <w:rPr>
+                <w:rFonts w:cs="Carlito"/>
+                <w:sz w:val="18"/>
+              </w:rPr>
+              <w:t xml:space="preserve"> &lt;script&gt;: app.js lalu dom.js, keduanya sebelum &lt;/body&gt;</w:t>
             </w:r>
           </w:p>
         </w:tc>
@@ -10989,7 +12947,39 @@
                 <w:rFonts w:cs="Carlito"/>
                 <w:sz w:val="18"/>
               </w:rPr>
-              <w:t>Daftar kosong tanpa penjelasan</w:t>
+              <w:t xml:space="preserve">Daftar </w:t>
+            </w:r>
+            <w:proofErr w:type="spellStart"/>
+            <w:r>
+              <w:rPr>
+                <w:rFonts w:cs="Carlito"/>
+                <w:sz w:val="18"/>
+              </w:rPr>
+              <w:t>kosong</w:t>
+            </w:r>
+            <w:proofErr w:type="spellEnd"/>
+            <w:r>
+              <w:rPr>
+                <w:rFonts w:cs="Carlito"/>
+                <w:sz w:val="18"/>
+              </w:rPr>
+              <w:t xml:space="preserve"> </w:t>
+            </w:r>
+            <w:proofErr w:type="spellStart"/>
+            <w:r>
+              <w:rPr>
+                <w:rFonts w:cs="Carlito"/>
+                <w:sz w:val="18"/>
+              </w:rPr>
+              <w:t>tanpa</w:t>
+            </w:r>
+            <w:proofErr w:type="spellEnd"/>
+            <w:r>
+              <w:rPr>
+                <w:rFonts w:cs="Carlito"/>
+                <w:sz w:val="18"/>
+              </w:rPr>
+              <w:t xml:space="preserve"> penjelasan</w:t>
             </w:r>
           </w:p>
         </w:tc>
@@ -11426,8 +13416,17 @@
                 <w:rFonts w:cs="Carlito"/>
                 <w:sz w:val="18"/>
               </w:rPr>
-              <w:t>Isi daftar kosong</w:t>
-            </w:r>
+              <w:t xml:space="preserve">Isi daftar </w:t>
+            </w:r>
+            <w:proofErr w:type="spellStart"/>
+            <w:r>
+              <w:rPr>
+                <w:rFonts w:cs="Carlito"/>
+                <w:sz w:val="18"/>
+              </w:rPr>
+              <w:t>kosong</w:t>
+            </w:r>
+            <w:proofErr w:type="spellEnd"/>
           </w:p>
         </w:tc>
         <w:tc>
@@ -12393,12 +14392,69 @@
         </w:rPr>
         <w:t xml:space="preserve">4.  Apa yang terjadi bila baris pengosongan wadah dihapus dari fungsi render? </w:t>
       </w:r>
+      <w:proofErr w:type="spellStart"/>
       <w:r>
         <w:rPr>
           <w:rFonts w:cs="Carlito"/>
           <w:sz w:val="20"/>
         </w:rPr>
-        <w:t>Peragakan, lalu tulis hasilnya.</w:t>
+        <w:t>Peragakan</w:t>
+      </w:r>
+      <w:proofErr w:type="spellEnd"/>
+      <w:r>
+        <w:rPr>
+          <w:rFonts w:cs="Carlito"/>
+          <w:sz w:val="20"/>
+        </w:rPr>
+        <w:t xml:space="preserve">, </w:t>
+      </w:r>
+      <w:proofErr w:type="spellStart"/>
+      <w:r>
+        <w:rPr>
+          <w:rFonts w:cs="Carlito"/>
+          <w:sz w:val="20"/>
+        </w:rPr>
+        <w:t>lalu</w:t>
+      </w:r>
+      <w:proofErr w:type="spellEnd"/>
+      <w:r>
+        <w:rPr>
+          <w:rFonts w:cs="Carlito"/>
+          <w:sz w:val="20"/>
+        </w:rPr>
+        <w:t xml:space="preserve"> </w:t>
+      </w:r>
+      <w:proofErr w:type="spellStart"/>
+      <w:r>
+        <w:rPr>
+          <w:rFonts w:cs="Carlito"/>
+          <w:sz w:val="20"/>
+        </w:rPr>
+        <w:t>tulis</w:t>
+      </w:r>
+      <w:proofErr w:type="spellEnd"/>
+      <w:r>
+        <w:rPr>
+          <w:rFonts w:cs="Carlito"/>
+          <w:sz w:val="20"/>
+        </w:rPr>
+        <w:t xml:space="preserve"> </w:t>
+      </w:r>
+      <w:proofErr w:type="spellStart"/>
+      <w:r>
+        <w:rPr>
+          <w:rFonts w:cs="Carlito"/>
+          <w:sz w:val="20"/>
+        </w:rPr>
+        <w:t>hasilnya</w:t>
+      </w:r>
+      <w:proofErr w:type="spellEnd"/>
+      <w:r>
+        <w:rPr>
+          <w:rFonts w:cs="Carlito"/>
+          <w:sz w:val="20"/>
+        </w:rPr>
+        <w:t>.</w:t>
       </w:r>
     </w:p>
     <w:tbl>
@@ -12468,7 +14524,23 @@
           <w:rFonts w:cs="Carlito"/>
           <w:sz w:val="20"/>
         </w:rPr>
-        <w:t>Tulis cara yang Anda pakai sebagai gantinya.</w:t>
+        <w:t xml:space="preserve">Tulis </w:t>
+      </w:r>
+      <w:proofErr w:type="spellStart"/>
+      <w:r>
+        <w:rPr>
+          <w:rFonts w:cs="Carlito"/>
+          <w:sz w:val="20"/>
+        </w:rPr>
+        <w:t>cara</w:t>
+      </w:r>
+      <w:proofErr w:type="spellEnd"/>
+      <w:r>
+        <w:rPr>
+          <w:rFonts w:cs="Carlito"/>
+          <w:sz w:val="20"/>
+        </w:rPr>
+        <w:t xml:space="preserve"> yang Anda pakai sebagai gantinya.</w:t>
       </w:r>
     </w:p>
     <w:tbl>
@@ -12639,7 +14711,25 @@
                 <w:color w:val="003796"/>
                 <w:sz w:val="22"/>
               </w:rPr>
-              <w:t>☐  Render dari data  daftar proyek terbentuk dari array dengan createElement dan textContent, bukan dari HTML yang ditulis tangan</w:t>
+              <w:t xml:space="preserve">☐  Render </w:t>
+            </w:r>
+            <w:proofErr w:type="spellStart"/>
+            <w:r>
+              <w:rPr>
+                <w:rFonts w:cs="Carlito"/>
+                <w:color w:val="003796"/>
+                <w:sz w:val="22"/>
+              </w:rPr>
+              <w:t>dari</w:t>
+            </w:r>
+            <w:proofErr w:type="spellEnd"/>
+            <w:r>
+              <w:rPr>
+                <w:rFonts w:cs="Carlito"/>
+                <w:color w:val="003796"/>
+                <w:sz w:val="22"/>
+              </w:rPr>
+              <w:t xml:space="preserve"> data  daftar proyek terbentuk dari array dengan createElement dan textContent, bukan dari HTML yang ditulis tangan</w:t>
             </w:r>
           </w:p>
         </w:tc>
@@ -12695,7 +14785,25 @@
                 <w:color w:val="003796"/>
                 <w:sz w:val="22"/>
               </w:rPr>
-              <w:t>☐  Event delegation  satu pendengar di induk melayani semua tombol filter; event.target dan closest dipakai benar</w:t>
+              <w:t xml:space="preserve">☐  Event delegation  </w:t>
+            </w:r>
+            <w:proofErr w:type="spellStart"/>
+            <w:r>
+              <w:rPr>
+                <w:rFonts w:cs="Carlito"/>
+                <w:color w:val="003796"/>
+                <w:sz w:val="22"/>
+              </w:rPr>
+              <w:t>satu</w:t>
+            </w:r>
+            <w:proofErr w:type="spellEnd"/>
+            <w:r>
+              <w:rPr>
+                <w:rFonts w:cs="Carlito"/>
+                <w:color w:val="003796"/>
+                <w:sz w:val="22"/>
+              </w:rPr>
+              <w:t xml:space="preserve"> pendengar di induk melayani semua tombol filter; event.target dan closest dipakai benar</w:t>
             </w:r>
           </w:p>
         </w:tc>
@@ -14448,7 +16556,23 @@
                 <w:rFonts w:cs="Carlito"/>
                 <w:sz w:val="17"/>
               </w:rPr>
-              <w:t>Render dari data</w:t>
+              <w:t xml:space="preserve">Render </w:t>
+            </w:r>
+            <w:proofErr w:type="spellStart"/>
+            <w:r>
+              <w:rPr>
+                <w:rFonts w:cs="Carlito"/>
+                <w:sz w:val="17"/>
+              </w:rPr>
+              <w:t>dari</w:t>
+            </w:r>
+            <w:proofErr w:type="spellEnd"/>
+            <w:r>
+              <w:rPr>
+                <w:rFonts w:cs="Carlito"/>
+                <w:sz w:val="17"/>
+              </w:rPr>
+              <w:t xml:space="preserve"> data</w:t>
             </w:r>
           </w:p>
         </w:tc>
@@ -14999,7 +17123,27 @@
           <w:color w:val="5A6080"/>
           <w:sz w:val="17"/>
         </w:rPr>
-        <w:t>Lampiran B — Rujukan cepat dan kalau macet</w:t>
+        <w:t xml:space="preserve">Lampiran B — </w:t>
+      </w:r>
+      <w:proofErr w:type="spellStart"/>
+      <w:r>
+        <w:rPr>
+          <w:rFonts w:cs="Carlito"/>
+          <w:i/>
+          <w:color w:val="5A6080"/>
+          <w:sz w:val="17"/>
+        </w:rPr>
+        <w:t>Rujukan</w:t>
+      </w:r>
+      <w:proofErr w:type="spellEnd"/>
+      <w:r>
+        <w:rPr>
+          <w:rFonts w:cs="Carlito"/>
+          <w:i/>
+          <w:color w:val="5A6080"/>
+          <w:sz w:val="17"/>
+        </w:rPr>
+        <w:t xml:space="preserve"> cepat dan kalau macet</w:t>
       </w:r>
     </w:p>
     <w:p>
@@ -15649,6 +17793,7 @@
             <w:pPr>
               <w:spacing w:before="20" w:after="20" w:line="252" w:lineRule="auto"/>
             </w:pPr>
+            <w:proofErr w:type="spellStart"/>
             <w:r>
               <w:rPr>
                 <w:rFonts w:cs="Carlito"/>
@@ -15656,6 +17801,7 @@
               </w:rPr>
               <w:t>classList.toggle</w:t>
             </w:r>
+            <w:proofErr w:type="spellEnd"/>
           </w:p>
         </w:tc>
         <w:tc>
@@ -16439,12 +18585,37 @@
             <w:pPr>
               <w:spacing w:before="20" w:after="20" w:line="252" w:lineRule="auto"/>
             </w:pPr>
-            <w:r>
-              <w:rPr>
-                <w:rFonts w:cs="Carlito"/>
-                <w:sz w:val="18"/>
-              </w:rPr>
-              <w:t>Tambahkan wadah.textContent = "" di baris pertama render</w:t>
+            <w:proofErr w:type="spellStart"/>
+            <w:r>
+              <w:rPr>
+                <w:rFonts w:cs="Carlito"/>
+                <w:sz w:val="18"/>
+              </w:rPr>
+              <w:t>Tambahkan</w:t>
+            </w:r>
+            <w:proofErr w:type="spellEnd"/>
+            <w:r>
+              <w:rPr>
+                <w:rFonts w:cs="Carlito"/>
+                <w:sz w:val="18"/>
+              </w:rPr>
+              <w:t xml:space="preserve"> </w:t>
+            </w:r>
+            <w:proofErr w:type="spellStart"/>
+            <w:r>
+              <w:rPr>
+                <w:rFonts w:cs="Carlito"/>
+                <w:sz w:val="18"/>
+              </w:rPr>
+              <w:t>wadah.textContent</w:t>
+            </w:r>
+            <w:proofErr w:type="spellEnd"/>
+            <w:r>
+              <w:rPr>
+                <w:rFonts w:cs="Carlito"/>
+                <w:sz w:val="18"/>
+              </w:rPr>
+              <w:t xml:space="preserve"> = "" di baris pertama render</w:t>
             </w:r>
           </w:p>
         </w:tc>
@@ -16577,8 +18748,33 @@
                 <w:rFonts w:cs="Carlito"/>
                 <w:sz w:val="18"/>
               </w:rPr>
-              <w:t>Isi dimasukkan dengan innerHTML</w:t>
-            </w:r>
+              <w:t xml:space="preserve">Isi </w:t>
+            </w:r>
+            <w:proofErr w:type="spellStart"/>
+            <w:r>
+              <w:rPr>
+                <w:rFonts w:cs="Carlito"/>
+                <w:sz w:val="18"/>
+              </w:rPr>
+              <w:t>dimasukkan</w:t>
+            </w:r>
+            <w:proofErr w:type="spellEnd"/>
+            <w:r>
+              <w:rPr>
+                <w:rFonts w:cs="Carlito"/>
+                <w:sz w:val="18"/>
+              </w:rPr>
+              <w:t xml:space="preserve"> dengan </w:t>
+            </w:r>
+            <w:proofErr w:type="spellStart"/>
+            <w:r>
+              <w:rPr>
+                <w:rFonts w:cs="Carlito"/>
+                <w:sz w:val="18"/>
+              </w:rPr>
+              <w:t>innerHTML</w:t>
+            </w:r>
+            <w:proofErr w:type="spellEnd"/>
           </w:p>
         </w:tc>
         <w:tc>
@@ -16733,7 +18929,39 @@
                 <w:rFonts w:cs="Carlito"/>
                 <w:sz w:val="18"/>
               </w:rPr>
-              <w:t>Isi diperiksa tanpa trim()</w:t>
+              <w:t xml:space="preserve">Isi </w:t>
+            </w:r>
+            <w:proofErr w:type="spellStart"/>
+            <w:r>
+              <w:rPr>
+                <w:rFonts w:cs="Carlito"/>
+                <w:sz w:val="18"/>
+              </w:rPr>
+              <w:t>diperiksa</w:t>
+            </w:r>
+            <w:proofErr w:type="spellEnd"/>
+            <w:r>
+              <w:rPr>
+                <w:rFonts w:cs="Carlito"/>
+                <w:sz w:val="18"/>
+              </w:rPr>
+              <w:t xml:space="preserve"> </w:t>
+            </w:r>
+            <w:proofErr w:type="spellStart"/>
+            <w:r>
+              <w:rPr>
+                <w:rFonts w:cs="Carlito"/>
+                <w:sz w:val="18"/>
+              </w:rPr>
+              <w:t>tanpa</w:t>
+            </w:r>
+            <w:proofErr w:type="spellEnd"/>
+            <w:r>
+              <w:rPr>
+                <w:rFonts w:cs="Carlito"/>
+                <w:sz w:val="18"/>
+              </w:rPr>
+              <w:t xml:space="preserve"> trim()</w:t>
             </w:r>
           </w:p>
         </w:tc>
@@ -16869,12 +19097,53 @@
             <w:pPr>
               <w:spacing w:before="20" w:after="20" w:line="252" w:lineRule="auto"/>
             </w:pPr>
-            <w:r>
-              <w:rPr>
-                <w:rFonts w:cs="Carlito"/>
-                <w:sz w:val="18"/>
-              </w:rPr>
-              <w:t>Perubahan pada salinan ikut mengubah data asli</w:t>
+            <w:proofErr w:type="spellStart"/>
+            <w:r>
+              <w:rPr>
+                <w:rFonts w:cs="Carlito"/>
+                <w:sz w:val="18"/>
+              </w:rPr>
+              <w:t>Perubahan</w:t>
+            </w:r>
+            <w:proofErr w:type="spellEnd"/>
+            <w:r>
+              <w:rPr>
+                <w:rFonts w:cs="Carlito"/>
+                <w:sz w:val="18"/>
+              </w:rPr>
+              <w:t xml:space="preserve"> pada </w:t>
+            </w:r>
+            <w:proofErr w:type="spellStart"/>
+            <w:r>
+              <w:rPr>
+                <w:rFonts w:cs="Carlito"/>
+                <w:sz w:val="18"/>
+              </w:rPr>
+              <w:t>salinan</w:t>
+            </w:r>
+            <w:proofErr w:type="spellEnd"/>
+            <w:r>
+              <w:rPr>
+                <w:rFonts w:cs="Carlito"/>
+                <w:sz w:val="18"/>
+              </w:rPr>
+              <w:t xml:space="preserve"> </w:t>
+            </w:r>
+            <w:proofErr w:type="spellStart"/>
+            <w:r>
+              <w:rPr>
+                <w:rFonts w:cs="Carlito"/>
+                <w:sz w:val="18"/>
+              </w:rPr>
+              <w:t>ikut</w:t>
+            </w:r>
+            <w:proofErr w:type="spellEnd"/>
+            <w:r>
+              <w:rPr>
+                <w:rFonts w:cs="Carlito"/>
+                <w:sz w:val="18"/>
+              </w:rPr>
+              <w:t xml:space="preserve"> mengubah data asli</w:t>
             </w:r>
           </w:p>
         </w:tc>
@@ -17185,7 +19454,23 @@
                 <w:rFonts w:cs="Carlito"/>
                 <w:sz w:val="18"/>
               </w:rPr>
-              <w:t>Setiap kali selesai satu lembar</w:t>
+              <w:t xml:space="preserve">Setiap kali selesai </w:t>
+            </w:r>
+            <w:proofErr w:type="spellStart"/>
+            <w:r>
+              <w:rPr>
+                <w:rFonts w:cs="Carlito"/>
+                <w:sz w:val="18"/>
+              </w:rPr>
+              <w:t>satu</w:t>
+            </w:r>
+            <w:proofErr w:type="spellEnd"/>
+            <w:r>
+              <w:rPr>
+                <w:rFonts w:cs="Carlito"/>
+                <w:sz w:val="18"/>
+              </w:rPr>
+              <w:t xml:space="preserve"> lembar</w:t>
             </w:r>
           </w:p>
         </w:tc>
@@ -17481,8 +19766,19 @@
                 <w:color w:val="FFFFFF"/>
                 <w:sz w:val="19"/>
               </w:rPr>
-              <w:t>Kalau ini terjadi</w:t>
-            </w:r>
+              <w:t xml:space="preserve">Kalau ini </w:t>
+            </w:r>
+            <w:proofErr w:type="spellStart"/>
+            <w:r>
+              <w:rPr>
+                <w:rFonts w:cs="Carlito"/>
+                <w:b/>
+                <w:color w:val="FFFFFF"/>
+                <w:sz w:val="19"/>
+              </w:rPr>
+              <w:t>terjadi</w:t>
+            </w:r>
+            <w:proofErr w:type="spellEnd"/>
           </w:p>
         </w:tc>
         <w:tc>
@@ -17774,7 +20070,43 @@
         <w:color w:val="5A6080"/>
         <w:sz w:val="15"/>
       </w:rPr>
-      <w:t>PABW 2026/2027  ·  Pertemuan 9  ·  DOM, Event, dan Interaktivitas  ·  Universitas Islam Indonesia  ·  halaman</w:t>
+      <w:t xml:space="preserve">PABW 2026/2027  ·  </w:t>
+    </w:r>
+    <w:proofErr w:type="spellStart"/>
+    <w:r>
+      <w:rPr>
+        <w:rFonts w:cs="Carlito"/>
+        <w:color w:val="5A6080"/>
+        <w:sz w:val="15"/>
+      </w:rPr>
+      <w:t>Pertemuan</w:t>
+    </w:r>
+    <w:proofErr w:type="spellEnd"/>
+    <w:r>
+      <w:rPr>
+        <w:rFonts w:cs="Carlito"/>
+        <w:color w:val="5A6080"/>
+        <w:sz w:val="15"/>
+      </w:rPr>
+      <w:t xml:space="preserve"> 9  ·  DOM, Event, dan </w:t>
+    </w:r>
+    <w:proofErr w:type="spellStart"/>
+    <w:r>
+      <w:rPr>
+        <w:rFonts w:cs="Carlito"/>
+        <w:color w:val="5A6080"/>
+        <w:sz w:val="15"/>
+      </w:rPr>
+      <w:t>Interaktivitas</w:t>
+    </w:r>
+    <w:proofErr w:type="spellEnd"/>
+    <w:r>
+      <w:rPr>
+        <w:rFonts w:cs="Carlito"/>
+        <w:color w:val="5A6080"/>
+        <w:sz w:val="15"/>
+      </w:rPr>
+      <w:t xml:space="preserve">  ·  Universitas Islam Indonesia  ·  halaman</w:t>
     </w:r>
     <w:r>
       <w:fldChar w:fldCharType="begin"/>

</xml_diff>

<commit_message>
P9 — gejala dibaca, bukan ditebak
</commit_message>
<xml_diff>
--- a/9. Worksheet_PABW_Pertemuan9 - ID.docx
+++ b/9. Worksheet_PABW_Pertemuan9 - ID.docx
@@ -126,47 +126,7 @@
           <w:color w:val="5A6080"/>
           <w:sz w:val="18"/>
         </w:rPr>
-        <w:t xml:space="preserve">Pengembangan </w:t>
-      </w:r>
-      <w:proofErr w:type="spellStart"/>
-      <w:r>
-        <w:rPr>
-          <w:rFonts w:cs="Carlito"/>
-          <w:i/>
-          <w:color w:val="5A6080"/>
-          <w:sz w:val="18"/>
-        </w:rPr>
-        <w:t>Aplikasi</w:t>
-      </w:r>
-      <w:proofErr w:type="spellEnd"/>
-      <w:r>
-        <w:rPr>
-          <w:rFonts w:cs="Carlito"/>
-          <w:i/>
-          <w:color w:val="5A6080"/>
-          <w:sz w:val="18"/>
-        </w:rPr>
-        <w:t xml:space="preserve"> </w:t>
-      </w:r>
-      <w:proofErr w:type="spellStart"/>
-      <w:r>
-        <w:rPr>
-          <w:rFonts w:cs="Carlito"/>
-          <w:i/>
-          <w:color w:val="5A6080"/>
-          <w:sz w:val="18"/>
-        </w:rPr>
-        <w:t>Berbasis</w:t>
-      </w:r>
-      <w:proofErr w:type="spellEnd"/>
-      <w:r>
-        <w:rPr>
-          <w:rFonts w:cs="Carlito"/>
-          <w:i/>
-          <w:color w:val="5A6080"/>
-          <w:sz w:val="18"/>
-        </w:rPr>
-        <w:t xml:space="preserve"> Web  ·  SIF302  ·  Semester Gasal 2026/2027</w:t>
+        <w:t>Pengembangan Aplikasi Berbasis Web  ·  SIF302  ·  Semester Gasal 2026/2027</w:t>
       </w:r>
     </w:p>
     <w:tbl>
@@ -447,7 +407,6 @@
             <w:pPr>
               <w:spacing w:before="20" w:after="20"/>
             </w:pPr>
-            <w:proofErr w:type="spellStart"/>
             <w:r>
               <w:rPr>
                 <w:rFonts w:cs="Carlito"/>
@@ -455,29 +414,8 @@
                 <w:color w:val="FFFFFF"/>
                 <w:sz w:val="19"/>
               </w:rPr>
-              <w:t>Capaian</w:t>
-            </w:r>
-            <w:proofErr w:type="spellEnd"/>
-            <w:r>
-              <w:rPr>
-                <w:rFonts w:cs="Carlito"/>
-                <w:b/>
-                <w:color w:val="FFFFFF"/>
-                <w:sz w:val="19"/>
-              </w:rPr>
-              <w:t xml:space="preserve"> </w:t>
-            </w:r>
-            <w:proofErr w:type="spellStart"/>
-            <w:r>
-              <w:rPr>
-                <w:rFonts w:cs="Carlito"/>
-                <w:b/>
-                <w:color w:val="FFFFFF"/>
-                <w:sz w:val="19"/>
-              </w:rPr>
-              <w:t>pembelajaran</w:t>
-            </w:r>
-            <w:proofErr w:type="spellEnd"/>
+              <w:t>Capaian pembelajaran</w:t>
+            </w:r>
           </w:p>
         </w:tc>
         <w:tc>
@@ -1631,39 +1569,7 @@
                 <w:rFonts w:cs="Carlito"/>
                 <w:sz w:val="18"/>
               </w:rPr>
-              <w:t xml:space="preserve">Tiga </w:t>
-            </w:r>
-            <w:proofErr w:type="spellStart"/>
-            <w:r>
-              <w:rPr>
-                <w:rFonts w:cs="Carlito"/>
-                <w:sz w:val="18"/>
-              </w:rPr>
-              <w:t>kasus</w:t>
-            </w:r>
-            <w:proofErr w:type="spellEnd"/>
-            <w:r>
-              <w:rPr>
-                <w:rFonts w:cs="Carlito"/>
-                <w:sz w:val="18"/>
-              </w:rPr>
-              <w:t xml:space="preserve"> </w:t>
-            </w:r>
-            <w:proofErr w:type="spellStart"/>
-            <w:r>
-              <w:rPr>
-                <w:rFonts w:cs="Carlito"/>
-                <w:sz w:val="18"/>
-              </w:rPr>
-              <w:t>ditangani</w:t>
-            </w:r>
-            <w:proofErr w:type="spellEnd"/>
-            <w:r>
-              <w:rPr>
-                <w:rFonts w:cs="Carlito"/>
-                <w:sz w:val="18"/>
-              </w:rPr>
-              <w:t xml:space="preserve"> + tangkapan layar</w:t>
+              <w:t>Tiga kasus ditangani + tangkapan layar</w:t>
             </w:r>
           </w:p>
         </w:tc>
@@ -2009,37 +1915,12 @@
           <w:lang w:val="de-DE"/>
         </w:rPr>
       </w:pPr>
-      <w:proofErr w:type="spellStart"/>
       <w:r>
         <w:rPr>
           <w:rFonts w:cs="Carlito"/>
           <w:sz w:val="20"/>
         </w:rPr>
-        <w:t>Sampai</w:t>
-      </w:r>
-      <w:proofErr w:type="spellEnd"/>
-      <w:r>
-        <w:rPr>
-          <w:rFonts w:cs="Carlito"/>
-          <w:sz w:val="20"/>
-        </w:rPr>
-        <w:t xml:space="preserve"> </w:t>
-      </w:r>
-      <w:proofErr w:type="spellStart"/>
-      <w:r>
-        <w:rPr>
-          <w:rFonts w:cs="Carlito"/>
-          <w:sz w:val="20"/>
-        </w:rPr>
-        <w:t>Pertemuan</w:t>
-      </w:r>
-      <w:proofErr w:type="spellEnd"/>
-      <w:r>
-        <w:rPr>
-          <w:rFonts w:cs="Carlito"/>
-          <w:sz w:val="20"/>
-        </w:rPr>
-        <w:t xml:space="preserve"> 8 data Anda sudah tersusun, tetapi hanya terlihat di Console. </w:t>
+        <w:t xml:space="preserve">Sampai Pertemuan 8 data Anda sudah tersusun, tetapi hanya terlihat di Console. </w:t>
       </w:r>
       <w:r>
         <w:rPr>
@@ -2085,69 +1966,12 @@
         </w:rPr>
         <w:t xml:space="preserve">Buka halaman Anda, klik kanan pada satu bagian, lalu pilih Inspect. Panel Elements menampilkan halaman sebagai pohon bersarang. Bentuk yang terlihat di situ adalah bentuk yang dipegang JavaScript — bukan berkas HTML yang Anda tulis. </w:t>
       </w:r>
-      <w:proofErr w:type="spellStart"/>
       <w:r>
         <w:rPr>
           <w:rFonts w:cs="Carlito"/>
           <w:sz w:val="20"/>
         </w:rPr>
-        <w:t>Sebelum</w:t>
-      </w:r>
-      <w:proofErr w:type="spellEnd"/>
-      <w:r>
-        <w:rPr>
-          <w:rFonts w:cs="Carlito"/>
-          <w:sz w:val="20"/>
-        </w:rPr>
-        <w:t xml:space="preserve"> </w:t>
-      </w:r>
-      <w:proofErr w:type="spellStart"/>
-      <w:r>
-        <w:rPr>
-          <w:rFonts w:cs="Carlito"/>
-          <w:sz w:val="20"/>
-        </w:rPr>
-        <w:t>menulis</w:t>
-      </w:r>
-      <w:proofErr w:type="spellEnd"/>
-      <w:r>
-        <w:rPr>
-          <w:rFonts w:cs="Carlito"/>
-          <w:sz w:val="20"/>
-        </w:rPr>
-        <w:t xml:space="preserve"> </w:t>
-      </w:r>
-      <w:proofErr w:type="spellStart"/>
-      <w:r>
-        <w:rPr>
-          <w:rFonts w:cs="Carlito"/>
-          <w:sz w:val="20"/>
-        </w:rPr>
-        <w:t>pemilih</w:t>
-      </w:r>
-      <w:proofErr w:type="spellEnd"/>
-      <w:r>
-        <w:rPr>
-          <w:rFonts w:cs="Carlito"/>
-          <w:sz w:val="20"/>
-        </w:rPr>
-        <w:t xml:space="preserve">, </w:t>
-      </w:r>
-      <w:proofErr w:type="spellStart"/>
-      <w:r>
-        <w:rPr>
-          <w:rFonts w:cs="Carlito"/>
-          <w:sz w:val="20"/>
-        </w:rPr>
-        <w:t>pastikan</w:t>
-      </w:r>
-      <w:proofErr w:type="spellEnd"/>
-      <w:r>
-        <w:rPr>
-          <w:rFonts w:cs="Carlito"/>
-          <w:sz w:val="20"/>
-        </w:rPr>
-        <w:t xml:space="preserve"> nama id atau kelasnya ada di panel itu.</w:t>
+        <w:t>Sebelum menulis pemilih, pastikan nama id atau kelasnya ada di panel itu.</w:t>
       </w:r>
     </w:p>
     <w:tbl>
@@ -2347,21 +2171,12 @@
             <w:pPr>
               <w:spacing w:before="20" w:after="20" w:line="252" w:lineRule="auto"/>
             </w:pPr>
-            <w:proofErr w:type="spellStart"/>
-            <w:r>
-              <w:rPr>
-                <w:rFonts w:cs="Carlito"/>
-                <w:sz w:val="18"/>
-              </w:rPr>
-              <w:t>querySelectorAll</w:t>
-            </w:r>
-            <w:proofErr w:type="spellEnd"/>
-            <w:r>
-              <w:rPr>
-                <w:rFonts w:cs="Carlito"/>
-                <w:sz w:val="18"/>
-              </w:rPr>
-              <w:t>(".filter")</w:t>
+            <w:r>
+              <w:rPr>
+                <w:rFonts w:cs="Carlito"/>
+                <w:sz w:val="18"/>
+              </w:rPr>
+              <w:t>querySelectorAll(".filter")</w:t>
             </w:r>
           </w:p>
         </w:tc>
@@ -2436,21 +2251,12 @@
             <w:pPr>
               <w:spacing w:before="20" w:after="20" w:line="252" w:lineRule="auto"/>
             </w:pPr>
-            <w:proofErr w:type="spellStart"/>
-            <w:r>
-              <w:rPr>
-                <w:rFonts w:cs="Carlito"/>
-                <w:sz w:val="18"/>
-              </w:rPr>
-              <w:t>elemen.closest</w:t>
-            </w:r>
-            <w:proofErr w:type="spellEnd"/>
-            <w:r>
-              <w:rPr>
-                <w:rFonts w:cs="Carlito"/>
-                <w:sz w:val="18"/>
-              </w:rPr>
-              <w:t>("button")</w:t>
+            <w:r>
+              <w:rPr>
+                <w:rFonts w:cs="Carlito"/>
+                <w:sz w:val="18"/>
+              </w:rPr>
+              <w:t>elemen.closest("button")</w:t>
             </w:r>
           </w:p>
         </w:tc>
@@ -2525,37 +2331,12 @@
             <w:pPr>
               <w:spacing w:before="20" w:after="20" w:line="252" w:lineRule="auto"/>
             </w:pPr>
-            <w:proofErr w:type="spellStart"/>
-            <w:r>
-              <w:rPr>
-                <w:rFonts w:cs="Carlito"/>
-                <w:sz w:val="18"/>
-              </w:rPr>
-              <w:t>Array.from</w:t>
-            </w:r>
-            <w:proofErr w:type="spellEnd"/>
-            <w:r>
-              <w:rPr>
-                <w:rFonts w:cs="Carlito"/>
-                <w:sz w:val="18"/>
-              </w:rPr>
-              <w:t>(</w:t>
-            </w:r>
-            <w:proofErr w:type="spellStart"/>
-            <w:r>
-              <w:rPr>
-                <w:rFonts w:cs="Carlito"/>
-                <w:sz w:val="18"/>
-              </w:rPr>
-              <w:t>hasil</w:t>
-            </w:r>
-            <w:proofErr w:type="spellEnd"/>
-            <w:r>
-              <w:rPr>
-                <w:rFonts w:cs="Carlito"/>
-                <w:sz w:val="18"/>
-              </w:rPr>
-              <w:t>)</w:t>
+            <w:r>
+              <w:rPr>
+                <w:rFonts w:cs="Carlito"/>
+                <w:sz w:val="18"/>
+              </w:rPr>
+              <w:t>Array.from(hasil)</w:t>
             </w:r>
           </w:p>
         </w:tc>
@@ -2797,19 +2578,8 @@
                 <w:color w:val="FFFFFF"/>
                 <w:sz w:val="18"/>
               </w:rPr>
-              <w:t xml:space="preserve">Bagian </w:t>
-            </w:r>
-            <w:proofErr w:type="spellStart"/>
-            <w:r>
-              <w:rPr>
-                <w:rFonts w:cs="Carlito"/>
-                <w:b/>
-                <w:color w:val="FFFFFF"/>
-                <w:sz w:val="18"/>
-              </w:rPr>
-              <w:t>halaman</w:t>
-            </w:r>
-            <w:proofErr w:type="spellEnd"/>
+              <w:t>Bagian halaman</w:t>
+            </w:r>
           </w:p>
         </w:tc>
         <w:tc>
@@ -2827,7 +2597,6 @@
             <w:pPr>
               <w:spacing w:before="20" w:after="20"/>
             </w:pPr>
-            <w:proofErr w:type="spellStart"/>
             <w:r>
               <w:rPr>
                 <w:rFonts w:cs="Carlito"/>
@@ -2835,49 +2604,8 @@
                 <w:color w:val="FFFFFF"/>
                 <w:sz w:val="18"/>
               </w:rPr>
-              <w:t>Pemilih</w:t>
-            </w:r>
-            <w:proofErr w:type="spellEnd"/>
-            <w:r>
-              <w:rPr>
-                <w:rFonts w:cs="Carlito"/>
-                <w:b/>
-                <w:color w:val="FFFFFF"/>
-                <w:sz w:val="18"/>
-              </w:rPr>
-              <w:t xml:space="preserve"> yang </w:t>
-            </w:r>
-            <w:proofErr w:type="spellStart"/>
-            <w:r>
-              <w:rPr>
-                <w:rFonts w:cs="Carlito"/>
-                <w:b/>
-                <w:color w:val="FFFFFF"/>
-                <w:sz w:val="18"/>
-              </w:rPr>
-              <w:t>saya</w:t>
-            </w:r>
-            <w:proofErr w:type="spellEnd"/>
-            <w:r>
-              <w:rPr>
-                <w:rFonts w:cs="Carlito"/>
-                <w:b/>
-                <w:color w:val="FFFFFF"/>
-                <w:sz w:val="18"/>
-              </w:rPr>
-              <w:t xml:space="preserve"> </w:t>
-            </w:r>
-            <w:proofErr w:type="spellStart"/>
-            <w:r>
-              <w:rPr>
-                <w:rFonts w:cs="Carlito"/>
-                <w:b/>
-                <w:color w:val="FFFFFF"/>
-                <w:sz w:val="18"/>
-              </w:rPr>
-              <w:t>pakai</w:t>
-            </w:r>
-            <w:proofErr w:type="spellEnd"/>
+              <w:t>Pemilih yang saya pakai</w:t>
+            </w:r>
           </w:p>
         </w:tc>
         <w:tc>
@@ -2895,7 +2623,6 @@
             <w:pPr>
               <w:spacing w:before="20" w:after="20"/>
             </w:pPr>
-            <w:proofErr w:type="spellStart"/>
             <w:r>
               <w:rPr>
                 <w:rFonts w:cs="Carlito"/>
@@ -2903,29 +2630,8 @@
                 <w:color w:val="FFFFFF"/>
                 <w:sz w:val="18"/>
               </w:rPr>
-              <w:t>Diisi</w:t>
-            </w:r>
-            <w:proofErr w:type="spellEnd"/>
-            <w:r>
-              <w:rPr>
-                <w:rFonts w:cs="Carlito"/>
-                <w:b/>
-                <w:color w:val="FFFFFF"/>
-                <w:sz w:val="18"/>
-              </w:rPr>
-              <w:t xml:space="preserve"> </w:t>
-            </w:r>
-            <w:proofErr w:type="spellStart"/>
-            <w:r>
-              <w:rPr>
-                <w:rFonts w:cs="Carlito"/>
-                <w:b/>
-                <w:color w:val="FFFFFF"/>
-                <w:sz w:val="18"/>
-              </w:rPr>
-              <w:t>apa</w:t>
-            </w:r>
-            <w:proofErr w:type="spellEnd"/>
+              <w:t>Diisi apa</w:t>
+            </w:r>
           </w:p>
         </w:tc>
         <w:tc>
@@ -2950,19 +2656,8 @@
                 <w:color w:val="FFFFFF"/>
                 <w:sz w:val="18"/>
               </w:rPr>
-              <w:t xml:space="preserve">Nama </w:t>
-            </w:r>
-            <w:proofErr w:type="spellStart"/>
-            <w:r>
-              <w:rPr>
-                <w:rFonts w:cs="Carlito"/>
-                <w:b/>
-                <w:color w:val="FFFFFF"/>
-                <w:sz w:val="18"/>
-              </w:rPr>
-              <w:t>variabel</w:t>
-            </w:r>
-            <w:proofErr w:type="spellEnd"/>
+              <w:t>Nama variabel</w:t>
+            </w:r>
           </w:p>
         </w:tc>
       </w:tr>
@@ -2991,17 +2686,8 @@
                 <w:rFonts w:cs="Carlito"/>
                 <w:sz w:val="18"/>
               </w:rPr>
-              <w:t xml:space="preserve">Daftar </w:t>
-            </w:r>
-            <w:proofErr w:type="spellStart"/>
-            <w:r>
-              <w:rPr>
-                <w:rFonts w:cs="Carlito"/>
-                <w:sz w:val="18"/>
-              </w:rPr>
-              <w:t>proyek</w:t>
-            </w:r>
-            <w:proofErr w:type="spellEnd"/>
+              <w:t>Daftar proyek</w:t>
+            </w:r>
           </w:p>
         </w:tc>
         <w:tc>
@@ -3054,62 +2740,35 @@
                 <w:sz w:val="20"/>
                 <w:szCs w:val="20"/>
               </w:rPr>
-              <w:t xml:space="preserve">Wadah </w:t>
-            </w:r>
-            <w:proofErr w:type="spellStart"/>
-            <w:r>
+              <w:t>Wadah kartu proyek</w:t>
+            </w:r>
+          </w:p>
+        </w:tc>
+        <w:tc>
+          <w:tcPr>
+            <w:tcW w:w="2238" w:type="dxa"/>
+            <w:tcBorders>
+              <w:top w:val="single" w:sz="6" w:space="0" w:color="D8DEE9"/>
+              <w:left w:val="single" w:sz="6" w:space="0" w:color="D8DEE9"/>
+              <w:bottom w:val="single" w:sz="6" w:space="0" w:color="D8DEE9"/>
+              <w:right w:val="single" w:sz="6" w:space="0" w:color="D8DEE9"/>
+            </w:tcBorders>
+          </w:tcPr>
+          <w:p>
+            <w:pPr>
+              <w:spacing w:before="20" w:after="20" w:line="252" w:lineRule="auto"/>
               <w:rPr>
                 <w:sz w:val="20"/>
                 <w:szCs w:val="20"/>
               </w:rPr>
-              <w:t>kartu</w:t>
-            </w:r>
-            <w:proofErr w:type="spellEnd"/>
+            </w:pPr>
             <w:r>
               <w:rPr>
                 <w:sz w:val="20"/>
                 <w:szCs w:val="20"/>
               </w:rPr>
-              <w:t xml:space="preserve"> </w:t>
-            </w:r>
-            <w:proofErr w:type="spellStart"/>
-            <w:r>
-              <w:rPr>
-                <w:sz w:val="20"/>
-                <w:szCs w:val="20"/>
-              </w:rPr>
-              <w:t>proyek</w:t>
-            </w:r>
-            <w:proofErr w:type="spellEnd"/>
-          </w:p>
-        </w:tc>
-        <w:tc>
-          <w:tcPr>
-            <w:tcW w:w="2238" w:type="dxa"/>
-            <w:tcBorders>
-              <w:top w:val="single" w:sz="6" w:space="0" w:color="D8DEE9"/>
-              <w:left w:val="single" w:sz="6" w:space="0" w:color="D8DEE9"/>
-              <w:bottom w:val="single" w:sz="6" w:space="0" w:color="D8DEE9"/>
-              <w:right w:val="single" w:sz="6" w:space="0" w:color="D8DEE9"/>
-            </w:tcBorders>
-          </w:tcPr>
-          <w:p>
-            <w:pPr>
-              <w:spacing w:before="20" w:after="20" w:line="252" w:lineRule="auto"/>
-              <w:rPr>
-                <w:sz w:val="20"/>
-                <w:szCs w:val="20"/>
-              </w:rPr>
-            </w:pPr>
-            <w:proofErr w:type="spellStart"/>
-            <w:r>
-              <w:rPr>
-                <w:sz w:val="20"/>
-                <w:szCs w:val="20"/>
-              </w:rPr>
               <w:t>daftarProyekEl</w:t>
             </w:r>
-            <w:proofErr w:type="spellEnd"/>
           </w:p>
         </w:tc>
       </w:tr>
@@ -3203,76 +2862,40 @@
                 <w:szCs w:val="20"/>
               </w:rPr>
             </w:pPr>
-            <w:proofErr w:type="spellStart"/>
             <w:r>
               <w:rPr>
                 <w:sz w:val="20"/>
                 <w:szCs w:val="20"/>
               </w:rPr>
-              <w:t>Tombol</w:t>
-            </w:r>
-            <w:proofErr w:type="spellEnd"/>
-            <w:r>
+              <w:t>Tombol filter kategori proyek</w:t>
+            </w:r>
+          </w:p>
+        </w:tc>
+        <w:tc>
+          <w:tcPr>
+            <w:tcW w:w="2238" w:type="dxa"/>
+            <w:tcBorders>
+              <w:top w:val="single" w:sz="6" w:space="0" w:color="D8DEE9"/>
+              <w:left w:val="single" w:sz="6" w:space="0" w:color="D8DEE9"/>
+              <w:bottom w:val="single" w:sz="6" w:space="0" w:color="D8DEE9"/>
+              <w:right w:val="single" w:sz="6" w:space="0" w:color="D8DEE9"/>
+            </w:tcBorders>
+          </w:tcPr>
+          <w:p>
+            <w:pPr>
+              <w:spacing w:before="20" w:after="20" w:line="252" w:lineRule="auto"/>
               <w:rPr>
                 <w:sz w:val="20"/>
                 <w:szCs w:val="20"/>
               </w:rPr>
-              <w:t xml:space="preserve"> filter </w:t>
-            </w:r>
-            <w:proofErr w:type="spellStart"/>
+            </w:pPr>
             <w:r>
               <w:rPr>
                 <w:sz w:val="20"/>
                 <w:szCs w:val="20"/>
               </w:rPr>
-              <w:t>kategori</w:t>
-            </w:r>
-            <w:proofErr w:type="spellEnd"/>
-            <w:r>
-              <w:rPr>
-                <w:sz w:val="20"/>
-                <w:szCs w:val="20"/>
-              </w:rPr>
-              <w:t xml:space="preserve"> </w:t>
-            </w:r>
-            <w:proofErr w:type="spellStart"/>
-            <w:r>
-              <w:rPr>
-                <w:sz w:val="20"/>
-                <w:szCs w:val="20"/>
-              </w:rPr>
-              <w:t>proyek</w:t>
-            </w:r>
-            <w:proofErr w:type="spellEnd"/>
-          </w:p>
-        </w:tc>
-        <w:tc>
-          <w:tcPr>
-            <w:tcW w:w="2238" w:type="dxa"/>
-            <w:tcBorders>
-              <w:top w:val="single" w:sz="6" w:space="0" w:color="D8DEE9"/>
-              <w:left w:val="single" w:sz="6" w:space="0" w:color="D8DEE9"/>
-              <w:bottom w:val="single" w:sz="6" w:space="0" w:color="D8DEE9"/>
-              <w:right w:val="single" w:sz="6" w:space="0" w:color="D8DEE9"/>
-            </w:tcBorders>
-          </w:tcPr>
-          <w:p>
-            <w:pPr>
-              <w:spacing w:before="20" w:after="20" w:line="252" w:lineRule="auto"/>
-              <w:rPr>
-                <w:sz w:val="20"/>
-                <w:szCs w:val="20"/>
-              </w:rPr>
-            </w:pPr>
-            <w:proofErr w:type="spellStart"/>
-            <w:r>
-              <w:rPr>
-                <w:sz w:val="20"/>
-                <w:szCs w:val="20"/>
-              </w:rPr>
               <w:t>tombolFilter</w:t>
             </w:r>
-            <w:proofErr w:type="spellEnd"/>
           </w:p>
         </w:tc>
       </w:tr>
@@ -3350,108 +2973,40 @@
                 <w:szCs w:val="20"/>
               </w:rPr>
             </w:pPr>
-            <w:proofErr w:type="spellStart"/>
             <w:r>
               <w:rPr>
                 <w:sz w:val="20"/>
                 <w:szCs w:val="20"/>
               </w:rPr>
-              <w:t>Pesan</w:t>
-            </w:r>
-            <w:proofErr w:type="spellEnd"/>
-            <w:r>
+              <w:t>Pesan saat tidak ada proyek yang cocok</w:t>
+            </w:r>
+          </w:p>
+        </w:tc>
+        <w:tc>
+          <w:tcPr>
+            <w:tcW w:w="2238" w:type="dxa"/>
+            <w:tcBorders>
+              <w:top w:val="single" w:sz="6" w:space="0" w:color="D8DEE9"/>
+              <w:left w:val="single" w:sz="6" w:space="0" w:color="D8DEE9"/>
+              <w:bottom w:val="single" w:sz="6" w:space="0" w:color="D8DEE9"/>
+              <w:right w:val="single" w:sz="6" w:space="0" w:color="D8DEE9"/>
+            </w:tcBorders>
+          </w:tcPr>
+          <w:p>
+            <w:pPr>
+              <w:spacing w:before="20" w:after="20" w:line="252" w:lineRule="auto"/>
               <w:rPr>
                 <w:sz w:val="20"/>
                 <w:szCs w:val="20"/>
               </w:rPr>
-              <w:t xml:space="preserve"> saat </w:t>
-            </w:r>
-            <w:proofErr w:type="spellStart"/>
+            </w:pPr>
             <w:r>
               <w:rPr>
                 <w:sz w:val="20"/>
                 <w:szCs w:val="20"/>
               </w:rPr>
-              <w:t>tidak</w:t>
-            </w:r>
-            <w:proofErr w:type="spellEnd"/>
-            <w:r>
-              <w:rPr>
-                <w:sz w:val="20"/>
-                <w:szCs w:val="20"/>
-              </w:rPr>
-              <w:t xml:space="preserve"> </w:t>
-            </w:r>
-            <w:proofErr w:type="spellStart"/>
-            <w:r>
-              <w:rPr>
-                <w:sz w:val="20"/>
-                <w:szCs w:val="20"/>
-              </w:rPr>
-              <w:t>ada</w:t>
-            </w:r>
-            <w:proofErr w:type="spellEnd"/>
-            <w:r>
-              <w:rPr>
-                <w:sz w:val="20"/>
-                <w:szCs w:val="20"/>
-              </w:rPr>
-              <w:t xml:space="preserve"> </w:t>
-            </w:r>
-            <w:proofErr w:type="spellStart"/>
-            <w:r>
-              <w:rPr>
-                <w:sz w:val="20"/>
-                <w:szCs w:val="20"/>
-              </w:rPr>
-              <w:t>proyek</w:t>
-            </w:r>
-            <w:proofErr w:type="spellEnd"/>
-            <w:r>
-              <w:rPr>
-                <w:sz w:val="20"/>
-                <w:szCs w:val="20"/>
-              </w:rPr>
-              <w:t xml:space="preserve"> yang </w:t>
-            </w:r>
-            <w:proofErr w:type="spellStart"/>
-            <w:r>
-              <w:rPr>
-                <w:sz w:val="20"/>
-                <w:szCs w:val="20"/>
-              </w:rPr>
-              <w:t>cocok</w:t>
-            </w:r>
-            <w:proofErr w:type="spellEnd"/>
-          </w:p>
-        </w:tc>
-        <w:tc>
-          <w:tcPr>
-            <w:tcW w:w="2238" w:type="dxa"/>
-            <w:tcBorders>
-              <w:top w:val="single" w:sz="6" w:space="0" w:color="D8DEE9"/>
-              <w:left w:val="single" w:sz="6" w:space="0" w:color="D8DEE9"/>
-              <w:bottom w:val="single" w:sz="6" w:space="0" w:color="D8DEE9"/>
-              <w:right w:val="single" w:sz="6" w:space="0" w:color="D8DEE9"/>
-            </w:tcBorders>
-          </w:tcPr>
-          <w:p>
-            <w:pPr>
-              <w:spacing w:before="20" w:after="20" w:line="252" w:lineRule="auto"/>
-              <w:rPr>
-                <w:sz w:val="20"/>
-                <w:szCs w:val="20"/>
-              </w:rPr>
-            </w:pPr>
-            <w:proofErr w:type="spellStart"/>
-            <w:r>
-              <w:rPr>
-                <w:sz w:val="20"/>
-                <w:szCs w:val="20"/>
-              </w:rPr>
               <w:t>pesanKosongEl</w:t>
             </w:r>
-            <w:proofErr w:type="spellEnd"/>
           </w:p>
         </w:tc>
       </w:tr>
@@ -3598,33 +3153,33 @@
                 <w:sz w:val="20"/>
                 <w:szCs w:val="20"/>
               </w:rPr>
-              <w:t xml:space="preserve">Form </w:t>
-            </w:r>
-            <w:proofErr w:type="spellStart"/>
-            <w:r>
+              <w:t>Form untuk diisi</w:t>
+            </w:r>
+          </w:p>
+          <w:p>
+            <w:pPr>
+              <w:spacing w:before="20" w:after="20" w:line="252" w:lineRule="auto"/>
               <w:rPr>
                 <w:sz w:val="20"/>
                 <w:szCs w:val="20"/>
               </w:rPr>
-              <w:t>untuk</w:t>
-            </w:r>
-            <w:proofErr w:type="spellEnd"/>
-            <w:r>
+            </w:pPr>
+          </w:p>
+          <w:p>
+            <w:pPr>
+              <w:spacing w:before="20" w:after="20" w:line="252" w:lineRule="auto"/>
               <w:rPr>
                 <w:sz w:val="20"/>
                 <w:szCs w:val="20"/>
               </w:rPr>
-              <w:t xml:space="preserve"> </w:t>
-            </w:r>
-            <w:proofErr w:type="spellStart"/>
+            </w:pPr>
             <w:r>
               <w:rPr>
                 <w:sz w:val="20"/>
                 <w:szCs w:val="20"/>
               </w:rPr>
-              <w:t>diisi</w:t>
-            </w:r>
-            <w:proofErr w:type="spellEnd"/>
+              <w:t>Input nama sertifikasi</w:t>
+            </w:r>
           </w:p>
           <w:p>
             <w:pPr>
@@ -3634,32 +3189,41 @@
                 <w:szCs w:val="20"/>
               </w:rPr>
             </w:pPr>
-          </w:p>
-          <w:p>
-            <w:pPr>
-              <w:spacing w:before="20" w:after="20" w:line="252" w:lineRule="auto"/>
+            <w:r>
               <w:rPr>
                 <w:sz w:val="20"/>
                 <w:szCs w:val="20"/>
               </w:rPr>
-            </w:pPr>
-            <w:r>
+              <w:t>Input tanggal sertifikasi</w:t>
+            </w:r>
+          </w:p>
+          <w:p>
+            <w:pPr>
+              <w:spacing w:before="20" w:after="20" w:line="252" w:lineRule="auto"/>
               <w:rPr>
                 <w:sz w:val="20"/>
                 <w:szCs w:val="20"/>
               </w:rPr>
-              <w:t xml:space="preserve">Input nama </w:t>
-            </w:r>
-            <w:proofErr w:type="spellStart"/>
+            </w:pPr>
             <w:r>
               <w:rPr>
                 <w:sz w:val="20"/>
                 <w:szCs w:val="20"/>
               </w:rPr>
-              <w:t>sertifikasi</w:t>
-            </w:r>
-            <w:proofErr w:type="spellEnd"/>
-          </w:p>
+              <w:t>Input deskripsi sertifikasi</w:t>
+            </w:r>
+          </w:p>
+        </w:tc>
+        <w:tc>
+          <w:tcPr>
+            <w:tcW w:w="2238" w:type="dxa"/>
+            <w:tcBorders>
+              <w:top w:val="single" w:sz="6" w:space="0" w:color="D8DEE9"/>
+              <w:left w:val="single" w:sz="6" w:space="0" w:color="D8DEE9"/>
+              <w:bottom w:val="single" w:sz="6" w:space="0" w:color="D8DEE9"/>
+              <w:right w:val="single" w:sz="6" w:space="0" w:color="D8DEE9"/>
+            </w:tcBorders>
+          </w:tcPr>
           <w:p>
             <w:pPr>
               <w:spacing w:before="20" w:after="20" w:line="252" w:lineRule="auto"/>
@@ -3673,33 +3237,33 @@
                 <w:sz w:val="20"/>
                 <w:szCs w:val="20"/>
               </w:rPr>
-              <w:t xml:space="preserve">Input </w:t>
-            </w:r>
-            <w:proofErr w:type="spellStart"/>
-            <w:r>
+              <w:t>formSertifikasi</w:t>
+            </w:r>
+          </w:p>
+          <w:p>
+            <w:pPr>
+              <w:spacing w:before="20" w:after="20" w:line="252" w:lineRule="auto"/>
               <w:rPr>
                 <w:sz w:val="20"/>
                 <w:szCs w:val="20"/>
               </w:rPr>
-              <w:t>tanggal</w:t>
-            </w:r>
-            <w:proofErr w:type="spellEnd"/>
-            <w:r>
+            </w:pPr>
+          </w:p>
+          <w:p>
+            <w:pPr>
+              <w:spacing w:before="20" w:after="20" w:line="252" w:lineRule="auto"/>
               <w:rPr>
                 <w:sz w:val="20"/>
                 <w:szCs w:val="20"/>
               </w:rPr>
-              <w:t xml:space="preserve"> </w:t>
-            </w:r>
-            <w:proofErr w:type="spellStart"/>
+            </w:pPr>
             <w:r>
               <w:rPr>
                 <w:sz w:val="20"/>
                 <w:szCs w:val="20"/>
               </w:rPr>
-              <w:t>sertifikasi</w:t>
-            </w:r>
-            <w:proofErr w:type="spellEnd"/>
+              <w:t>namaSertifikasiEl</w:t>
+            </w:r>
           </w:p>
           <w:p>
             <w:pPr>
@@ -3714,132 +3278,31 @@
                 <w:sz w:val="20"/>
                 <w:szCs w:val="20"/>
               </w:rPr>
-              <w:t xml:space="preserve">Input </w:t>
-            </w:r>
-            <w:proofErr w:type="spellStart"/>
+              <w:t>tang</w:t>
+            </w:r>
             <w:r>
               <w:rPr>
                 <w:sz w:val="20"/>
                 <w:szCs w:val="20"/>
               </w:rPr>
-              <w:t>deskripsi</w:t>
-            </w:r>
-            <w:proofErr w:type="spellEnd"/>
-            <w:r>
+              <w:t>galSertifikasiEl</w:t>
+            </w:r>
+          </w:p>
+          <w:p>
+            <w:pPr>
+              <w:spacing w:before="20" w:after="20" w:line="252" w:lineRule="auto"/>
               <w:rPr>
                 <w:sz w:val="20"/>
                 <w:szCs w:val="20"/>
               </w:rPr>
-              <w:t xml:space="preserve"> </w:t>
-            </w:r>
-            <w:proofErr w:type="spellStart"/>
+            </w:pPr>
             <w:r>
               <w:rPr>
                 <w:sz w:val="20"/>
                 <w:szCs w:val="20"/>
               </w:rPr>
-              <w:t>sertifikasi</w:t>
-            </w:r>
-            <w:proofErr w:type="spellEnd"/>
-          </w:p>
-        </w:tc>
-        <w:tc>
-          <w:tcPr>
-            <w:tcW w:w="2238" w:type="dxa"/>
-            <w:tcBorders>
-              <w:top w:val="single" w:sz="6" w:space="0" w:color="D8DEE9"/>
-              <w:left w:val="single" w:sz="6" w:space="0" w:color="D8DEE9"/>
-              <w:bottom w:val="single" w:sz="6" w:space="0" w:color="D8DEE9"/>
-              <w:right w:val="single" w:sz="6" w:space="0" w:color="D8DEE9"/>
-            </w:tcBorders>
-          </w:tcPr>
-          <w:p>
-            <w:pPr>
-              <w:spacing w:before="20" w:after="20" w:line="252" w:lineRule="auto"/>
-              <w:rPr>
-                <w:sz w:val="20"/>
-                <w:szCs w:val="20"/>
-              </w:rPr>
-            </w:pPr>
-            <w:proofErr w:type="spellStart"/>
-            <w:r>
-              <w:rPr>
-                <w:sz w:val="20"/>
-                <w:szCs w:val="20"/>
-              </w:rPr>
-              <w:t>formSertifikasi</w:t>
-            </w:r>
-            <w:proofErr w:type="spellEnd"/>
-          </w:p>
-          <w:p>
-            <w:pPr>
-              <w:spacing w:before="20" w:after="20" w:line="252" w:lineRule="auto"/>
-              <w:rPr>
-                <w:sz w:val="20"/>
-                <w:szCs w:val="20"/>
-              </w:rPr>
-            </w:pPr>
-          </w:p>
-          <w:p>
-            <w:pPr>
-              <w:spacing w:before="20" w:after="20" w:line="252" w:lineRule="auto"/>
-              <w:rPr>
-                <w:sz w:val="20"/>
-                <w:szCs w:val="20"/>
-              </w:rPr>
-            </w:pPr>
-            <w:proofErr w:type="spellStart"/>
-            <w:r>
-              <w:rPr>
-                <w:sz w:val="20"/>
-                <w:szCs w:val="20"/>
-              </w:rPr>
-              <w:t>namaSertifikasiEl</w:t>
-            </w:r>
-            <w:proofErr w:type="spellEnd"/>
-          </w:p>
-          <w:p>
-            <w:pPr>
-              <w:spacing w:before="20" w:after="20" w:line="252" w:lineRule="auto"/>
-              <w:rPr>
-                <w:sz w:val="20"/>
-                <w:szCs w:val="20"/>
-              </w:rPr>
-            </w:pPr>
-            <w:proofErr w:type="spellStart"/>
-            <w:r>
-              <w:rPr>
-                <w:sz w:val="20"/>
-                <w:szCs w:val="20"/>
-              </w:rPr>
-              <w:t>tang</w:t>
-            </w:r>
-            <w:r>
-              <w:rPr>
-                <w:sz w:val="20"/>
-                <w:szCs w:val="20"/>
-              </w:rPr>
-              <w:t>galSertifikasiEl</w:t>
-            </w:r>
-            <w:proofErr w:type="spellEnd"/>
-          </w:p>
-          <w:p>
-            <w:pPr>
-              <w:spacing w:before="20" w:after="20" w:line="252" w:lineRule="auto"/>
-              <w:rPr>
-                <w:sz w:val="20"/>
-                <w:szCs w:val="20"/>
-              </w:rPr>
-            </w:pPr>
-            <w:proofErr w:type="spellStart"/>
-            <w:r>
-              <w:rPr>
-                <w:sz w:val="20"/>
-                <w:szCs w:val="20"/>
-              </w:rPr>
               <w:t>deskripsiSertifikasiEl</w:t>
             </w:r>
-            <w:proofErr w:type="spellEnd"/>
           </w:p>
         </w:tc>
       </w:tr>
@@ -3867,63 +3330,13 @@
                 <w:sz w:val="18"/>
               </w:rPr>
             </w:pPr>
-            <w:proofErr w:type="spellStart"/>
-            <w:r>
-              <w:rPr>
-                <w:rFonts w:cs="Carlito"/>
-                <w:sz w:val="18"/>
-              </w:rPr>
-              <w:t>Pesan</w:t>
-            </w:r>
-            <w:proofErr w:type="spellEnd"/>
-            <w:r>
-              <w:rPr>
-                <w:rFonts w:cs="Carlito"/>
-                <w:sz w:val="18"/>
-              </w:rPr>
-              <w:t xml:space="preserve"> </w:t>
-            </w:r>
-            <w:proofErr w:type="spellStart"/>
-            <w:r>
-              <w:rPr>
-                <w:rFonts w:cs="Carlito"/>
-                <w:sz w:val="18"/>
-              </w:rPr>
-              <w:t>galat</w:t>
-            </w:r>
-            <w:proofErr w:type="spellEnd"/>
-            <w:r>
-              <w:rPr>
-                <w:rFonts w:cs="Carlito"/>
-                <w:sz w:val="18"/>
-              </w:rPr>
-              <w:t xml:space="preserve"> </w:t>
-            </w:r>
-            <w:proofErr w:type="spellStart"/>
-            <w:r>
-              <w:rPr>
-                <w:rFonts w:cs="Carlito"/>
-                <w:sz w:val="18"/>
-              </w:rPr>
-              <w:t>tiap</w:t>
-            </w:r>
-            <w:proofErr w:type="spellEnd"/>
-            <w:r>
-              <w:rPr>
-                <w:rFonts w:cs="Carlito"/>
-                <w:sz w:val="18"/>
-              </w:rPr>
-              <w:t xml:space="preserve"> </w:t>
-            </w:r>
-            <w:proofErr w:type="spellStart"/>
-            <w:r>
-              <w:rPr>
-                <w:rFonts w:cs="Carlito"/>
-                <w:sz w:val="18"/>
-              </w:rPr>
-              <w:t>kolom</w:t>
-            </w:r>
-            <w:proofErr w:type="spellEnd"/>
+            <w:r>
+              <w:rPr>
+                <w:rFonts w:cs="Carlito"/>
+                <w:sz w:val="18"/>
+              </w:rPr>
+              <w:t>Pesan galat tiap kolom</w:t>
+            </w:r>
           </w:p>
         </w:tc>
         <w:tc>
@@ -3949,98 +3362,62 @@
                 <w:sz w:val="20"/>
                 <w:szCs w:val="20"/>
               </w:rPr>
-              <w:t>.</w:t>
-            </w:r>
-            <w:proofErr w:type="spellStart"/>
-            <w:r>
+              <w:t>.pesan-galat</w:t>
+            </w:r>
+          </w:p>
+        </w:tc>
+        <w:tc>
+          <w:tcPr>
+            <w:tcW w:w="2693" w:type="dxa"/>
+            <w:tcBorders>
+              <w:top w:val="single" w:sz="6" w:space="0" w:color="D8DEE9"/>
+              <w:left w:val="single" w:sz="6" w:space="0" w:color="D8DEE9"/>
+              <w:bottom w:val="single" w:sz="6" w:space="0" w:color="D8DEE9"/>
+              <w:right w:val="single" w:sz="6" w:space="0" w:color="D8DEE9"/>
+            </w:tcBorders>
+          </w:tcPr>
+          <w:p>
+            <w:pPr>
+              <w:spacing w:before="20" w:after="20" w:line="252" w:lineRule="auto"/>
               <w:rPr>
                 <w:sz w:val="20"/>
                 <w:szCs w:val="20"/>
               </w:rPr>
-              <w:t>pesan-galat</w:t>
-            </w:r>
-            <w:proofErr w:type="spellEnd"/>
-          </w:p>
-        </w:tc>
-        <w:tc>
-          <w:tcPr>
-            <w:tcW w:w="2693" w:type="dxa"/>
-            <w:tcBorders>
-              <w:top w:val="single" w:sz="6" w:space="0" w:color="D8DEE9"/>
-              <w:left w:val="single" w:sz="6" w:space="0" w:color="D8DEE9"/>
-              <w:bottom w:val="single" w:sz="6" w:space="0" w:color="D8DEE9"/>
-              <w:right w:val="single" w:sz="6" w:space="0" w:color="D8DEE9"/>
-            </w:tcBorders>
-          </w:tcPr>
-          <w:p>
-            <w:pPr>
-              <w:spacing w:before="20" w:after="20" w:line="252" w:lineRule="auto"/>
+            </w:pPr>
+            <w:r>
               <w:rPr>
                 <w:sz w:val="20"/>
                 <w:szCs w:val="20"/>
               </w:rPr>
-            </w:pPr>
-            <w:proofErr w:type="spellStart"/>
-            <w:r>
+              <w:t>Pesan validasi setiap input form</w:t>
+            </w:r>
+          </w:p>
+        </w:tc>
+        <w:tc>
+          <w:tcPr>
+            <w:tcW w:w="2238" w:type="dxa"/>
+            <w:tcBorders>
+              <w:top w:val="single" w:sz="6" w:space="0" w:color="D8DEE9"/>
+              <w:left w:val="single" w:sz="6" w:space="0" w:color="D8DEE9"/>
+              <w:bottom w:val="single" w:sz="6" w:space="0" w:color="D8DEE9"/>
+              <w:right w:val="single" w:sz="6" w:space="0" w:color="D8DEE9"/>
+            </w:tcBorders>
+          </w:tcPr>
+          <w:p>
+            <w:pPr>
+              <w:spacing w:before="20" w:after="20" w:line="252" w:lineRule="auto"/>
               <w:rPr>
                 <w:sz w:val="20"/>
                 <w:szCs w:val="20"/>
               </w:rPr>
-              <w:t>Pesan</w:t>
-            </w:r>
-            <w:proofErr w:type="spellEnd"/>
+            </w:pPr>
             <w:r>
               <w:rPr>
                 <w:sz w:val="20"/>
                 <w:szCs w:val="20"/>
               </w:rPr>
-              <w:t xml:space="preserve"> </w:t>
-            </w:r>
-            <w:proofErr w:type="spellStart"/>
-            <w:r>
-              <w:rPr>
-                <w:sz w:val="20"/>
-                <w:szCs w:val="20"/>
-              </w:rPr>
-              <w:t>validasi</w:t>
-            </w:r>
-            <w:proofErr w:type="spellEnd"/>
-            <w:r>
-              <w:rPr>
-                <w:sz w:val="20"/>
-                <w:szCs w:val="20"/>
-              </w:rPr>
-              <w:t xml:space="preserve"> setiap input form</w:t>
-            </w:r>
-          </w:p>
-        </w:tc>
-        <w:tc>
-          <w:tcPr>
-            <w:tcW w:w="2238" w:type="dxa"/>
-            <w:tcBorders>
-              <w:top w:val="single" w:sz="6" w:space="0" w:color="D8DEE9"/>
-              <w:left w:val="single" w:sz="6" w:space="0" w:color="D8DEE9"/>
-              <w:bottom w:val="single" w:sz="6" w:space="0" w:color="D8DEE9"/>
-              <w:right w:val="single" w:sz="6" w:space="0" w:color="D8DEE9"/>
-            </w:tcBorders>
-          </w:tcPr>
-          <w:p>
-            <w:pPr>
-              <w:spacing w:before="20" w:after="20" w:line="252" w:lineRule="auto"/>
-              <w:rPr>
-                <w:sz w:val="20"/>
-                <w:szCs w:val="20"/>
-              </w:rPr>
-            </w:pPr>
-            <w:proofErr w:type="spellStart"/>
-            <w:r>
-              <w:rPr>
-                <w:sz w:val="20"/>
-                <w:szCs w:val="20"/>
-              </w:rPr>
               <w:t>pesanGalat</w:t>
             </w:r>
-            <w:proofErr w:type="spellEnd"/>
           </w:p>
         </w:tc>
       </w:tr>
@@ -4078,37 +3455,12 @@
         </w:rPr>
         <w:t xml:space="preserve">Buat berkas baru bernama js/dom.js, lalu tambahkan satu baris &lt;script&gt; lagi sebelum &lt;/body&gt;. Berkas app.js dari Pertemuan 8 tidak diubah — ia tetap memuat data dan fungsi. </w:t>
       </w:r>
-      <w:proofErr w:type="spellStart"/>
       <w:r>
         <w:rPr>
           <w:rFonts w:cs="Carlito"/>
           <w:sz w:val="20"/>
         </w:rPr>
-        <w:t>Berkas</w:t>
-      </w:r>
-      <w:proofErr w:type="spellEnd"/>
-      <w:r>
-        <w:rPr>
-          <w:rFonts w:cs="Carlito"/>
-          <w:sz w:val="20"/>
-        </w:rPr>
-        <w:t xml:space="preserve"> dom.js </w:t>
-      </w:r>
-      <w:proofErr w:type="spellStart"/>
-      <w:r>
-        <w:rPr>
-          <w:rFonts w:cs="Carlito"/>
-          <w:sz w:val="20"/>
-        </w:rPr>
-        <w:t>memakai</w:t>
-      </w:r>
-      <w:proofErr w:type="spellEnd"/>
-      <w:r>
-        <w:rPr>
-          <w:rFonts w:cs="Carlito"/>
-          <w:sz w:val="20"/>
-        </w:rPr>
-        <w:t xml:space="preserve"> data itu untuk mengisi halaman.</w:t>
+        <w:t>Berkas dom.js memakai data itu untuk mengisi halaman.</w:t>
       </w:r>
     </w:p>
     <w:tbl>
@@ -4327,39 +3679,7 @@
                 <w:rFonts w:cs="Carlito"/>
                 <w:sz w:val="18"/>
               </w:rPr>
-              <w:t xml:space="preserve">app.js </w:t>
-            </w:r>
-            <w:proofErr w:type="spellStart"/>
-            <w:r>
-              <w:rPr>
-                <w:rFonts w:cs="Carlito"/>
-                <w:sz w:val="18"/>
-              </w:rPr>
-              <w:t>menyimpan</w:t>
-            </w:r>
-            <w:proofErr w:type="spellEnd"/>
-            <w:r>
-              <w:rPr>
-                <w:rFonts w:cs="Carlito"/>
-                <w:sz w:val="18"/>
-              </w:rPr>
-              <w:t xml:space="preserve"> data dan </w:t>
-            </w:r>
-            <w:proofErr w:type="spellStart"/>
-            <w:r>
-              <w:rPr>
-                <w:rFonts w:cs="Carlito"/>
-                <w:sz w:val="18"/>
-              </w:rPr>
-              <w:t>fungsi</w:t>
-            </w:r>
-            <w:proofErr w:type="spellEnd"/>
-            <w:r>
-              <w:rPr>
-                <w:rFonts w:cs="Carlito"/>
-                <w:sz w:val="18"/>
-              </w:rPr>
-              <w:t xml:space="preserve"> murni; dom.js menyentuh halaman. Batas ini yang dipecah lagi di Pertemuan 11</w:t>
+              <w:t>app.js menyimpan data dan fungsi murni; dom.js menyentuh halaman. Batas ini yang dipecah lagi di Pertemuan 11</w:t>
             </w:r>
           </w:p>
         </w:tc>
@@ -4492,17 +3812,8 @@
                 <w:rFonts w:cs="Carlito"/>
                 <w:sz w:val="18"/>
               </w:rPr>
-              <w:t xml:space="preserve">type="module" pada </w:t>
-            </w:r>
-            <w:proofErr w:type="spellStart"/>
-            <w:r>
-              <w:rPr>
-                <w:rFonts w:cs="Carlito"/>
-                <w:sz w:val="18"/>
-              </w:rPr>
-              <w:t>keduanya</w:t>
-            </w:r>
-            <w:proofErr w:type="spellEnd"/>
+              <w:t>type="module" pada keduanya</w:t>
+            </w:r>
           </w:p>
         </w:tc>
         <w:tc>
@@ -4551,55 +3862,7 @@
                 <w:rFonts w:cs="Carlito"/>
                 <w:sz w:val="18"/>
               </w:rPr>
-              <w:t xml:space="preserve">Nama </w:t>
-            </w:r>
-            <w:proofErr w:type="spellStart"/>
-            <w:r>
-              <w:rPr>
-                <w:rFonts w:cs="Carlito"/>
-                <w:sz w:val="18"/>
-              </w:rPr>
-              <w:t>variabel</w:t>
-            </w:r>
-            <w:proofErr w:type="spellEnd"/>
-            <w:r>
-              <w:rPr>
-                <w:rFonts w:cs="Carlito"/>
-                <w:sz w:val="18"/>
-              </w:rPr>
-              <w:t xml:space="preserve"> bocor </w:t>
-            </w:r>
-            <w:proofErr w:type="spellStart"/>
-            <w:r>
-              <w:rPr>
-                <w:rFonts w:cs="Carlito"/>
-                <w:sz w:val="18"/>
-              </w:rPr>
-              <w:t>ke</w:t>
-            </w:r>
-            <w:proofErr w:type="spellEnd"/>
-            <w:r>
-              <w:rPr>
-                <w:rFonts w:cs="Carlito"/>
-                <w:sz w:val="18"/>
-              </w:rPr>
-              <w:t xml:space="preserve"> </w:t>
-            </w:r>
-            <w:proofErr w:type="spellStart"/>
-            <w:r>
-              <w:rPr>
-                <w:rFonts w:cs="Carlito"/>
-                <w:sz w:val="18"/>
-              </w:rPr>
-              <w:t>jendela</w:t>
-            </w:r>
-            <w:proofErr w:type="spellEnd"/>
-            <w:r>
-              <w:rPr>
-                <w:rFonts w:cs="Carlito"/>
-                <w:sz w:val="18"/>
-              </w:rPr>
-              <w:t xml:space="preserve"> peramban; import tidak bisa dipakai</w:t>
+              <w:t>Nama variabel bocor ke jendela peramban; import tidak bisa dipakai</w:t>
             </w:r>
           </w:p>
         </w:tc>
@@ -4723,11 +3986,9 @@
             <w:pPr>
               <w:spacing w:before="20" w:after="20" w:line="252" w:lineRule="auto"/>
             </w:pPr>
-            <w:proofErr w:type="spellStart"/>
             <w:r>
               <w:t>Sudah</w:t>
             </w:r>
-            <w:proofErr w:type="spellEnd"/>
           </w:p>
         </w:tc>
       </w:tr>
@@ -4774,11 +4035,9 @@
             <w:pPr>
               <w:spacing w:before="20" w:after="20" w:line="252" w:lineRule="auto"/>
             </w:pPr>
-            <w:proofErr w:type="spellStart"/>
             <w:r>
               <w:t>Sudah</w:t>
             </w:r>
-            <w:proofErr w:type="spellEnd"/>
           </w:p>
         </w:tc>
       </w:tr>
@@ -4825,11 +4084,9 @@
             <w:pPr>
               <w:spacing w:before="20" w:after="20" w:line="252" w:lineRule="auto"/>
             </w:pPr>
-            <w:proofErr w:type="spellStart"/>
             <w:r>
               <w:t>Sudah</w:t>
             </w:r>
-            <w:proofErr w:type="spellEnd"/>
           </w:p>
         </w:tc>
       </w:tr>
@@ -4876,11 +4133,9 @@
             <w:pPr>
               <w:spacing w:before="20" w:after="20" w:line="252" w:lineRule="auto"/>
             </w:pPr>
-            <w:proofErr w:type="spellStart"/>
             <w:r>
               <w:t>Sudah</w:t>
             </w:r>
-            <w:proofErr w:type="spellEnd"/>
           </w:p>
         </w:tc>
       </w:tr>
@@ -4997,27 +4252,7 @@
                 <w:color w:val="1B6B3A"/>
                 <w:sz w:val="20"/>
               </w:rPr>
-              <w:t xml:space="preserve">Tulis </w:t>
-            </w:r>
-            <w:proofErr w:type="spellStart"/>
-            <w:r>
-              <w:rPr>
-                <w:rFonts w:cs="Carlito"/>
-                <w:b/>
-                <w:color w:val="1B6B3A"/>
-                <w:sz w:val="20"/>
-              </w:rPr>
-              <w:t>pemilihnya</w:t>
-            </w:r>
-            <w:proofErr w:type="spellEnd"/>
-            <w:r>
-              <w:rPr>
-                <w:rFonts w:cs="Carlito"/>
-                <w:b/>
-                <w:color w:val="1B6B3A"/>
-                <w:sz w:val="20"/>
-              </w:rPr>
-              <w:t xml:space="preserve"> di Console, lalu bandingkan hasilnya dengan panel Elements. </w:t>
+              <w:t xml:space="preserve">Tulis pemilihnya di Console, lalu bandingkan hasilnya dengan panel Elements. </w:t>
             </w:r>
             <w:r>
               <w:rPr>
@@ -5584,69 +4819,12 @@
             <w:pPr>
               <w:spacing w:before="20" w:after="20" w:line="252" w:lineRule="auto"/>
             </w:pPr>
-            <w:proofErr w:type="spellStart"/>
-            <w:r>
-              <w:rPr>
-                <w:rFonts w:cs="Carlito"/>
-                <w:sz w:val="18"/>
-              </w:rPr>
-              <w:t>Elemen</w:t>
-            </w:r>
-            <w:proofErr w:type="spellEnd"/>
-            <w:r>
-              <w:rPr>
-                <w:rFonts w:cs="Carlito"/>
-                <w:sz w:val="18"/>
-              </w:rPr>
-              <w:t xml:space="preserve"> yang </w:t>
-            </w:r>
-            <w:proofErr w:type="spellStart"/>
-            <w:r>
-              <w:rPr>
-                <w:rFonts w:cs="Carlito"/>
-                <w:sz w:val="18"/>
-              </w:rPr>
-              <w:t>dibuat</w:t>
-            </w:r>
-            <w:proofErr w:type="spellEnd"/>
-            <w:r>
-              <w:rPr>
-                <w:rFonts w:cs="Carlito"/>
-                <w:sz w:val="18"/>
-              </w:rPr>
-              <w:t xml:space="preserve"> </w:t>
-            </w:r>
-            <w:proofErr w:type="spellStart"/>
-            <w:r>
-              <w:rPr>
-                <w:rFonts w:cs="Carlito"/>
-                <w:sz w:val="18"/>
-              </w:rPr>
-              <w:t>tidak</w:t>
-            </w:r>
-            <w:proofErr w:type="spellEnd"/>
-            <w:r>
-              <w:rPr>
-                <w:rFonts w:cs="Carlito"/>
-                <w:sz w:val="18"/>
-              </w:rPr>
-              <w:t xml:space="preserve"> </w:t>
-            </w:r>
-            <w:proofErr w:type="spellStart"/>
-            <w:r>
-              <w:rPr>
-                <w:rFonts w:cs="Carlito"/>
-                <w:sz w:val="18"/>
-              </w:rPr>
-              <w:t>muncul</w:t>
-            </w:r>
-            <w:proofErr w:type="spellEnd"/>
-            <w:r>
-              <w:rPr>
-                <w:rFonts w:cs="Carlito"/>
-                <w:sz w:val="18"/>
-              </w:rPr>
-              <w:t xml:space="preserve"> sampai dimasukkan ke wadah</w:t>
+            <w:r>
+              <w:rPr>
+                <w:rFonts w:cs="Carlito"/>
+                <w:sz w:val="18"/>
+              </w:rPr>
+              <w:t>Elemen yang dibuat tidak muncul sampai dimasukkan ke wadah</w:t>
             </w:r>
           </w:p>
         </w:tc>
@@ -6162,39 +5340,7 @@
           <w:rFonts w:cs="Carlito"/>
           <w:sz w:val="20"/>
         </w:rPr>
-        <w:t xml:space="preserve">Baris </w:t>
-      </w:r>
-      <w:proofErr w:type="spellStart"/>
-      <w:r>
-        <w:rPr>
-          <w:rFonts w:cs="Carlito"/>
-          <w:sz w:val="20"/>
-        </w:rPr>
-        <w:t>pengosongan</w:t>
-      </w:r>
-      <w:proofErr w:type="spellEnd"/>
-      <w:r>
-        <w:rPr>
-          <w:rFonts w:cs="Carlito"/>
-          <w:sz w:val="20"/>
-        </w:rPr>
-        <w:t xml:space="preserve"> itu </w:t>
-      </w:r>
-      <w:proofErr w:type="spellStart"/>
-      <w:r>
-        <w:rPr>
-          <w:rFonts w:cs="Carlito"/>
-          <w:sz w:val="20"/>
-        </w:rPr>
-        <w:t>wajib</w:t>
-      </w:r>
-      <w:proofErr w:type="spellEnd"/>
-      <w:r>
-        <w:rPr>
-          <w:rFonts w:cs="Carlito"/>
-          <w:sz w:val="20"/>
-        </w:rPr>
-        <w:t xml:space="preserve"> ada di baris pertama fungsi render, sebelum apa pun ditambahkan.</w:t>
+        <w:t>Baris pengosongan itu wajib ada di baris pertama fungsi render, sebelum apa pun ditambahkan.</w:t>
       </w:r>
     </w:p>
     <w:tbl>
@@ -6369,71 +5515,7 @@
                 <w:rFonts w:cs="Carlito"/>
                 <w:sz w:val="18"/>
               </w:rPr>
-              <w:t xml:space="preserve">Paling </w:t>
-            </w:r>
-            <w:proofErr w:type="spellStart"/>
-            <w:r>
-              <w:rPr>
-                <w:rFonts w:cs="Carlito"/>
-                <w:sz w:val="18"/>
-              </w:rPr>
-              <w:t>ringkas</w:t>
-            </w:r>
-            <w:proofErr w:type="spellEnd"/>
-            <w:r>
-              <w:rPr>
-                <w:rFonts w:cs="Carlito"/>
-                <w:sz w:val="18"/>
-              </w:rPr>
-              <w:t xml:space="preserve">; </w:t>
-            </w:r>
-            <w:proofErr w:type="spellStart"/>
-            <w:r>
-              <w:rPr>
-                <w:rFonts w:cs="Carlito"/>
-                <w:sz w:val="18"/>
-              </w:rPr>
-              <w:t>cukup</w:t>
-            </w:r>
-            <w:proofErr w:type="spellEnd"/>
-            <w:r>
-              <w:rPr>
-                <w:rFonts w:cs="Carlito"/>
-                <w:sz w:val="18"/>
-              </w:rPr>
-              <w:t xml:space="preserve"> </w:t>
-            </w:r>
-            <w:proofErr w:type="spellStart"/>
-            <w:r>
-              <w:rPr>
-                <w:rFonts w:cs="Carlito"/>
-                <w:sz w:val="18"/>
-              </w:rPr>
-              <w:t>untuk</w:t>
-            </w:r>
-            <w:proofErr w:type="spellEnd"/>
-            <w:r>
-              <w:rPr>
-                <w:rFonts w:cs="Carlito"/>
-                <w:sz w:val="18"/>
-              </w:rPr>
-              <w:t xml:space="preserve"> </w:t>
-            </w:r>
-            <w:proofErr w:type="spellStart"/>
-            <w:r>
-              <w:rPr>
-                <w:rFonts w:cs="Carlito"/>
-                <w:sz w:val="18"/>
-              </w:rPr>
-              <w:t>pekerjaan</w:t>
-            </w:r>
-            <w:proofErr w:type="spellEnd"/>
-            <w:r>
-              <w:rPr>
-                <w:rFonts w:cs="Carlito"/>
-                <w:sz w:val="18"/>
-              </w:rPr>
-              <w:t xml:space="preserve"> hari ini</w:t>
+              <w:t>Paling ringkas; cukup untuk pekerjaan hari ini</w:t>
             </w:r>
           </w:p>
         </w:tc>
@@ -6677,19 +5759,8 @@
                 <w:color w:val="FFFFFF"/>
                 <w:sz w:val="18"/>
               </w:rPr>
-              <w:t xml:space="preserve">Yang </w:t>
-            </w:r>
-            <w:proofErr w:type="spellStart"/>
-            <w:r>
-              <w:rPr>
-                <w:rFonts w:cs="Carlito"/>
-                <w:b/>
-                <w:color w:val="FFFFFF"/>
-                <w:sz w:val="18"/>
-              </w:rPr>
-              <w:t>diperiksa</w:t>
-            </w:r>
-            <w:proofErr w:type="spellEnd"/>
+              <w:t>Yang diperiksa</w:t>
+            </w:r>
           </w:p>
         </w:tc>
         <w:tc>
@@ -6900,23 +5971,7 @@
                 <w:sz w:val="20"/>
                 <w:szCs w:val="20"/>
               </w:rPr>
-              <w:t xml:space="preserve">'Halaman CV </w:t>
-            </w:r>
-            <w:proofErr w:type="spellStart"/>
-            <w:r>
-              <w:rPr>
-                <w:sz w:val="20"/>
-                <w:szCs w:val="20"/>
-              </w:rPr>
-              <w:t>responsif</w:t>
-            </w:r>
-            <w:proofErr w:type="spellEnd"/>
-            <w:r>
-              <w:rPr>
-                <w:sz w:val="20"/>
-                <w:szCs w:val="20"/>
-              </w:rPr>
-              <w:t xml:space="preserve"> P6'</w:t>
+              <w:t>'Halaman CV responsif P6'</w:t>
             </w:r>
           </w:p>
         </w:tc>
@@ -6996,94 +6051,14 @@
                 <w:sz w:val="20"/>
                 <w:szCs w:val="20"/>
               </w:rPr>
-              <w:t>"&lt;</w:t>
-            </w:r>
-            <w:proofErr w:type="spellStart"/>
+              <w:t>"&lt;em&gt;uji&lt;/em&gt;"</w:t>
+            </w:r>
             <w:r>
               <w:rPr>
                 <w:sz w:val="20"/>
                 <w:szCs w:val="20"/>
               </w:rPr>
-              <w:t>em</w:t>
-            </w:r>
-            <w:proofErr w:type="spellEnd"/>
-            <w:r>
-              <w:rPr>
-                <w:sz w:val="20"/>
-                <w:szCs w:val="20"/>
-              </w:rPr>
-              <w:t>&gt;uji&lt;/</w:t>
-            </w:r>
-            <w:proofErr w:type="spellStart"/>
-            <w:r>
-              <w:rPr>
-                <w:sz w:val="20"/>
-                <w:szCs w:val="20"/>
-              </w:rPr>
-              <w:t>em</w:t>
-            </w:r>
-            <w:proofErr w:type="spellEnd"/>
-            <w:r>
-              <w:rPr>
-                <w:sz w:val="20"/>
-                <w:szCs w:val="20"/>
-              </w:rPr>
-              <w:t>&gt;"</w:t>
-            </w:r>
-            <w:r>
-              <w:rPr>
-                <w:sz w:val="20"/>
-                <w:szCs w:val="20"/>
-              </w:rPr>
-              <w:t xml:space="preserve"> </w:t>
-            </w:r>
-            <w:proofErr w:type="spellStart"/>
-            <w:r>
-              <w:rPr>
-                <w:sz w:val="20"/>
-                <w:szCs w:val="20"/>
-              </w:rPr>
-              <w:t>muncul</w:t>
-            </w:r>
-            <w:proofErr w:type="spellEnd"/>
-            <w:r>
-              <w:rPr>
-                <w:sz w:val="20"/>
-                <w:szCs w:val="20"/>
-              </w:rPr>
-              <w:t xml:space="preserve">, bukan </w:t>
-            </w:r>
-            <w:proofErr w:type="spellStart"/>
-            <w:r>
-              <w:rPr>
-                <w:sz w:val="20"/>
-                <w:szCs w:val="20"/>
-              </w:rPr>
-              <w:t>elemen</w:t>
-            </w:r>
-            <w:proofErr w:type="spellEnd"/>
-            <w:r>
-              <w:rPr>
-                <w:sz w:val="20"/>
-                <w:szCs w:val="20"/>
-              </w:rPr>
-              <w:t xml:space="preserve"> &lt;</w:t>
-            </w:r>
-            <w:proofErr w:type="spellStart"/>
-            <w:r>
-              <w:rPr>
-                <w:sz w:val="20"/>
-                <w:szCs w:val="20"/>
-              </w:rPr>
-              <w:t>em</w:t>
-            </w:r>
-            <w:proofErr w:type="spellEnd"/>
-            <w:r>
-              <w:rPr>
-                <w:sz w:val="20"/>
-                <w:szCs w:val="20"/>
-              </w:rPr>
-              <w:t xml:space="preserve">&gt; </w:t>
+              <w:t xml:space="preserve"> muncul, bukan elemen &lt;em&gt; </w:t>
             </w:r>
           </w:p>
         </w:tc>
@@ -7955,7 +6930,6 @@
             <w:pPr>
               <w:spacing w:before="20" w:after="20" w:line="252" w:lineRule="auto"/>
             </w:pPr>
-            <w:proofErr w:type="spellStart"/>
             <w:r>
               <w:rPr>
                 <w:rFonts w:cs="Carlito"/>
@@ -7963,7 +6937,6 @@
               </w:rPr>
               <w:t>event.currentTarget</w:t>
             </w:r>
-            <w:proofErr w:type="spellEnd"/>
           </w:p>
         </w:tc>
         <w:tc>
@@ -8113,7 +7086,6 @@
             <w:pPr>
               <w:spacing w:before="20" w:after="20" w:line="252" w:lineRule="auto"/>
             </w:pPr>
-            <w:proofErr w:type="spellStart"/>
             <w:r>
               <w:rPr>
                 <w:rFonts w:cs="Carlito"/>
@@ -8121,7 +7093,6 @@
               </w:rPr>
               <w:t>dataset.kategori</w:t>
             </w:r>
-            <w:proofErr w:type="spellEnd"/>
           </w:p>
         </w:tc>
         <w:tc>
@@ -8355,7 +7326,6 @@
             <w:pPr>
               <w:spacing w:before="20" w:after="20"/>
             </w:pPr>
-            <w:proofErr w:type="spellStart"/>
             <w:r>
               <w:rPr>
                 <w:rFonts w:cs="Carlito"/>
@@ -8365,7 +7335,6 @@
               </w:rPr>
               <w:t>Keadaan</w:t>
             </w:r>
-            <w:proofErr w:type="spellEnd"/>
           </w:p>
         </w:tc>
         <w:tc>
@@ -8491,47 +7460,13 @@
                 <w:szCs w:val="20"/>
               </w:rPr>
             </w:pPr>
-            <w:proofErr w:type="spellStart"/>
             <w:r>
               <w:rPr>
                 <w:sz w:val="20"/>
                 <w:szCs w:val="20"/>
               </w:rPr>
-              <w:t>Semua</w:t>
-            </w:r>
-            <w:proofErr w:type="spellEnd"/>
-            <w:r>
-              <w:rPr>
-                <w:sz w:val="20"/>
-                <w:szCs w:val="20"/>
-              </w:rPr>
-              <w:t xml:space="preserve"> </w:t>
-            </w:r>
-            <w:proofErr w:type="spellStart"/>
-            <w:r>
-              <w:rPr>
-                <w:sz w:val="20"/>
-                <w:szCs w:val="20"/>
-              </w:rPr>
-              <w:t>proyek</w:t>
-            </w:r>
-            <w:proofErr w:type="spellEnd"/>
-            <w:r>
-              <w:rPr>
-                <w:sz w:val="20"/>
-                <w:szCs w:val="20"/>
-              </w:rPr>
-              <w:t xml:space="preserve"> </w:t>
-            </w:r>
-            <w:proofErr w:type="spellStart"/>
-            <w:r>
-              <w:rPr>
-                <w:sz w:val="20"/>
-                <w:szCs w:val="20"/>
-              </w:rPr>
-              <w:t>tampil</w:t>
-            </w:r>
-            <w:proofErr w:type="spellEnd"/>
+              <w:t>Semua proyek tampil</w:t>
+            </w:r>
           </w:p>
         </w:tc>
       </w:tr>
@@ -8605,63 +7540,13 @@
                 <w:szCs w:val="20"/>
               </w:rPr>
             </w:pPr>
-            <w:proofErr w:type="spellStart"/>
             <w:r>
               <w:rPr>
                 <w:sz w:val="20"/>
                 <w:szCs w:val="20"/>
               </w:rPr>
-              <w:t>Proyek</w:t>
-            </w:r>
-            <w:proofErr w:type="spellEnd"/>
-            <w:r>
-              <w:rPr>
-                <w:sz w:val="20"/>
-                <w:szCs w:val="20"/>
-              </w:rPr>
-              <w:t xml:space="preserve"> </w:t>
-            </w:r>
-            <w:proofErr w:type="spellStart"/>
-            <w:r>
-              <w:rPr>
-                <w:sz w:val="20"/>
-                <w:szCs w:val="20"/>
-              </w:rPr>
-              <w:t>tampil</w:t>
-            </w:r>
-            <w:proofErr w:type="spellEnd"/>
-            <w:r>
-              <w:rPr>
-                <w:sz w:val="20"/>
-                <w:szCs w:val="20"/>
-              </w:rPr>
-              <w:t xml:space="preserve"> </w:t>
-            </w:r>
-            <w:proofErr w:type="spellStart"/>
-            <w:r>
-              <w:rPr>
-                <w:sz w:val="20"/>
-                <w:szCs w:val="20"/>
-              </w:rPr>
-              <w:t>sesuai</w:t>
-            </w:r>
-            <w:proofErr w:type="spellEnd"/>
-            <w:r>
-              <w:rPr>
-                <w:sz w:val="20"/>
-                <w:szCs w:val="20"/>
-              </w:rPr>
-              <w:t xml:space="preserve"> </w:t>
-            </w:r>
-            <w:proofErr w:type="spellStart"/>
-            <w:r>
-              <w:rPr>
-                <w:sz w:val="20"/>
-                <w:szCs w:val="20"/>
-              </w:rPr>
-              <w:t>kategori</w:t>
-            </w:r>
-            <w:proofErr w:type="spellEnd"/>
+              <w:t>Proyek tampil sesuai kategori</w:t>
+            </w:r>
           </w:p>
         </w:tc>
       </w:tr>
@@ -8740,71 +7625,7 @@
                 <w:sz w:val="20"/>
                 <w:szCs w:val="20"/>
               </w:rPr>
-              <w:t xml:space="preserve">“Tidak </w:t>
-            </w:r>
-            <w:proofErr w:type="spellStart"/>
-            <w:r>
-              <w:rPr>
-                <w:sz w:val="20"/>
-                <w:szCs w:val="20"/>
-              </w:rPr>
-              <w:t>ada</w:t>
-            </w:r>
-            <w:proofErr w:type="spellEnd"/>
-            <w:r>
-              <w:rPr>
-                <w:sz w:val="20"/>
-                <w:szCs w:val="20"/>
-              </w:rPr>
-              <w:t xml:space="preserve"> </w:t>
-            </w:r>
-            <w:proofErr w:type="spellStart"/>
-            <w:r>
-              <w:rPr>
-                <w:sz w:val="20"/>
-                <w:szCs w:val="20"/>
-              </w:rPr>
-              <w:t>proyek</w:t>
-            </w:r>
-            <w:proofErr w:type="spellEnd"/>
-            <w:r>
-              <w:rPr>
-                <w:sz w:val="20"/>
-                <w:szCs w:val="20"/>
-              </w:rPr>
-              <w:t xml:space="preserve"> </w:t>
-            </w:r>
-            <w:proofErr w:type="spellStart"/>
-            <w:r>
-              <w:rPr>
-                <w:sz w:val="20"/>
-                <w:szCs w:val="20"/>
-              </w:rPr>
-              <w:t>untuk</w:t>
-            </w:r>
-            <w:proofErr w:type="spellEnd"/>
-            <w:r>
-              <w:rPr>
-                <w:sz w:val="20"/>
-                <w:szCs w:val="20"/>
-              </w:rPr>
-              <w:t xml:space="preserve"> </w:t>
-            </w:r>
-            <w:proofErr w:type="spellStart"/>
-            <w:r>
-              <w:rPr>
-                <w:sz w:val="20"/>
-                <w:szCs w:val="20"/>
-              </w:rPr>
-              <w:t>ditampilkan</w:t>
-            </w:r>
-            <w:proofErr w:type="spellEnd"/>
-            <w:r>
-              <w:rPr>
-                <w:sz w:val="20"/>
-                <w:szCs w:val="20"/>
-              </w:rPr>
-              <w:t>”</w:t>
+              <w:t>“Tidak ada proyek untuk ditampilkan”</w:t>
             </w:r>
           </w:p>
         </w:tc>
@@ -8884,49 +7705,8 @@
                 <w:sz w:val="20"/>
                 <w:szCs w:val="20"/>
               </w:rPr>
-              <w:t xml:space="preserve">Tidak </w:t>
-            </w:r>
-            <w:proofErr w:type="spellStart"/>
-            <w:r>
-              <w:rPr>
-                <w:sz w:val="20"/>
-                <w:szCs w:val="20"/>
-              </w:rPr>
-              <w:t>ada</w:t>
-            </w:r>
-            <w:proofErr w:type="spellEnd"/>
-            <w:r>
-              <w:rPr>
-                <w:sz w:val="20"/>
-                <w:szCs w:val="20"/>
-              </w:rPr>
-              <w:t xml:space="preserve"> </w:t>
-            </w:r>
-            <w:proofErr w:type="spellStart"/>
-            <w:r>
-              <w:rPr>
-                <w:sz w:val="20"/>
-                <w:szCs w:val="20"/>
-              </w:rPr>
-              <w:t>kartu</w:t>
-            </w:r>
-            <w:proofErr w:type="spellEnd"/>
-            <w:r>
-              <w:rPr>
-                <w:sz w:val="20"/>
-                <w:szCs w:val="20"/>
-              </w:rPr>
-              <w:t xml:space="preserve"> </w:t>
-            </w:r>
-            <w:proofErr w:type="spellStart"/>
-            <w:r>
-              <w:rPr>
-                <w:sz w:val="20"/>
-                <w:szCs w:val="20"/>
-              </w:rPr>
-              <w:t>berlipat</w:t>
-            </w:r>
-            <w:proofErr w:type="spellEnd"/>
+              <w:t>Tidak ada kartu berlipat</w:t>
+            </w:r>
           </w:p>
         </w:tc>
       </w:tr>
@@ -9598,7 +8378,6 @@
             <w:pPr>
               <w:spacing w:before="20" w:after="20"/>
             </w:pPr>
-            <w:proofErr w:type="spellStart"/>
             <w:r>
               <w:rPr>
                 <w:rFonts w:cs="Carlito"/>
@@ -9608,7 +8387,6 @@
               </w:rPr>
               <w:t>Aturan</w:t>
             </w:r>
-            <w:proofErr w:type="spellEnd"/>
           </w:p>
         </w:tc>
         <w:tc>
@@ -9883,69 +8661,12 @@
             <w:pPr>
               <w:spacing w:before="20" w:after="20" w:line="252" w:lineRule="auto"/>
             </w:pPr>
-            <w:proofErr w:type="spellStart"/>
-            <w:r>
-              <w:rPr>
-                <w:rFonts w:cs="Carlito"/>
-                <w:sz w:val="18"/>
-              </w:rPr>
-              <w:t>Pengguna</w:t>
-            </w:r>
-            <w:proofErr w:type="spellEnd"/>
-            <w:r>
-              <w:rPr>
-                <w:rFonts w:cs="Carlito"/>
-                <w:sz w:val="18"/>
-              </w:rPr>
-              <w:t xml:space="preserve"> </w:t>
-            </w:r>
-            <w:proofErr w:type="spellStart"/>
-            <w:r>
-              <w:rPr>
-                <w:rFonts w:cs="Carlito"/>
-                <w:sz w:val="18"/>
-              </w:rPr>
-              <w:t>tidak</w:t>
-            </w:r>
-            <w:proofErr w:type="spellEnd"/>
-            <w:r>
-              <w:rPr>
-                <w:rFonts w:cs="Carlito"/>
-                <w:sz w:val="18"/>
-              </w:rPr>
-              <w:t xml:space="preserve"> </w:t>
-            </w:r>
-            <w:proofErr w:type="spellStart"/>
-            <w:r>
-              <w:rPr>
-                <w:rFonts w:cs="Carlito"/>
-                <w:sz w:val="18"/>
-              </w:rPr>
-              <w:t>boleh</w:t>
-            </w:r>
-            <w:proofErr w:type="spellEnd"/>
-            <w:r>
-              <w:rPr>
-                <w:rFonts w:cs="Carlito"/>
-                <w:sz w:val="18"/>
-              </w:rPr>
-              <w:t xml:space="preserve"> </w:t>
-            </w:r>
-            <w:proofErr w:type="spellStart"/>
-            <w:r>
-              <w:rPr>
-                <w:rFonts w:cs="Carlito"/>
-                <w:sz w:val="18"/>
-              </w:rPr>
-              <w:t>melihat</w:t>
-            </w:r>
-            <w:proofErr w:type="spellEnd"/>
-            <w:r>
-              <w:rPr>
-                <w:rFonts w:cs="Carlito"/>
-                <w:sz w:val="18"/>
-              </w:rPr>
-              <w:t xml:space="preserve"> halaman yang diam</w:t>
+            <w:r>
+              <w:rPr>
+                <w:rFonts w:cs="Carlito"/>
+                <w:sz w:val="18"/>
+              </w:rPr>
+              <w:t>Pengguna tidak boleh melihat halaman yang diam</w:t>
             </w:r>
           </w:p>
         </w:tc>
@@ -10097,69 +8818,12 @@
         </w:rPr>
         <w:t xml:space="preserve">Form sudah ada di halaman Anda sejak Pertemuan 3. Sekarang ia diberi tiga hal: preventDefault supaya halaman tidak dimuat ulang, validasi yang berjalan saat pengguna mengetik, dan pesan galat per kolom. </w:t>
       </w:r>
-      <w:proofErr w:type="spellStart"/>
       <w:r>
         <w:rPr>
           <w:rFonts w:cs="Carlito"/>
           <w:sz w:val="20"/>
         </w:rPr>
-        <w:t>Pesannya</w:t>
-      </w:r>
-      <w:proofErr w:type="spellEnd"/>
-      <w:r>
-        <w:rPr>
-          <w:rFonts w:cs="Carlito"/>
-          <w:sz w:val="20"/>
-        </w:rPr>
-        <w:t xml:space="preserve"> </w:t>
-      </w:r>
-      <w:proofErr w:type="spellStart"/>
-      <w:r>
-        <w:rPr>
-          <w:rFonts w:cs="Carlito"/>
-          <w:sz w:val="20"/>
-        </w:rPr>
-        <w:t>menyebut</w:t>
-      </w:r>
-      <w:proofErr w:type="spellEnd"/>
-      <w:r>
-        <w:rPr>
-          <w:rFonts w:cs="Carlito"/>
-          <w:sz w:val="20"/>
-        </w:rPr>
-        <w:t xml:space="preserve"> </w:t>
-      </w:r>
-      <w:proofErr w:type="spellStart"/>
-      <w:r>
-        <w:rPr>
-          <w:rFonts w:cs="Carlito"/>
-          <w:sz w:val="20"/>
-        </w:rPr>
-        <w:t>cara</w:t>
-      </w:r>
-      <w:proofErr w:type="spellEnd"/>
-      <w:r>
-        <w:rPr>
-          <w:rFonts w:cs="Carlito"/>
-          <w:sz w:val="20"/>
-        </w:rPr>
-        <w:t xml:space="preserve"> </w:t>
-      </w:r>
-      <w:proofErr w:type="spellStart"/>
-      <w:r>
-        <w:rPr>
-          <w:rFonts w:cs="Carlito"/>
-          <w:sz w:val="20"/>
-        </w:rPr>
-        <w:t>memperbaiki</w:t>
-      </w:r>
-      <w:proofErr w:type="spellEnd"/>
-      <w:r>
-        <w:rPr>
-          <w:rFonts w:cs="Carlito"/>
-          <w:sz w:val="20"/>
-        </w:rPr>
-        <w:t>, bukan menyalahkan.</w:t>
+        <w:t>Pesannya menyebut cara memperbaiki, bukan menyalahkan.</w:t>
       </w:r>
     </w:p>
     <w:tbl>
@@ -10435,21 +9099,12 @@
             <w:pPr>
               <w:spacing w:before="20" w:after="20" w:line="252" w:lineRule="auto"/>
             </w:pPr>
-            <w:proofErr w:type="spellStart"/>
-            <w:r>
-              <w:rPr>
-                <w:rFonts w:cs="Carlito"/>
-                <w:sz w:val="18"/>
-              </w:rPr>
-              <w:t>setAttribute</w:t>
-            </w:r>
-            <w:proofErr w:type="spellEnd"/>
-            <w:r>
-              <w:rPr>
-                <w:rFonts w:cs="Carlito"/>
-                <w:sz w:val="18"/>
-              </w:rPr>
-              <w:t>("aria-invalid", "true")</w:t>
+            <w:r>
+              <w:rPr>
+                <w:rFonts w:cs="Carlito"/>
+                <w:sz w:val="18"/>
+              </w:rPr>
+              <w:t>setAttribute("aria-invalid", "true")</w:t>
             </w:r>
           </w:p>
         </w:tc>
@@ -10524,31 +9179,13 @@
             <w:pPr>
               <w:spacing w:before="20" w:after="20" w:line="252" w:lineRule="auto"/>
             </w:pPr>
-            <w:proofErr w:type="spellStart"/>
-            <w:r>
-              <w:rPr>
-                <w:rFonts w:cs="Carlito"/>
-                <w:sz w:val="18"/>
-              </w:rPr>
-              <w:t>tombol.disabled</w:t>
-            </w:r>
-            <w:proofErr w:type="spellEnd"/>
-            <w:r>
-              <w:rPr>
-                <w:rFonts w:cs="Carlito"/>
-                <w:sz w:val="18"/>
-              </w:rPr>
-              <w:t xml:space="preserve"> = !</w:t>
-            </w:r>
-            <w:proofErr w:type="spellStart"/>
-            <w:r>
-              <w:rPr>
-                <w:rFonts w:cs="Carlito"/>
-                <w:sz w:val="18"/>
-              </w:rPr>
-              <w:t>sah</w:t>
-            </w:r>
-            <w:proofErr w:type="spellEnd"/>
+            <w:r>
+              <w:rPr>
+                <w:rFonts w:cs="Carlito"/>
+                <w:sz w:val="18"/>
+              </w:rPr>
+              <w:t>tombol.disabled = !sah</w:t>
+            </w:r>
           </w:p>
         </w:tc>
         <w:tc>
@@ -10622,21 +9259,12 @@
             <w:pPr>
               <w:spacing w:before="20" w:after="20" w:line="252" w:lineRule="auto"/>
             </w:pPr>
-            <w:proofErr w:type="spellStart"/>
-            <w:r>
-              <w:rPr>
-                <w:rFonts w:cs="Carlito"/>
-                <w:sz w:val="18"/>
-              </w:rPr>
-              <w:t>kolom.focus</w:t>
-            </w:r>
-            <w:proofErr w:type="spellEnd"/>
-            <w:r>
-              <w:rPr>
-                <w:rFonts w:cs="Carlito"/>
-                <w:sz w:val="18"/>
-              </w:rPr>
-              <w:t>()</w:t>
+            <w:r>
+              <w:rPr>
+                <w:rFonts w:cs="Carlito"/>
+                <w:sz w:val="18"/>
+              </w:rPr>
+              <w:t>kolom.focus()</w:t>
             </w:r>
           </w:p>
         </w:tc>
@@ -10715,61 +9343,7 @@
           <w:b/>
           <w:color w:val="003796"/>
         </w:rPr>
-        <w:t xml:space="preserve">D.3  </w:t>
-      </w:r>
-      <w:proofErr w:type="spellStart"/>
-      <w:r>
-        <w:rPr>
-          <w:rFonts w:cs="Carlito"/>
-          <w:b/>
-          <w:color w:val="003796"/>
-        </w:rPr>
-        <w:t>Periksa</w:t>
-      </w:r>
-      <w:proofErr w:type="spellEnd"/>
-      <w:r>
-        <w:rPr>
-          <w:rFonts w:cs="Carlito"/>
-          <w:b/>
-          <w:color w:val="003796"/>
-        </w:rPr>
-        <w:t xml:space="preserve"> </w:t>
-      </w:r>
-      <w:proofErr w:type="spellStart"/>
-      <w:r>
-        <w:rPr>
-          <w:rFonts w:cs="Carlito"/>
-          <w:b/>
-          <w:color w:val="003796"/>
-        </w:rPr>
-        <w:t>hasil</w:t>
-      </w:r>
-      <w:proofErr w:type="spellEnd"/>
-      <w:r>
-        <w:rPr>
-          <w:rFonts w:cs="Carlito"/>
-          <w:b/>
-          <w:color w:val="003796"/>
-        </w:rPr>
-        <w:t xml:space="preserve"> </w:t>
-      </w:r>
-      <w:proofErr w:type="spellStart"/>
-      <w:r>
-        <w:rPr>
-          <w:rFonts w:cs="Carlito"/>
-          <w:b/>
-          <w:color w:val="003796"/>
-        </w:rPr>
-        <w:t>kerja</w:t>
-      </w:r>
-      <w:proofErr w:type="spellEnd"/>
-      <w:r>
-        <w:rPr>
-          <w:rFonts w:cs="Carlito"/>
-          <w:b/>
-          <w:color w:val="003796"/>
-        </w:rPr>
-        <w:t xml:space="preserve"> Anda</w:t>
+        <w:t>D.3  Periksa hasil kerja Anda</w:t>
       </w:r>
     </w:p>
     <w:tbl>
@@ -10946,72 +9520,8 @@
                 <w:szCs w:val="18"/>
                 <w:lang w:val="en-ID"/>
               </w:rPr>
-              <w:t xml:space="preserve">Halaman </w:t>
-            </w:r>
-            <w:proofErr w:type="spellStart"/>
-            <w:r>
-              <w:rPr>
-                <w:sz w:val="18"/>
-                <w:szCs w:val="18"/>
-                <w:lang w:val="en-ID"/>
-              </w:rPr>
-              <w:t>tetap</w:t>
-            </w:r>
-            <w:proofErr w:type="spellEnd"/>
-            <w:r>
-              <w:rPr>
-                <w:sz w:val="18"/>
-                <w:szCs w:val="18"/>
-                <w:lang w:val="en-ID"/>
-              </w:rPr>
-              <w:t xml:space="preserve"> dan </w:t>
-            </w:r>
-            <w:proofErr w:type="spellStart"/>
-            <w:r>
-              <w:rPr>
-                <w:sz w:val="18"/>
-                <w:szCs w:val="18"/>
-                <w:lang w:val="en-ID"/>
-              </w:rPr>
-              <w:t>pesan</w:t>
-            </w:r>
-            <w:proofErr w:type="spellEnd"/>
-            <w:r>
-              <w:rPr>
-                <w:sz w:val="18"/>
-                <w:szCs w:val="18"/>
-                <w:lang w:val="en-ID"/>
-              </w:rPr>
-              <w:t xml:space="preserve"> </w:t>
-            </w:r>
-            <w:proofErr w:type="spellStart"/>
-            <w:r>
-              <w:rPr>
-                <w:sz w:val="18"/>
-                <w:szCs w:val="18"/>
-                <w:lang w:val="en-ID"/>
-              </w:rPr>
-              <w:t>galat</w:t>
-            </w:r>
-            <w:proofErr w:type="spellEnd"/>
-            <w:r>
-              <w:rPr>
-                <w:sz w:val="18"/>
-                <w:szCs w:val="18"/>
-                <w:lang w:val="en-ID"/>
-              </w:rPr>
-              <w:t xml:space="preserve"> </w:t>
-            </w:r>
-            <w:proofErr w:type="spellStart"/>
-            <w:r>
-              <w:rPr>
-                <w:sz w:val="18"/>
-                <w:szCs w:val="18"/>
-                <w:lang w:val="en-ID"/>
-              </w:rPr>
-              <w:t>muncul</w:t>
-            </w:r>
-            <w:proofErr w:type="spellEnd"/>
+              <w:t>Halaman tetap dan pesan galat muncul</w:t>
+            </w:r>
           </w:p>
         </w:tc>
       </w:tr>
@@ -11035,47 +9545,13 @@
             <w:pPr>
               <w:spacing w:before="20" w:after="20" w:line="252" w:lineRule="auto"/>
             </w:pPr>
-            <w:proofErr w:type="spellStart"/>
-            <w:r>
-              <w:rPr>
-                <w:rFonts w:cs="Carlito"/>
-                <w:sz w:val="18"/>
-              </w:rPr>
-              <w:t>Perbaiki</w:t>
-            </w:r>
-            <w:proofErr w:type="spellEnd"/>
-            <w:r>
-              <w:rPr>
-                <w:rFonts w:cs="Carlito"/>
-                <w:sz w:val="18"/>
-              </w:rPr>
-              <w:t xml:space="preserve"> </w:t>
-            </w:r>
-            <w:proofErr w:type="spellStart"/>
-            <w:r>
-              <w:rPr>
-                <w:rFonts w:cs="Carlito"/>
-                <w:sz w:val="18"/>
-              </w:rPr>
-              <w:t>satu</w:t>
-            </w:r>
-            <w:proofErr w:type="spellEnd"/>
-            <w:r>
-              <w:rPr>
-                <w:rFonts w:cs="Carlito"/>
-                <w:sz w:val="18"/>
-              </w:rPr>
-              <w:t xml:space="preserve"> </w:t>
-            </w:r>
-            <w:proofErr w:type="spellStart"/>
-            <w:r>
-              <w:rPr>
-                <w:rFonts w:cs="Carlito"/>
-                <w:sz w:val="18"/>
-              </w:rPr>
-              <w:t>kolom</w:t>
-            </w:r>
-            <w:proofErr w:type="spellEnd"/>
+            <w:r>
+              <w:rPr>
+                <w:rFonts w:cs="Carlito"/>
+                <w:sz w:val="18"/>
+              </w:rPr>
+              <w:t>Perbaiki satu kolom</w:t>
+            </w:r>
           </w:p>
         </w:tc>
         <w:tc>
@@ -11119,47 +9595,13 @@
                 <w:szCs w:val="18"/>
               </w:rPr>
             </w:pPr>
-            <w:proofErr w:type="spellStart"/>
             <w:r>
               <w:rPr>
                 <w:sz w:val="18"/>
                 <w:szCs w:val="18"/>
               </w:rPr>
-              <w:t>Pesan</w:t>
-            </w:r>
-            <w:proofErr w:type="spellEnd"/>
-            <w:r>
-              <w:rPr>
-                <w:sz w:val="18"/>
-                <w:szCs w:val="18"/>
-              </w:rPr>
-              <w:t xml:space="preserve"> </w:t>
-            </w:r>
-            <w:proofErr w:type="spellStart"/>
-            <w:r>
-              <w:rPr>
-                <w:sz w:val="18"/>
-                <w:szCs w:val="18"/>
-              </w:rPr>
-              <w:t>galat</w:t>
-            </w:r>
-            <w:proofErr w:type="spellEnd"/>
-            <w:r>
-              <w:rPr>
-                <w:sz w:val="18"/>
-                <w:szCs w:val="18"/>
-              </w:rPr>
-              <w:t xml:space="preserve"> </w:t>
-            </w:r>
-            <w:proofErr w:type="spellStart"/>
-            <w:r>
-              <w:rPr>
-                <w:sz w:val="18"/>
-                <w:szCs w:val="18"/>
-              </w:rPr>
-              <w:t>hilang</w:t>
-            </w:r>
-            <w:proofErr w:type="spellEnd"/>
+              <w:t>Pesan galat hilang</w:t>
+            </w:r>
           </w:p>
         </w:tc>
       </w:tr>
@@ -11233,47 +9675,13 @@
                 <w:szCs w:val="18"/>
               </w:rPr>
             </w:pPr>
-            <w:proofErr w:type="spellStart"/>
             <w:r>
               <w:rPr>
                 <w:sz w:val="18"/>
                 <w:szCs w:val="18"/>
               </w:rPr>
-              <w:t>Pesan</w:t>
-            </w:r>
-            <w:proofErr w:type="spellEnd"/>
-            <w:r>
-              <w:rPr>
-                <w:sz w:val="18"/>
-                <w:szCs w:val="18"/>
-              </w:rPr>
-              <w:t xml:space="preserve"> </w:t>
-            </w:r>
-            <w:proofErr w:type="spellStart"/>
-            <w:r>
-              <w:rPr>
-                <w:sz w:val="18"/>
-                <w:szCs w:val="18"/>
-              </w:rPr>
-              <w:t>galat</w:t>
-            </w:r>
-            <w:proofErr w:type="spellEnd"/>
-            <w:r>
-              <w:rPr>
-                <w:sz w:val="18"/>
-                <w:szCs w:val="18"/>
-              </w:rPr>
-              <w:t xml:space="preserve"> </w:t>
-            </w:r>
-            <w:proofErr w:type="spellStart"/>
-            <w:r>
-              <w:rPr>
-                <w:sz w:val="18"/>
-                <w:szCs w:val="18"/>
-              </w:rPr>
-              <w:t>tetap</w:t>
-            </w:r>
-            <w:proofErr w:type="spellEnd"/>
+              <w:t>Pesan galat tetap</w:t>
+            </w:r>
           </w:p>
         </w:tc>
       </w:tr>
@@ -11358,169 +9766,33 @@
                 <w:szCs w:val="18"/>
                 <w:lang w:val="en-ID"/>
               </w:rPr>
-              <w:t xml:space="preserve">Hasil </w:t>
-            </w:r>
-            <w:proofErr w:type="spellStart"/>
-            <w:r>
+              <w:t>Hasil cek console saat masih ada pesan galat:</w:t>
+            </w:r>
+          </w:p>
+          <w:p>
+            <w:pPr>
+              <w:spacing w:before="20" w:after="20" w:line="252" w:lineRule="auto"/>
               <w:rPr>
                 <w:sz w:val="18"/>
                 <w:szCs w:val="18"/>
                 <w:lang w:val="en-ID"/>
               </w:rPr>
-              <w:t>cek</w:t>
-            </w:r>
-            <w:proofErr w:type="spellEnd"/>
+            </w:pPr>
             <w:r>
               <w:rPr>
                 <w:sz w:val="18"/>
                 <w:szCs w:val="18"/>
                 <w:lang w:val="en-ID"/>
               </w:rPr>
-              <w:t xml:space="preserve"> console </w:t>
-            </w:r>
-            <w:proofErr w:type="spellStart"/>
+              <w:t>&gt;</w:t>
+            </w:r>
             <w:r>
               <w:rPr>
                 <w:sz w:val="18"/>
                 <w:szCs w:val="18"/>
                 <w:lang w:val="en-ID"/>
               </w:rPr>
-              <w:t>saat</w:t>
-            </w:r>
-            <w:proofErr w:type="spellEnd"/>
-            <w:r>
-              <w:rPr>
-                <w:sz w:val="18"/>
-                <w:szCs w:val="18"/>
-                <w:lang w:val="en-ID"/>
-              </w:rPr>
-              <w:t xml:space="preserve"> </w:t>
-            </w:r>
-            <w:proofErr w:type="spellStart"/>
-            <w:r>
-              <w:rPr>
-                <w:sz w:val="18"/>
-                <w:szCs w:val="18"/>
-                <w:lang w:val="en-ID"/>
-              </w:rPr>
-              <w:t>masih</w:t>
-            </w:r>
-            <w:proofErr w:type="spellEnd"/>
-            <w:r>
-              <w:rPr>
-                <w:sz w:val="18"/>
-                <w:szCs w:val="18"/>
-                <w:lang w:val="en-ID"/>
-              </w:rPr>
-              <w:t xml:space="preserve"> </w:t>
-            </w:r>
-            <w:proofErr w:type="spellStart"/>
-            <w:r>
-              <w:rPr>
-                <w:sz w:val="18"/>
-                <w:szCs w:val="18"/>
-                <w:lang w:val="en-ID"/>
-              </w:rPr>
-              <w:t>ada</w:t>
-            </w:r>
-            <w:proofErr w:type="spellEnd"/>
-            <w:r>
-              <w:rPr>
-                <w:sz w:val="18"/>
-                <w:szCs w:val="18"/>
-                <w:lang w:val="en-ID"/>
-              </w:rPr>
-              <w:t xml:space="preserve"> </w:t>
-            </w:r>
-            <w:proofErr w:type="spellStart"/>
-            <w:r>
-              <w:rPr>
-                <w:sz w:val="18"/>
-                <w:szCs w:val="18"/>
-                <w:lang w:val="en-ID"/>
-              </w:rPr>
-              <w:t>pesan</w:t>
-            </w:r>
-            <w:proofErr w:type="spellEnd"/>
-            <w:r>
-              <w:rPr>
-                <w:sz w:val="18"/>
-                <w:szCs w:val="18"/>
-                <w:lang w:val="en-ID"/>
-              </w:rPr>
-              <w:t xml:space="preserve"> </w:t>
-            </w:r>
-            <w:proofErr w:type="spellStart"/>
-            <w:r>
-              <w:rPr>
-                <w:sz w:val="18"/>
-                <w:szCs w:val="18"/>
-                <w:lang w:val="en-ID"/>
-              </w:rPr>
-              <w:t>galat</w:t>
-            </w:r>
-            <w:proofErr w:type="spellEnd"/>
-            <w:r>
-              <w:rPr>
-                <w:sz w:val="18"/>
-                <w:szCs w:val="18"/>
-                <w:lang w:val="en-ID"/>
-              </w:rPr>
-              <w:t>:</w:t>
-            </w:r>
-          </w:p>
-          <w:p>
-            <w:pPr>
-              <w:spacing w:before="20" w:after="20" w:line="252" w:lineRule="auto"/>
-              <w:rPr>
-                <w:sz w:val="18"/>
-                <w:szCs w:val="18"/>
-                <w:lang w:val="en-ID"/>
-              </w:rPr>
-            </w:pPr>
-            <w:r>
-              <w:rPr>
-                <w:sz w:val="18"/>
-                <w:szCs w:val="18"/>
-                <w:lang w:val="en-ID"/>
-              </w:rPr>
-              <w:t>&gt;</w:t>
-            </w:r>
-            <w:proofErr w:type="spellStart"/>
-            <w:r>
-              <w:rPr>
-                <w:sz w:val="18"/>
-                <w:szCs w:val="18"/>
-                <w:lang w:val="en-ID"/>
-              </w:rPr>
-              <w:t>document.querySelector</w:t>
-            </w:r>
-            <w:proofErr w:type="spellEnd"/>
-            <w:r>
-              <w:rPr>
-                <w:sz w:val="18"/>
-                <w:szCs w:val="18"/>
-                <w:lang w:val="en-ID"/>
-              </w:rPr>
-              <w:t>("#form-</w:t>
-            </w:r>
-            <w:proofErr w:type="spellStart"/>
-            <w:r>
-              <w:rPr>
-                <w:sz w:val="18"/>
-                <w:szCs w:val="18"/>
-                <w:lang w:val="en-ID"/>
-              </w:rPr>
-              <w:t>sertifikasi</w:t>
-            </w:r>
-            <w:proofErr w:type="spellEnd"/>
-            <w:r>
-              <w:rPr>
-                <w:sz w:val="18"/>
-                <w:szCs w:val="18"/>
-                <w:lang w:val="en-ID"/>
-              </w:rPr>
-              <w:t xml:space="preserve"> button[type='submit']").disabled</w:t>
+              <w:t>document.querySelector("#form-sertifikasi button[type='submit']").disabled</w:t>
             </w:r>
           </w:p>
           <w:p>
@@ -11998,23 +10270,7 @@
           <w:rFonts w:cs="Carlito"/>
           <w:sz w:val="20"/>
         </w:rPr>
-        <w:t xml:space="preserve">Panel Event Listeners </w:t>
-      </w:r>
-      <w:proofErr w:type="spellStart"/>
-      <w:r>
-        <w:rPr>
-          <w:rFonts w:cs="Carlito"/>
-          <w:sz w:val="20"/>
-        </w:rPr>
-        <w:t>menunjukkan</w:t>
-      </w:r>
-      <w:proofErr w:type="spellEnd"/>
-      <w:r>
-        <w:rPr>
-          <w:rFonts w:cs="Carlito"/>
-          <w:sz w:val="20"/>
-        </w:rPr>
-        <w:t xml:space="preserve"> pendengar mana yang menempel pada elemen mana.</w:t>
+        <w:t>Panel Event Listeners menunjukkan pendengar mana yang menempel pada elemen mana.</w:t>
       </w:r>
     </w:p>
     <w:tbl>
@@ -12294,37 +10550,12 @@
             <w:pPr>
               <w:spacing w:before="20" w:after="20" w:line="252" w:lineRule="auto"/>
             </w:pPr>
-            <w:proofErr w:type="spellStart"/>
-            <w:r>
-              <w:rPr>
-                <w:rFonts w:cs="Carlito"/>
-                <w:sz w:val="18"/>
-              </w:rPr>
-              <w:t>monitorEvents</w:t>
-            </w:r>
-            <w:proofErr w:type="spellEnd"/>
-            <w:r>
-              <w:rPr>
-                <w:rFonts w:cs="Carlito"/>
-                <w:sz w:val="18"/>
-              </w:rPr>
-              <w:t>(</w:t>
-            </w:r>
-            <w:proofErr w:type="spellStart"/>
-            <w:r>
-              <w:rPr>
-                <w:rFonts w:cs="Carlito"/>
-                <w:sz w:val="18"/>
-              </w:rPr>
-              <w:t>el</w:t>
-            </w:r>
-            <w:proofErr w:type="spellEnd"/>
-            <w:r>
-              <w:rPr>
-                <w:rFonts w:cs="Carlito"/>
-                <w:sz w:val="18"/>
-              </w:rPr>
-              <w:t>)</w:t>
+            <w:r>
+              <w:rPr>
+                <w:rFonts w:cs="Carlito"/>
+                <w:sz w:val="18"/>
+              </w:rPr>
+              <w:t>monitorEvents(el)</w:t>
             </w:r>
           </w:p>
         </w:tc>
@@ -12491,69 +10722,12 @@
         </w:rPr>
         <w:t xml:space="preserve">Urutan pemeriksaan di bawah ini disusun dari yang paling sering terjadi. </w:t>
       </w:r>
-      <w:proofErr w:type="spellStart"/>
       <w:r>
         <w:rPr>
           <w:rFonts w:cs="Carlito"/>
           <w:sz w:val="20"/>
         </w:rPr>
-        <w:t>Kerjakan</w:t>
-      </w:r>
-      <w:proofErr w:type="spellEnd"/>
-      <w:r>
-        <w:rPr>
-          <w:rFonts w:cs="Carlito"/>
-          <w:sz w:val="20"/>
-        </w:rPr>
-        <w:t xml:space="preserve"> </w:t>
-      </w:r>
-      <w:proofErr w:type="spellStart"/>
-      <w:r>
-        <w:rPr>
-          <w:rFonts w:cs="Carlito"/>
-          <w:sz w:val="20"/>
-        </w:rPr>
-        <w:t>berurutan</w:t>
-      </w:r>
-      <w:proofErr w:type="spellEnd"/>
-      <w:r>
-        <w:rPr>
-          <w:rFonts w:cs="Carlito"/>
-          <w:sz w:val="20"/>
-        </w:rPr>
-        <w:t xml:space="preserve">; </w:t>
-      </w:r>
-      <w:proofErr w:type="spellStart"/>
-      <w:r>
-        <w:rPr>
-          <w:rFonts w:cs="Carlito"/>
-          <w:sz w:val="20"/>
-        </w:rPr>
-        <w:t>jangan</w:t>
-      </w:r>
-      <w:proofErr w:type="spellEnd"/>
-      <w:r>
-        <w:rPr>
-          <w:rFonts w:cs="Carlito"/>
-          <w:sz w:val="20"/>
-        </w:rPr>
-        <w:t xml:space="preserve"> </w:t>
-      </w:r>
-      <w:proofErr w:type="spellStart"/>
-      <w:r>
-        <w:rPr>
-          <w:rFonts w:cs="Carlito"/>
-          <w:sz w:val="20"/>
-        </w:rPr>
-        <w:t>melompat</w:t>
-      </w:r>
-      <w:proofErr w:type="spellEnd"/>
-      <w:r>
-        <w:rPr>
-          <w:rFonts w:cs="Carlito"/>
-          <w:sz w:val="20"/>
-        </w:rPr>
-        <w:t xml:space="preserve"> ke sebab yang paling rumit.</w:t>
+        <w:t>Kerjakan berurutan; jangan melompat ke sebab yang paling rumit.</w:t>
       </w:r>
     </w:p>
     <w:tbl>
@@ -12723,37 +10897,12 @@
             <w:pPr>
               <w:spacing w:before="20" w:after="20" w:line="252" w:lineRule="auto"/>
             </w:pPr>
-            <w:proofErr w:type="spellStart"/>
-            <w:r>
-              <w:rPr>
-                <w:rFonts w:cs="Carlito"/>
-                <w:sz w:val="18"/>
-              </w:rPr>
-              <w:t>Periksa</w:t>
-            </w:r>
-            <w:proofErr w:type="spellEnd"/>
-            <w:r>
-              <w:rPr>
-                <w:rFonts w:cs="Carlito"/>
-                <w:sz w:val="18"/>
-              </w:rPr>
-              <w:t xml:space="preserve"> </w:t>
-            </w:r>
-            <w:proofErr w:type="spellStart"/>
-            <w:r>
-              <w:rPr>
-                <w:rFonts w:cs="Carlito"/>
-                <w:sz w:val="18"/>
-              </w:rPr>
-              <w:t>urutan</w:t>
-            </w:r>
-            <w:proofErr w:type="spellEnd"/>
-            <w:r>
-              <w:rPr>
-                <w:rFonts w:cs="Carlito"/>
-                <w:sz w:val="18"/>
-              </w:rPr>
-              <w:t xml:space="preserve"> &lt;script&gt;: app.js lalu dom.js, keduanya sebelum &lt;/body&gt;</w:t>
+            <w:r>
+              <w:rPr>
+                <w:rFonts w:cs="Carlito"/>
+                <w:sz w:val="18"/>
+              </w:rPr>
+              <w:t>Periksa urutan &lt;script&gt;: app.js lalu dom.js, keduanya sebelum &lt;/body&gt;</w:t>
             </w:r>
           </w:p>
         </w:tc>
@@ -12947,39 +11096,7 @@
                 <w:rFonts w:cs="Carlito"/>
                 <w:sz w:val="18"/>
               </w:rPr>
-              <w:t xml:space="preserve">Daftar </w:t>
-            </w:r>
-            <w:proofErr w:type="spellStart"/>
-            <w:r>
-              <w:rPr>
-                <w:rFonts w:cs="Carlito"/>
-                <w:sz w:val="18"/>
-              </w:rPr>
-              <w:t>kosong</w:t>
-            </w:r>
-            <w:proofErr w:type="spellEnd"/>
-            <w:r>
-              <w:rPr>
-                <w:rFonts w:cs="Carlito"/>
-                <w:sz w:val="18"/>
-              </w:rPr>
-              <w:t xml:space="preserve"> </w:t>
-            </w:r>
-            <w:proofErr w:type="spellStart"/>
-            <w:r>
-              <w:rPr>
-                <w:rFonts w:cs="Carlito"/>
-                <w:sz w:val="18"/>
-              </w:rPr>
-              <w:t>tanpa</w:t>
-            </w:r>
-            <w:proofErr w:type="spellEnd"/>
-            <w:r>
-              <w:rPr>
-                <w:rFonts w:cs="Carlito"/>
-                <w:sz w:val="18"/>
-              </w:rPr>
-              <w:t xml:space="preserve"> penjelasan</w:t>
+              <w:t>Daftar kosong tanpa penjelasan</w:t>
             </w:r>
           </w:p>
         </w:tc>
@@ -13416,17 +11533,8 @@
                 <w:rFonts w:cs="Carlito"/>
                 <w:sz w:val="18"/>
               </w:rPr>
-              <w:t xml:space="preserve">Isi daftar </w:t>
-            </w:r>
-            <w:proofErr w:type="spellStart"/>
-            <w:r>
-              <w:rPr>
-                <w:rFonts w:cs="Carlito"/>
-                <w:sz w:val="18"/>
-              </w:rPr>
-              <w:t>kosong</w:t>
-            </w:r>
-            <w:proofErr w:type="spellEnd"/>
+              <w:t>Isi daftar kosong</w:t>
+            </w:r>
           </w:p>
         </w:tc>
         <w:tc>
@@ -13477,6 +11585,16 @@
         </w:tc>
       </w:tr>
     </w:tbl>
+    <w:p>
+      <w:pPr>
+        <w:spacing w:after="60"/>
+      </w:pPr>
+    </w:p>
+    <w:p>
+      <w:pPr>
+        <w:spacing w:after="60"/>
+      </w:pPr>
+    </w:p>
     <w:p>
       <w:pPr>
         <w:spacing w:after="60"/>
@@ -13493,6 +11611,7 @@
           <w:b/>
           <w:color w:val="003796"/>
         </w:rPr>
+        <w:lastRenderedPageBreak/>
         <w:t>E.4  Catat kasus yang saya temui</w:t>
       </w:r>
     </w:p>
@@ -13612,7 +11731,16 @@
           <w:p>
             <w:pPr>
               <w:spacing w:before="20" w:after="20" w:line="252" w:lineRule="auto"/>
-            </w:pPr>
+              <w:rPr>
+                <w:lang w:val="de-DE"/>
+              </w:rPr>
+            </w:pPr>
+            <w:r>
+              <w:rPr>
+                <w:lang w:val="de-DE"/>
+              </w:rPr>
+              <w:t>Klik filter tidak mengubah daftar</w:t>
+            </w:r>
           </w:p>
         </w:tc>
         <w:tc>
@@ -13628,7 +11756,16 @@
           <w:p>
             <w:pPr>
               <w:spacing w:before="20" w:after="20" w:line="252" w:lineRule="auto"/>
-            </w:pPr>
+              <w:rPr>
+                <w:lang w:val="de-DE"/>
+              </w:rPr>
+            </w:pPr>
+            <w:r>
+              <w:rPr>
+                <w:lang w:val="de-DE"/>
+              </w:rPr>
+              <w:t>Belum ada listener dalam dom.js</w:t>
+            </w:r>
           </w:p>
         </w:tc>
         <w:tc>
@@ -13644,7 +11781,34 @@
           <w:p>
             <w:pPr>
               <w:spacing w:before="20" w:after="20" w:line="252" w:lineRule="auto"/>
-            </w:pPr>
+              <w:rPr>
+                <w:lang w:val="de-DE"/>
+              </w:rPr>
+            </w:pPr>
+            <w:r>
+              <w:rPr>
+                <w:lang w:val="de-DE"/>
+              </w:rPr>
+              <w:t>barisFilter.addEvent</w:t>
+            </w:r>
+            <w:r>
+              <w:rPr>
+                <w:lang w:val="de-DE"/>
+              </w:rPr>
+              <w:t xml:space="preserve">Listener("click", ...) </w:t>
+            </w:r>
+            <w:r>
+              <w:rPr>
+                <w:lang w:val="de-DE"/>
+              </w:rPr>
+              <w:t>dan</w:t>
+            </w:r>
+            <w:r>
+              <w:rPr>
+                <w:lang w:val="de-DE"/>
+              </w:rPr>
+              <w:t xml:space="preserve"> renderProyek(terpilih)</w:t>
+            </w:r>
           </w:p>
         </w:tc>
       </w:tr>
@@ -13667,7 +11831,28 @@
           <w:p>
             <w:pPr>
               <w:spacing w:before="20" w:after="20" w:line="252" w:lineRule="auto"/>
-            </w:pPr>
+              <w:rPr>
+                <w:lang w:val="en-ID"/>
+              </w:rPr>
+            </w:pPr>
+            <w:r>
+              <w:rPr>
+                <w:lang w:val="en-ID"/>
+              </w:rPr>
+              <w:t>Daftar</w:t>
+            </w:r>
+            <w:r>
+              <w:rPr>
+                <w:lang w:val="en-ID"/>
+              </w:rPr>
+              <w:t xml:space="preserve"> proyek</w:t>
+            </w:r>
+            <w:r>
+              <w:rPr>
+                <w:lang w:val="en-ID"/>
+              </w:rPr>
+              <w:t xml:space="preserve"> kosong tetapi pesannya tidak muncul</w:t>
+            </w:r>
           </w:p>
         </w:tc>
         <w:tc>
@@ -13683,7 +11868,16 @@
           <w:p>
             <w:pPr>
               <w:spacing w:before="20" w:after="20" w:line="252" w:lineRule="auto"/>
-            </w:pPr>
+              <w:rPr>
+                <w:lang w:val="en-ID"/>
+              </w:rPr>
+            </w:pPr>
+            <w:r>
+              <w:rPr>
+                <w:lang w:val="en-ID"/>
+              </w:rPr>
+              <w:t>renderProyek() belum memperbarui status hidden pada pesan kosong</w:t>
+            </w:r>
           </w:p>
         </w:tc>
         <w:tc>
@@ -13699,7 +11893,16 @@
           <w:p>
             <w:pPr>
               <w:spacing w:before="20" w:after="20" w:line="252" w:lineRule="auto"/>
-            </w:pPr>
+              <w:rPr>
+                <w:lang w:val="en-ID"/>
+              </w:rPr>
+            </w:pPr>
+            <w:r>
+              <w:rPr>
+                <w:lang w:val="en-ID"/>
+              </w:rPr>
+              <w:t>pesanKosong.hidden = daftar.length &gt; 0 in renderProyek()</w:t>
+            </w:r>
           </w:p>
         </w:tc>
       </w:tr>
@@ -13722,7 +11925,42 @@
           <w:p>
             <w:pPr>
               <w:spacing w:before="20" w:after="20" w:line="252" w:lineRule="auto"/>
-            </w:pPr>
+              <w:rPr>
+                <w:lang w:val="en-ID"/>
+              </w:rPr>
+            </w:pPr>
+            <w:r>
+              <w:rPr>
+                <w:lang w:val="en-ID"/>
+              </w:rPr>
+              <w:t>Muncul</w:t>
+            </w:r>
+            <w:r>
+              <w:rPr>
+                <w:lang w:val="en-ID"/>
+              </w:rPr>
+              <w:t xml:space="preserve"> tooltip </w:t>
+            </w:r>
+            <w:r>
+              <w:rPr>
+                <w:rFonts w:hint="cs"/>
+                <w:lang w:val="en-ID"/>
+              </w:rPr>
+              <w:t>“</w:t>
+            </w:r>
+            <w:r>
+              <w:rPr>
+                <w:lang w:val="en-ID"/>
+              </w:rPr>
+              <w:t>Please fill out this field</w:t>
+            </w:r>
+            <w:r>
+              <w:rPr>
+                <w:rFonts w:hint="cs"/>
+                <w:lang w:val="en-ID"/>
+              </w:rPr>
+              <w:t>”</w:t>
+            </w:r>
           </w:p>
         </w:tc>
         <w:tc>
@@ -13738,7 +11976,34 @@
           <w:p>
             <w:pPr>
               <w:spacing w:before="20" w:after="20" w:line="252" w:lineRule="auto"/>
-            </w:pPr>
+              <w:rPr>
+                <w:lang w:val="en-ID"/>
+              </w:rPr>
+            </w:pPr>
+            <w:r>
+              <w:rPr>
+                <w:lang w:val="en-ID"/>
+              </w:rPr>
+              <w:t>Pesan galat</w:t>
+            </w:r>
+            <w:r>
+              <w:rPr>
+                <w:lang w:val="en-ID"/>
+              </w:rPr>
+              <w:t xml:space="preserve"> bawaan HTML berjalan sebelum pesan</w:t>
+            </w:r>
+            <w:r>
+              <w:rPr>
+                <w:lang w:val="en-ID"/>
+              </w:rPr>
+              <w:t xml:space="preserve"> </w:t>
+            </w:r>
+            <w:r>
+              <w:rPr>
+                <w:lang w:val="en-ID"/>
+              </w:rPr>
+              <w:t>JavaScript</w:t>
+            </w:r>
           </w:p>
         </w:tc>
         <w:tc>
@@ -13754,7 +12019,22 @@
           <w:p>
             <w:pPr>
               <w:spacing w:before="20" w:after="20" w:line="252" w:lineRule="auto"/>
-            </w:pPr>
+              <w:rPr>
+                <w:lang w:val="en-ID"/>
+              </w:rPr>
+            </w:pPr>
+            <w:r>
+              <w:rPr>
+                <w:lang w:val="en-ID"/>
+              </w:rPr>
+              <w:t>novalidate</w:t>
+            </w:r>
+            <w:r>
+              <w:rPr>
+                <w:lang w:val="en-ID"/>
+              </w:rPr>
+              <w:t xml:space="preserve"> pada form dan submit dengan preventDefault()</w:t>
+            </w:r>
           </w:p>
         </w:tc>
       </w:tr>
@@ -13762,6 +12042,9 @@
     <w:p>
       <w:pPr>
         <w:spacing w:after="60"/>
+        <w:rPr>
+          <w:lang w:val="en-ID"/>
+        </w:rPr>
       </w:pPr>
     </w:p>
     <w:tbl>
@@ -14392,69 +12675,12 @@
         </w:rPr>
         <w:t xml:space="preserve">4.  Apa yang terjadi bila baris pengosongan wadah dihapus dari fungsi render? </w:t>
       </w:r>
-      <w:proofErr w:type="spellStart"/>
       <w:r>
         <w:rPr>
           <w:rFonts w:cs="Carlito"/>
           <w:sz w:val="20"/>
         </w:rPr>
-        <w:t>Peragakan</w:t>
-      </w:r>
-      <w:proofErr w:type="spellEnd"/>
-      <w:r>
-        <w:rPr>
-          <w:rFonts w:cs="Carlito"/>
-          <w:sz w:val="20"/>
-        </w:rPr>
-        <w:t xml:space="preserve">, </w:t>
-      </w:r>
-      <w:proofErr w:type="spellStart"/>
-      <w:r>
-        <w:rPr>
-          <w:rFonts w:cs="Carlito"/>
-          <w:sz w:val="20"/>
-        </w:rPr>
-        <w:t>lalu</w:t>
-      </w:r>
-      <w:proofErr w:type="spellEnd"/>
-      <w:r>
-        <w:rPr>
-          <w:rFonts w:cs="Carlito"/>
-          <w:sz w:val="20"/>
-        </w:rPr>
-        <w:t xml:space="preserve"> </w:t>
-      </w:r>
-      <w:proofErr w:type="spellStart"/>
-      <w:r>
-        <w:rPr>
-          <w:rFonts w:cs="Carlito"/>
-          <w:sz w:val="20"/>
-        </w:rPr>
-        <w:t>tulis</w:t>
-      </w:r>
-      <w:proofErr w:type="spellEnd"/>
-      <w:r>
-        <w:rPr>
-          <w:rFonts w:cs="Carlito"/>
-          <w:sz w:val="20"/>
-        </w:rPr>
-        <w:t xml:space="preserve"> </w:t>
-      </w:r>
-      <w:proofErr w:type="spellStart"/>
-      <w:r>
-        <w:rPr>
-          <w:rFonts w:cs="Carlito"/>
-          <w:sz w:val="20"/>
-        </w:rPr>
-        <w:t>hasilnya</w:t>
-      </w:r>
-      <w:proofErr w:type="spellEnd"/>
-      <w:r>
-        <w:rPr>
-          <w:rFonts w:cs="Carlito"/>
-          <w:sz w:val="20"/>
-        </w:rPr>
-        <w:t>.</w:t>
+        <w:t>Peragakan, lalu tulis hasilnya.</w:t>
       </w:r>
     </w:p>
     <w:tbl>
@@ -14524,23 +12750,7 @@
           <w:rFonts w:cs="Carlito"/>
           <w:sz w:val="20"/>
         </w:rPr>
-        <w:t xml:space="preserve">Tulis </w:t>
-      </w:r>
-      <w:proofErr w:type="spellStart"/>
-      <w:r>
-        <w:rPr>
-          <w:rFonts w:cs="Carlito"/>
-          <w:sz w:val="20"/>
-        </w:rPr>
-        <w:t>cara</w:t>
-      </w:r>
-      <w:proofErr w:type="spellEnd"/>
-      <w:r>
-        <w:rPr>
-          <w:rFonts w:cs="Carlito"/>
-          <w:sz w:val="20"/>
-        </w:rPr>
-        <w:t xml:space="preserve"> yang Anda pakai sebagai gantinya.</w:t>
+        <w:t>Tulis cara yang Anda pakai sebagai gantinya.</w:t>
       </w:r>
     </w:p>
     <w:tbl>
@@ -14711,25 +12921,7 @@
                 <w:color w:val="003796"/>
                 <w:sz w:val="22"/>
               </w:rPr>
-              <w:t xml:space="preserve">☐  Render </w:t>
-            </w:r>
-            <w:proofErr w:type="spellStart"/>
-            <w:r>
-              <w:rPr>
-                <w:rFonts w:cs="Carlito"/>
-                <w:color w:val="003796"/>
-                <w:sz w:val="22"/>
-              </w:rPr>
-              <w:t>dari</w:t>
-            </w:r>
-            <w:proofErr w:type="spellEnd"/>
-            <w:r>
-              <w:rPr>
-                <w:rFonts w:cs="Carlito"/>
-                <w:color w:val="003796"/>
-                <w:sz w:val="22"/>
-              </w:rPr>
-              <w:t xml:space="preserve"> data  daftar proyek terbentuk dari array dengan createElement dan textContent, bukan dari HTML yang ditulis tangan</w:t>
+              <w:t>☐  Render dari data  daftar proyek terbentuk dari array dengan createElement dan textContent, bukan dari HTML yang ditulis tangan</w:t>
             </w:r>
           </w:p>
         </w:tc>
@@ -14785,25 +12977,7 @@
                 <w:color w:val="003796"/>
                 <w:sz w:val="22"/>
               </w:rPr>
-              <w:t xml:space="preserve">☐  Event delegation  </w:t>
-            </w:r>
-            <w:proofErr w:type="spellStart"/>
-            <w:r>
-              <w:rPr>
-                <w:rFonts w:cs="Carlito"/>
-                <w:color w:val="003796"/>
-                <w:sz w:val="22"/>
-              </w:rPr>
-              <w:t>satu</w:t>
-            </w:r>
-            <w:proofErr w:type="spellEnd"/>
-            <w:r>
-              <w:rPr>
-                <w:rFonts w:cs="Carlito"/>
-                <w:color w:val="003796"/>
-                <w:sz w:val="22"/>
-              </w:rPr>
-              <w:t xml:space="preserve"> pendengar di induk melayani semua tombol filter; event.target dan closest dipakai benar</w:t>
+              <w:t>☐  Event delegation  satu pendengar di induk melayani semua tombol filter; event.target dan closest dipakai benar</w:t>
             </w:r>
           </w:p>
         </w:tc>
@@ -16556,23 +14730,7 @@
                 <w:rFonts w:cs="Carlito"/>
                 <w:sz w:val="17"/>
               </w:rPr>
-              <w:t xml:space="preserve">Render </w:t>
-            </w:r>
-            <w:proofErr w:type="spellStart"/>
-            <w:r>
-              <w:rPr>
-                <w:rFonts w:cs="Carlito"/>
-                <w:sz w:val="17"/>
-              </w:rPr>
-              <w:t>dari</w:t>
-            </w:r>
-            <w:proofErr w:type="spellEnd"/>
-            <w:r>
-              <w:rPr>
-                <w:rFonts w:cs="Carlito"/>
-                <w:sz w:val="17"/>
-              </w:rPr>
-              <w:t xml:space="preserve"> data</w:t>
+              <w:t>Render dari data</w:t>
             </w:r>
           </w:p>
         </w:tc>
@@ -17123,27 +15281,7 @@
           <w:color w:val="5A6080"/>
           <w:sz w:val="17"/>
         </w:rPr>
-        <w:t xml:space="preserve">Lampiran B — </w:t>
-      </w:r>
-      <w:proofErr w:type="spellStart"/>
-      <w:r>
-        <w:rPr>
-          <w:rFonts w:cs="Carlito"/>
-          <w:i/>
-          <w:color w:val="5A6080"/>
-          <w:sz w:val="17"/>
-        </w:rPr>
-        <w:t>Rujukan</w:t>
-      </w:r>
-      <w:proofErr w:type="spellEnd"/>
-      <w:r>
-        <w:rPr>
-          <w:rFonts w:cs="Carlito"/>
-          <w:i/>
-          <w:color w:val="5A6080"/>
-          <w:sz w:val="17"/>
-        </w:rPr>
-        <w:t xml:space="preserve"> cepat dan kalau macet</w:t>
+        <w:t>Lampiran B — Rujukan cepat dan kalau macet</w:t>
       </w:r>
     </w:p>
     <w:p>
@@ -17793,7 +15931,6 @@
             <w:pPr>
               <w:spacing w:before="20" w:after="20" w:line="252" w:lineRule="auto"/>
             </w:pPr>
-            <w:proofErr w:type="spellStart"/>
             <w:r>
               <w:rPr>
                 <w:rFonts w:cs="Carlito"/>
@@ -17801,7 +15938,6 @@
               </w:rPr>
               <w:t>classList.toggle</w:t>
             </w:r>
-            <w:proofErr w:type="spellEnd"/>
           </w:p>
         </w:tc>
         <w:tc>
@@ -18585,37 +16721,12 @@
             <w:pPr>
               <w:spacing w:before="20" w:after="20" w:line="252" w:lineRule="auto"/>
             </w:pPr>
-            <w:proofErr w:type="spellStart"/>
-            <w:r>
-              <w:rPr>
-                <w:rFonts w:cs="Carlito"/>
-                <w:sz w:val="18"/>
-              </w:rPr>
-              <w:t>Tambahkan</w:t>
-            </w:r>
-            <w:proofErr w:type="spellEnd"/>
-            <w:r>
-              <w:rPr>
-                <w:rFonts w:cs="Carlito"/>
-                <w:sz w:val="18"/>
-              </w:rPr>
-              <w:t xml:space="preserve"> </w:t>
-            </w:r>
-            <w:proofErr w:type="spellStart"/>
-            <w:r>
-              <w:rPr>
-                <w:rFonts w:cs="Carlito"/>
-                <w:sz w:val="18"/>
-              </w:rPr>
-              <w:t>wadah.textContent</w:t>
-            </w:r>
-            <w:proofErr w:type="spellEnd"/>
-            <w:r>
-              <w:rPr>
-                <w:rFonts w:cs="Carlito"/>
-                <w:sz w:val="18"/>
-              </w:rPr>
-              <w:t xml:space="preserve"> = "" di baris pertama render</w:t>
+            <w:r>
+              <w:rPr>
+                <w:rFonts w:cs="Carlito"/>
+                <w:sz w:val="18"/>
+              </w:rPr>
+              <w:t>Tambahkan wadah.textContent = "" di baris pertama render</w:t>
             </w:r>
           </w:p>
         </w:tc>
@@ -18748,33 +16859,8 @@
                 <w:rFonts w:cs="Carlito"/>
                 <w:sz w:val="18"/>
               </w:rPr>
-              <w:t xml:space="preserve">Isi </w:t>
-            </w:r>
-            <w:proofErr w:type="spellStart"/>
-            <w:r>
-              <w:rPr>
-                <w:rFonts w:cs="Carlito"/>
-                <w:sz w:val="18"/>
-              </w:rPr>
-              <w:t>dimasukkan</w:t>
-            </w:r>
-            <w:proofErr w:type="spellEnd"/>
-            <w:r>
-              <w:rPr>
-                <w:rFonts w:cs="Carlito"/>
-                <w:sz w:val="18"/>
-              </w:rPr>
-              <w:t xml:space="preserve"> dengan </w:t>
-            </w:r>
-            <w:proofErr w:type="spellStart"/>
-            <w:r>
-              <w:rPr>
-                <w:rFonts w:cs="Carlito"/>
-                <w:sz w:val="18"/>
-              </w:rPr>
-              <w:t>innerHTML</w:t>
-            </w:r>
-            <w:proofErr w:type="spellEnd"/>
+              <w:t>Isi dimasukkan dengan innerHTML</w:t>
+            </w:r>
           </w:p>
         </w:tc>
         <w:tc>
@@ -18929,39 +17015,7 @@
                 <w:rFonts w:cs="Carlito"/>
                 <w:sz w:val="18"/>
               </w:rPr>
-              <w:t xml:space="preserve">Isi </w:t>
-            </w:r>
-            <w:proofErr w:type="spellStart"/>
-            <w:r>
-              <w:rPr>
-                <w:rFonts w:cs="Carlito"/>
-                <w:sz w:val="18"/>
-              </w:rPr>
-              <w:t>diperiksa</w:t>
-            </w:r>
-            <w:proofErr w:type="spellEnd"/>
-            <w:r>
-              <w:rPr>
-                <w:rFonts w:cs="Carlito"/>
-                <w:sz w:val="18"/>
-              </w:rPr>
-              <w:t xml:space="preserve"> </w:t>
-            </w:r>
-            <w:proofErr w:type="spellStart"/>
-            <w:r>
-              <w:rPr>
-                <w:rFonts w:cs="Carlito"/>
-                <w:sz w:val="18"/>
-              </w:rPr>
-              <w:t>tanpa</w:t>
-            </w:r>
-            <w:proofErr w:type="spellEnd"/>
-            <w:r>
-              <w:rPr>
-                <w:rFonts w:cs="Carlito"/>
-                <w:sz w:val="18"/>
-              </w:rPr>
-              <w:t xml:space="preserve"> trim()</w:t>
+              <w:t>Isi diperiksa tanpa trim()</w:t>
             </w:r>
           </w:p>
         </w:tc>
@@ -19097,53 +17151,12 @@
             <w:pPr>
               <w:spacing w:before="20" w:after="20" w:line="252" w:lineRule="auto"/>
             </w:pPr>
-            <w:proofErr w:type="spellStart"/>
-            <w:r>
-              <w:rPr>
-                <w:rFonts w:cs="Carlito"/>
-                <w:sz w:val="18"/>
-              </w:rPr>
-              <w:t>Perubahan</w:t>
-            </w:r>
-            <w:proofErr w:type="spellEnd"/>
-            <w:r>
-              <w:rPr>
-                <w:rFonts w:cs="Carlito"/>
-                <w:sz w:val="18"/>
-              </w:rPr>
-              <w:t xml:space="preserve"> pada </w:t>
-            </w:r>
-            <w:proofErr w:type="spellStart"/>
-            <w:r>
-              <w:rPr>
-                <w:rFonts w:cs="Carlito"/>
-                <w:sz w:val="18"/>
-              </w:rPr>
-              <w:t>salinan</w:t>
-            </w:r>
-            <w:proofErr w:type="spellEnd"/>
-            <w:r>
-              <w:rPr>
-                <w:rFonts w:cs="Carlito"/>
-                <w:sz w:val="18"/>
-              </w:rPr>
-              <w:t xml:space="preserve"> </w:t>
-            </w:r>
-            <w:proofErr w:type="spellStart"/>
-            <w:r>
-              <w:rPr>
-                <w:rFonts w:cs="Carlito"/>
-                <w:sz w:val="18"/>
-              </w:rPr>
-              <w:t>ikut</w:t>
-            </w:r>
-            <w:proofErr w:type="spellEnd"/>
-            <w:r>
-              <w:rPr>
-                <w:rFonts w:cs="Carlito"/>
-                <w:sz w:val="18"/>
-              </w:rPr>
-              <w:t xml:space="preserve"> mengubah data asli</w:t>
+            <w:r>
+              <w:rPr>
+                <w:rFonts w:cs="Carlito"/>
+                <w:sz w:val="18"/>
+              </w:rPr>
+              <w:t>Perubahan pada salinan ikut mengubah data asli</w:t>
             </w:r>
           </w:p>
         </w:tc>
@@ -19454,23 +17467,7 @@
                 <w:rFonts w:cs="Carlito"/>
                 <w:sz w:val="18"/>
               </w:rPr>
-              <w:t xml:space="preserve">Setiap kali selesai </w:t>
-            </w:r>
-            <w:proofErr w:type="spellStart"/>
-            <w:r>
-              <w:rPr>
-                <w:rFonts w:cs="Carlito"/>
-                <w:sz w:val="18"/>
-              </w:rPr>
-              <w:t>satu</w:t>
-            </w:r>
-            <w:proofErr w:type="spellEnd"/>
-            <w:r>
-              <w:rPr>
-                <w:rFonts w:cs="Carlito"/>
-                <w:sz w:val="18"/>
-              </w:rPr>
-              <w:t xml:space="preserve"> lembar</w:t>
+              <w:t>Setiap kali selesai satu lembar</w:t>
             </w:r>
           </w:p>
         </w:tc>
@@ -19766,19 +17763,8 @@
                 <w:color w:val="FFFFFF"/>
                 <w:sz w:val="19"/>
               </w:rPr>
-              <w:t xml:space="preserve">Kalau ini </w:t>
-            </w:r>
-            <w:proofErr w:type="spellStart"/>
-            <w:r>
-              <w:rPr>
-                <w:rFonts w:cs="Carlito"/>
-                <w:b/>
-                <w:color w:val="FFFFFF"/>
-                <w:sz w:val="19"/>
-              </w:rPr>
-              <w:t>terjadi</w:t>
-            </w:r>
-            <w:proofErr w:type="spellEnd"/>
+              <w:t>Kalau ini terjadi</w:t>
+            </w:r>
           </w:p>
         </w:tc>
         <w:tc>
@@ -20070,43 +18056,7 @@
         <w:color w:val="5A6080"/>
         <w:sz w:val="15"/>
       </w:rPr>
-      <w:t xml:space="preserve">PABW 2026/2027  ·  </w:t>
-    </w:r>
-    <w:proofErr w:type="spellStart"/>
-    <w:r>
-      <w:rPr>
-        <w:rFonts w:cs="Carlito"/>
-        <w:color w:val="5A6080"/>
-        <w:sz w:val="15"/>
-      </w:rPr>
-      <w:t>Pertemuan</w:t>
-    </w:r>
-    <w:proofErr w:type="spellEnd"/>
-    <w:r>
-      <w:rPr>
-        <w:rFonts w:cs="Carlito"/>
-        <w:color w:val="5A6080"/>
-        <w:sz w:val="15"/>
-      </w:rPr>
-      <w:t xml:space="preserve"> 9  ·  DOM, Event, dan </w:t>
-    </w:r>
-    <w:proofErr w:type="spellStart"/>
-    <w:r>
-      <w:rPr>
-        <w:rFonts w:cs="Carlito"/>
-        <w:color w:val="5A6080"/>
-        <w:sz w:val="15"/>
-      </w:rPr>
-      <w:t>Interaktivitas</w:t>
-    </w:r>
-    <w:proofErr w:type="spellEnd"/>
-    <w:r>
-      <w:rPr>
-        <w:rFonts w:cs="Carlito"/>
-        <w:color w:val="5A6080"/>
-        <w:sz w:val="15"/>
-      </w:rPr>
-      <w:t xml:space="preserve">  ·  Universitas Islam Indonesia  ·  halaman</w:t>
+      <w:t>PABW 2026/2027  ·  Pertemuan 9  ·  DOM, Event, dan Interaktivitas  ·  Universitas Islam Indonesia  ·  halaman</w:t>
     </w:r>
     <w:r>
       <w:fldChar w:fldCharType="begin"/>

</xml_diff>

<commit_message>
P9 — periksa, lalu simpan
</commit_message>
<xml_diff>
--- a/9. Worksheet_PABW_Pertemuan9 - ID.docx
+++ b/9. Worksheet_PABW_Pertemuan9 - ID.docx
@@ -12493,7 +12493,67 @@
               <w:right w:val="single" w:sz="4" w:space="0" w:color="B9C6E2"/>
             </w:tcBorders>
           </w:tcPr>
-          <w:p/>
+          <w:p>
+            <w:pPr>
+              <w:rPr>
+                <w:lang w:val="en-ID"/>
+              </w:rPr>
+            </w:pPr>
+            <w:r>
+              <w:rPr>
+                <w:lang w:val="en-ID"/>
+              </w:rPr>
+              <w:t>‘Const wadah =’ sebagai</w:t>
+            </w:r>
+            <w:r>
+              <w:rPr>
+                <w:lang w:val="en-ID"/>
+              </w:rPr>
+              <w:t xml:space="preserve"> variabel</w:t>
+            </w:r>
+            <w:r>
+              <w:rPr>
+                <w:lang w:val="en-ID"/>
+              </w:rPr>
+              <w:t xml:space="preserve"> tem</w:t>
+            </w:r>
+            <w:r>
+              <w:rPr>
+                <w:lang w:val="en-ID"/>
+              </w:rPr>
+              <w:t xml:space="preserve">pat hasil, ‘#daftar-proyek’ sebagai pemilih/selector, dan </w:t>
+            </w:r>
+            <w:r>
+              <w:rPr>
+                <w:lang w:val="en-ID"/>
+              </w:rPr>
+              <w:t>‘</w:t>
+            </w:r>
+            <w:r>
+              <w:rPr>
+                <w:lang w:val="en-ID"/>
+              </w:rPr>
+              <w:t>&lt;ul id="daftar-proyek"</w:t>
+            </w:r>
+            <w:r>
+              <w:rPr>
+                <w:lang w:val="en-ID"/>
+              </w:rPr>
+              <w:t xml:space="preserve"> …&gt;&lt;/ul&gt;</w:t>
+            </w:r>
+            <w:r>
+              <w:rPr>
+                <w:lang w:val="en-ID"/>
+              </w:rPr>
+              <w:t>’</w:t>
+            </w:r>
+            <w:r>
+              <w:rPr>
+                <w:lang w:val="en-ID"/>
+              </w:rPr>
+              <w:t xml:space="preserve"> sebagai elemen pada html.</w:t>
+            </w:r>
+          </w:p>
         </w:tc>
       </w:tr>
       <w:tr>
@@ -12510,13 +12570,22 @@
               <w:right w:val="single" w:sz="4" w:space="0" w:color="B9C6E2"/>
             </w:tcBorders>
           </w:tcPr>
-          <w:p/>
+          <w:p>
+            <w:pPr>
+              <w:rPr>
+                <w:lang w:val="en-ID"/>
+              </w:rPr>
+            </w:pPr>
+          </w:p>
         </w:tc>
       </w:tr>
     </w:tbl>
     <w:p>
       <w:pPr>
         <w:spacing w:after="60"/>
+        <w:rPr>
+          <w:lang w:val="en-ID"/>
+        </w:rPr>
       </w:pPr>
     </w:p>
     <w:p>
@@ -12555,7 +12624,26 @@
               <w:right w:val="single" w:sz="4" w:space="0" w:color="B9C6E2"/>
             </w:tcBorders>
           </w:tcPr>
-          <w:p/>
+          <w:p>
+            <w:r>
+              <w:t>querySelector</w:t>
+            </w:r>
+            <w:r>
+              <w:t xml:space="preserve"> mengembalikan elemen pertama yang cocok (null jika tidak ada), sementara </w:t>
+            </w:r>
+            <w:r>
+              <w:t>querySelectorAll</w:t>
+            </w:r>
+            <w:r>
+              <w:t xml:space="preserve"> mengembalikan seluruh nilai cocok sebagai </w:t>
+            </w:r>
+            <w:r>
+              <w:t>NodeList</w:t>
+            </w:r>
+            <w:r>
+              <w:t>.</w:t>
+            </w:r>
+          </w:p>
         </w:tc>
       </w:tr>
       <w:tr>
@@ -12572,7 +12660,17 @@
               <w:right w:val="single" w:sz="4" w:space="0" w:color="B9C6E2"/>
             </w:tcBorders>
           </w:tcPr>
-          <w:p/>
+          <w:p>
+            <w:r>
+              <w:t>NodeList</w:t>
+            </w:r>
+            <w:r>
+              <w:t xml:space="preserve"> tidak menyediakan array seperti .map(), jadi perlu dikonversi dengan </w:t>
+            </w:r>
+            <w:r>
+              <w:t>Array.from(...)</w:t>
+            </w:r>
+          </w:p>
         </w:tc>
       </w:tr>
     </w:tbl>
@@ -12627,6 +12725,30 @@
                 <w:lang w:val="de-DE"/>
               </w:rPr>
             </w:pPr>
+            <w:r>
+              <w:rPr>
+                <w:lang w:val="de-DE"/>
+              </w:rPr>
+              <w:t>Untuk mengendalikan klik dari semua tombol filter yang ada</w:t>
+            </w:r>
+            <w:r>
+              <w:rPr>
+                <w:lang w:val="de-DE"/>
+              </w:rPr>
+              <w:t xml:space="preserve">, tidak perlu memasang pendengar untuk </w:t>
+            </w:r>
+            <w:r>
+              <w:rPr>
+                <w:lang w:val="de-DE"/>
+              </w:rPr>
+              <w:t xml:space="preserve">setiap tombol. </w:t>
+            </w:r>
+            <w:r>
+              <w:rPr>
+                <w:lang w:val="en-ID"/>
+              </w:rPr>
+              <w:t>Bagian pada kode saya:</w:t>
+            </w:r>
           </w:p>
         </w:tc>
       </w:tr>
@@ -12647,9 +12769,33 @@
           <w:p>
             <w:pPr>
               <w:rPr>
-                <w:lang w:val="de-DE"/>
-              </w:rPr>
-            </w:pPr>
+                <w:lang w:val="en-ID"/>
+              </w:rPr>
+            </w:pPr>
+            <w:r>
+              <w:rPr>
+                <w:lang w:val="en-ID"/>
+              </w:rPr>
+              <w:t>barisFilter.addEventListener("click", ...)</w:t>
+            </w:r>
+            <w:r>
+              <w:rPr>
+                <w:lang w:val="en-ID"/>
+              </w:rPr>
+              <w:t xml:space="preserve"> dengan </w:t>
+            </w:r>
+            <w:r>
+              <w:rPr>
+                <w:lang w:val="en-ID"/>
+              </w:rPr>
+              <w:t xml:space="preserve">event.target.closest("button") </w:t>
+            </w:r>
+            <w:r>
+              <w:rPr>
+                <w:lang w:val="en-ID"/>
+              </w:rPr>
+              <w:t>pada dom.js</w:t>
+            </w:r>
           </w:p>
         </w:tc>
       </w:tr>
@@ -12658,7 +12804,7 @@
       <w:pPr>
         <w:spacing w:after="60"/>
         <w:rPr>
-          <w:lang w:val="de-DE"/>
+          <w:lang w:val="en-ID"/>
         </w:rPr>
       </w:pPr>
     </w:p>
@@ -12706,7 +12852,37 @@
               <w:right w:val="single" w:sz="4" w:space="0" w:color="B9C6E2"/>
             </w:tcBorders>
           </w:tcPr>
-          <w:p/>
+          <w:p>
+            <w:pPr>
+              <w:rPr>
+                <w:lang w:val="de-DE"/>
+              </w:rPr>
+            </w:pPr>
+            <w:r>
+              <w:rPr>
+                <w:lang w:val="de-DE"/>
+              </w:rPr>
+              <w:t>Saat tombol filter diklik</w:t>
+            </w:r>
+            <w:r>
+              <w:rPr>
+                <w:lang w:val="de-DE"/>
+              </w:rPr>
+              <w:t xml:space="preserve"> secara</w:t>
+            </w:r>
+            <w:r>
+              <w:rPr>
+                <w:lang w:val="de-DE"/>
+              </w:rPr>
+              <w:t xml:space="preserve"> b</w:t>
+            </w:r>
+            <w:r>
+              <w:rPr>
+                <w:lang w:val="de-DE"/>
+              </w:rPr>
+              <w:t xml:space="preserve">erulang, kartu lama tidak akan hilang. Jadi, hasil dari filter akan terus </w:t>
+            </w:r>
+          </w:p>
         </w:tc>
       </w:tr>
       <w:tr>
@@ -12723,13 +12899,34 @@
               <w:right w:val="single" w:sz="4" w:space="0" w:color="B9C6E2"/>
             </w:tcBorders>
           </w:tcPr>
-          <w:p/>
+          <w:p>
+            <w:pPr>
+              <w:rPr>
+                <w:lang w:val="de-DE"/>
+              </w:rPr>
+            </w:pPr>
+            <w:r>
+              <w:rPr>
+                <w:lang w:val="de-DE"/>
+              </w:rPr>
+              <w:t>terakumulasi dan dapat terduplikasi</w:t>
+            </w:r>
+            <w:r>
+              <w:rPr>
+                <w:lang w:val="de-DE"/>
+              </w:rPr>
+              <w:t>.</w:t>
+            </w:r>
+          </w:p>
         </w:tc>
       </w:tr>
     </w:tbl>
     <w:p>
       <w:pPr>
         <w:spacing w:after="60"/>
+        <w:rPr>
+          <w:lang w:val="de-DE"/>
+        </w:rPr>
       </w:pPr>
     </w:p>
     <w:p>
@@ -12776,7 +12973,29 @@
               <w:right w:val="single" w:sz="4" w:space="0" w:color="B9C6E2"/>
             </w:tcBorders>
           </w:tcPr>
-          <w:p/>
+          <w:p>
+            <w:r>
+              <w:t xml:space="preserve">innerHTML mengurai string sebagai HTML yang dapat mengubah konten tidak terpercaya menjadi </w:t>
+            </w:r>
+            <w:r>
+              <w:t>mar</w:t>
+            </w:r>
+            <w:r>
+              <w:t>kup</w:t>
+            </w:r>
+            <w:r>
+              <w:t xml:space="preserve">. </w:t>
+            </w:r>
+            <w:r>
+              <w:t xml:space="preserve">Saya menggunakan </w:t>
+            </w:r>
+            <w:r>
+              <w:t>li.textContent = proyek.judul;</w:t>
+            </w:r>
+            <w:r>
+              <w:t xml:space="preserve"> untuk membuat judul diperlakukan sebagai </w:t>
+            </w:r>
+          </w:p>
         </w:tc>
       </w:tr>
       <w:tr>
@@ -12793,7 +13012,14 @@
               <w:right w:val="single" w:sz="4" w:space="0" w:color="B9C6E2"/>
             </w:tcBorders>
           </w:tcPr>
-          <w:p/>
+          <w:p>
+            <w:r>
+              <w:t>teks</w:t>
+            </w:r>
+            <w:r>
+              <w:t>.</w:t>
+            </w:r>
+          </w:p>
         </w:tc>
       </w:tr>
     </w:tbl>
@@ -12860,12 +13086,21 @@
             </w:pPr>
             <w:r>
               <w:rPr>
-                <w:rFonts w:cs="Carlito"/>
+                <w:rFonts w:ascii="Segoe UI Symbol" w:hAnsi="Segoe UI Symbol" w:cs="Segoe UI Symbol"/>
                 <w:color w:val="003796"/>
                 <w:sz w:val="22"/>
                 <w:lang w:val="de-DE"/>
               </w:rPr>
-              <w:t>☐  Berkas  profil.html, seluruh CSS, js/app.js, dan js/dom.js ada di repositori dan terbuka tanpa galat di Console</w:t>
+              <w:t>☑</w:t>
+            </w:r>
+            <w:r>
+              <w:rPr>
+                <w:rFonts w:cs="Carlito"/>
+                <w:color w:val="003796"/>
+                <w:sz w:val="22"/>
+                <w:lang w:val="de-DE"/>
+              </w:rPr>
+              <w:t xml:space="preserve">  Berkas  profil.html, seluruh CSS, js/app.js, dan js/dom.js ada di repositori dan terbuka tanpa galat di Console</w:t>
             </w:r>
           </w:p>
         </w:tc>
@@ -12890,12 +13125,21 @@
             </w:pPr>
             <w:r>
               <w:rPr>
-                <w:rFonts w:cs="Carlito"/>
+                <w:rFonts w:ascii="Segoe UI Symbol" w:hAnsi="Segoe UI Symbol" w:cs="Segoe UI Symbol"/>
                 <w:color w:val="003796"/>
                 <w:sz w:val="22"/>
                 <w:lang w:val="de-DE"/>
               </w:rPr>
-              <w:t>☐  Pemilih  setiap pemilih menghasilkan elemen; tidak ada satu pun yang bernilai null</w:t>
+              <w:t>☑</w:t>
+            </w:r>
+            <w:r>
+              <w:rPr>
+                <w:rFonts w:cs="Carlito"/>
+                <w:color w:val="003796"/>
+                <w:sz w:val="22"/>
+                <w:lang w:val="de-DE"/>
+              </w:rPr>
+              <w:t xml:space="preserve">  Pemilih  setiap pemilih menghasilkan elemen; tidak ada satu pun yang bernilai null</w:t>
             </w:r>
           </w:p>
         </w:tc>
@@ -12917,11 +13161,19 @@
             </w:pPr>
             <w:r>
               <w:rPr>
-                <w:rFonts w:cs="Carlito"/>
+                <w:rFonts w:ascii="Segoe UI Symbol" w:hAnsi="Segoe UI Symbol" w:cs="Segoe UI Symbol"/>
                 <w:color w:val="003796"/>
                 <w:sz w:val="22"/>
               </w:rPr>
-              <w:t>☐  Render dari data  daftar proyek terbentuk dari array dengan createElement dan textContent, bukan dari HTML yang ditulis tangan</w:t>
+              <w:t>☑</w:t>
+            </w:r>
+            <w:r>
+              <w:rPr>
+                <w:rFonts w:cs="Carlito"/>
+                <w:color w:val="003796"/>
+                <w:sz w:val="22"/>
+              </w:rPr>
+              <w:t xml:space="preserve">  Render dari data  daftar proyek terbentuk dari array dengan createElement dan textContent, bukan dari HTML yang ditulis tangan</w:t>
             </w:r>
           </w:p>
         </w:tc>
@@ -12946,12 +13198,22 @@
             </w:pPr>
             <w:r>
               <w:rPr>
-                <w:rFonts w:cs="Carlito"/>
+                <w:rFonts w:ascii="Segoe UI Symbol" w:hAnsi="Segoe UI Symbol" w:cs="Segoe UI Symbol"/>
                 <w:color w:val="003796"/>
                 <w:sz w:val="22"/>
                 <w:lang w:val="de-DE"/>
               </w:rPr>
-              <w:t>☐  Wadah  dikosongkan di baris pertama fungsi render, sehingga kartu tidak pernah berlipat</w:t>
+              <w:lastRenderedPageBreak/>
+              <w:t>☑</w:t>
+            </w:r>
+            <w:r>
+              <w:rPr>
+                <w:rFonts w:cs="Carlito"/>
+                <w:color w:val="003796"/>
+                <w:sz w:val="22"/>
+                <w:lang w:val="de-DE"/>
+              </w:rPr>
+              <w:t xml:space="preserve">  Wadah  dikosongkan di baris pertama fungsi render, sehingga kartu tidak pernah berlipat</w:t>
             </w:r>
           </w:p>
         </w:tc>
@@ -12973,11 +13235,19 @@
             </w:pPr>
             <w:r>
               <w:rPr>
-                <w:rFonts w:cs="Carlito"/>
+                <w:rFonts w:ascii="Segoe UI Symbol" w:hAnsi="Segoe UI Symbol" w:cs="Segoe UI Symbol"/>
                 <w:color w:val="003796"/>
                 <w:sz w:val="22"/>
               </w:rPr>
-              <w:t>☐  Event delegation  satu pendengar di induk melayani semua tombol filter; event.target dan closest dipakai benar</w:t>
+              <w:t>☑</w:t>
+            </w:r>
+            <w:r>
+              <w:rPr>
+                <w:rFonts w:cs="Carlito"/>
+                <w:color w:val="003796"/>
+                <w:sz w:val="22"/>
+              </w:rPr>
+              <w:t xml:space="preserve">  Event delegation  satu pendengar di induk melayani semua tombol filter; event.target dan closest dipakai benar</w:t>
             </w:r>
           </w:p>
         </w:tc>
@@ -12999,11 +13269,19 @@
             </w:pPr>
             <w:r>
               <w:rPr>
-                <w:rFonts w:cs="Carlito"/>
+                <w:rFonts w:ascii="Segoe UI Symbol" w:hAnsi="Segoe UI Symbol" w:cs="Segoe UI Symbol"/>
                 <w:color w:val="003796"/>
                 <w:sz w:val="22"/>
               </w:rPr>
-              <w:t>☐  Keadaan kosong  halaman menampilkan pesan ketika penyaringan tidak menghasilkan isi</w:t>
+              <w:t>☑</w:t>
+            </w:r>
+            <w:r>
+              <w:rPr>
+                <w:rFonts w:cs="Carlito"/>
+                <w:color w:val="003796"/>
+                <w:sz w:val="22"/>
+              </w:rPr>
+              <w:t xml:space="preserve">  Keadaan kosong  halaman menampilkan pesan ketika penyaringan tidak menghasilkan isi</w:t>
             </w:r>
           </w:p>
         </w:tc>
@@ -13025,12 +13303,19 @@
             </w:pPr>
             <w:r>
               <w:rPr>
-                <w:rFonts w:cs="Carlito"/>
+                <w:rFonts w:ascii="Segoe UI Symbol" w:hAnsi="Segoe UI Symbol" w:cs="Segoe UI Symbol"/>
                 <w:color w:val="003796"/>
                 <w:sz w:val="22"/>
               </w:rPr>
-              <w:lastRenderedPageBreak/>
-              <w:t>☐  Validasi form  halaman tidak dimuat ulang, pesan galat muncul per kolom, dan tombol kirim menunggu sampai isinya layak</w:t>
+              <w:t>☑</w:t>
+            </w:r>
+            <w:r>
+              <w:rPr>
+                <w:rFonts w:cs="Carlito"/>
+                <w:color w:val="003796"/>
+                <w:sz w:val="22"/>
+              </w:rPr>
+              <w:t xml:space="preserve">  Validasi form  halaman tidak dimuat ulang, pesan galat muncul per kolom, dan tombol kirim menunggu sampai isinya layak</w:t>
             </w:r>
           </w:p>
         </w:tc>
@@ -13052,11 +13337,19 @@
             </w:pPr>
             <w:r>
               <w:rPr>
-                <w:rFonts w:cs="Carlito"/>
+                <w:rFonts w:ascii="Segoe UI Symbol" w:hAnsi="Segoe UI Symbol" w:cs="Segoe UI Symbol"/>
                 <w:color w:val="003796"/>
                 <w:sz w:val="22"/>
               </w:rPr>
-              <w:t>☐  Deklarasi AI  bagian README menyebutkan bagian mana yang dibantu AI dan bagian mana yang Anda kerjakan sendiri</w:t>
+              <w:t>☑</w:t>
+            </w:r>
+            <w:r>
+              <w:rPr>
+                <w:rFonts w:cs="Carlito"/>
+                <w:color w:val="003796"/>
+                <w:sz w:val="22"/>
+              </w:rPr>
+              <w:t xml:space="preserve">  Deklarasi AI  bagian README menyebutkan bagian mana yang dibantu AI dan bagian mana yang Anda kerjakan sendiri</w:t>
             </w:r>
           </w:p>
         </w:tc>
@@ -13078,11 +13371,19 @@
             </w:pPr>
             <w:r>
               <w:rPr>
-                <w:rFonts w:cs="Carlito"/>
+                <w:rFonts w:ascii="Segoe UI Symbol" w:hAnsi="Segoe UI Symbol" w:cs="Segoe UI Symbol"/>
                 <w:color w:val="003796"/>
                 <w:sz w:val="22"/>
               </w:rPr>
-              <w:t>☐  Git  ada lebih dari satu commit hari ini, dan pesan commit-nya menjelaskan isinya</w:t>
+              <w:t>☑</w:t>
+            </w:r>
+            <w:r>
+              <w:rPr>
+                <w:rFonts w:cs="Carlito"/>
+                <w:color w:val="003796"/>
+                <w:sz w:val="22"/>
+              </w:rPr>
+              <w:t xml:space="preserve">  Git  ada lebih dari satu commit hari ini, dan pesan commit-nya menjelaskan isinya</w:t>
             </w:r>
           </w:p>
         </w:tc>
@@ -13151,6 +13452,36 @@
                 <w:lang w:val="de-DE"/>
               </w:rPr>
             </w:pPr>
+            <w:r>
+              <w:rPr>
+                <w:lang w:val="de-DE"/>
+              </w:rPr>
+              <w:t xml:space="preserve">nilai data-kategori dengan kategori di app.js </w:t>
+            </w:r>
+            <w:r>
+              <w:rPr>
+                <w:lang w:val="de-DE"/>
+              </w:rPr>
+              <w:t xml:space="preserve">harus </w:t>
+            </w:r>
+            <w:r>
+              <w:rPr>
+                <w:lang w:val="de-DE"/>
+              </w:rPr>
+              <w:t>persis</w:t>
+            </w:r>
+            <w:r>
+              <w:rPr>
+                <w:lang w:val="de-DE"/>
+              </w:rPr>
+              <w:t xml:space="preserve">, </w:t>
+            </w:r>
+            <w:r>
+              <w:rPr>
+                <w:lang w:val="de-DE"/>
+              </w:rPr>
+              <w:t xml:space="preserve">karena perbedaan kecil bisa membuat filter </w:t>
+            </w:r>
           </w:p>
         </w:tc>
       </w:tr>
@@ -13174,6 +13505,12 @@
                 <w:lang w:val="de-DE"/>
               </w:rPr>
             </w:pPr>
+            <w:r>
+              <w:rPr>
+                <w:lang w:val="de-DE"/>
+              </w:rPr>
+              <w:t>tidak menemukan proyek.</w:t>
+            </w:r>
           </w:p>
         </w:tc>
       </w:tr>
@@ -13248,12 +13585,21 @@
             </w:pPr>
             <w:r>
               <w:rPr>
-                <w:rFonts w:cs="Carlito"/>
+                <w:rFonts w:ascii="Segoe UI Symbol" w:hAnsi="Segoe UI Symbol" w:cs="Segoe UI Symbol"/>
                 <w:color w:val="003796"/>
                 <w:sz w:val="22"/>
                 <w:lang w:val="de-DE"/>
               </w:rPr>
-              <w:t>☐  Pengungkapan AI  README menyebutkan bagian mana yang dibantu AI dan bagian mana yang saya kerjakan sendiri</w:t>
+              <w:t>☑</w:t>
+            </w:r>
+            <w:r>
+              <w:rPr>
+                <w:rFonts w:cs="Carlito"/>
+                <w:color w:val="003796"/>
+                <w:sz w:val="22"/>
+                <w:lang w:val="de-DE"/>
+              </w:rPr>
+              <w:t xml:space="preserve">  Pengungkapan AI  README menyebutkan bagian mana yang dibantu AI dan bagian mana yang saya kerjakan sendiri</w:t>
             </w:r>
           </w:p>
         </w:tc>
@@ -13278,12 +13624,21 @@
             </w:pPr>
             <w:r>
               <w:rPr>
-                <w:rFonts w:cs="Carlito"/>
+                <w:rFonts w:ascii="Segoe UI Symbol" w:hAnsi="Segoe UI Symbol" w:cs="Segoe UI Symbol"/>
                 <w:color w:val="003796"/>
                 <w:sz w:val="22"/>
                 <w:lang w:val="de-DE"/>
               </w:rPr>
-              <w:t>☐  Keaslian  topik dan isi halaman ini milik saya sendiri, tidak menyalin pekerjaan mahasiswa lain</w:t>
+              <w:t>☑</w:t>
+            </w:r>
+            <w:r>
+              <w:rPr>
+                <w:rFonts w:cs="Carlito"/>
+                <w:color w:val="003796"/>
+                <w:sz w:val="22"/>
+                <w:lang w:val="de-DE"/>
+              </w:rPr>
+              <w:t xml:space="preserve">  Keaslian  topik dan isi halaman ini milik saya sendiri, tidak menyalin pekerjaan mahasiswa lain</w:t>
             </w:r>
           </w:p>
         </w:tc>
@@ -13486,7 +13841,18 @@
           <w:p>
             <w:pPr>
               <w:spacing w:before="20" w:after="20" w:line="252" w:lineRule="auto"/>
-            </w:pPr>
+              <w:rPr>
+                <w:sz w:val="20"/>
+                <w:szCs w:val="20"/>
+              </w:rPr>
+            </w:pPr>
+            <w:r>
+              <w:rPr>
+                <w:sz w:val="20"/>
+                <w:szCs w:val="20"/>
+              </w:rPr>
+              <w:t>20</w:t>
+            </w:r>
           </w:p>
         </w:tc>
         <w:tc>
@@ -13502,7 +13868,120 @@
           <w:p>
             <w:pPr>
               <w:spacing w:before="20" w:after="20" w:line="252" w:lineRule="auto"/>
-            </w:pPr>
+              <w:rPr>
+                <w:sz w:val="20"/>
+                <w:szCs w:val="20"/>
+              </w:rPr>
+            </w:pPr>
+            <w:r>
+              <w:rPr>
+                <w:sz w:val="20"/>
+                <w:szCs w:val="20"/>
+              </w:rPr>
+              <w:t>WSP9/profil.html:133</w:t>
+            </w:r>
+            <w:r>
+              <w:rPr>
+                <w:rFonts w:hint="cs"/>
+                <w:sz w:val="20"/>
+                <w:szCs w:val="20"/>
+              </w:rPr>
+              <w:t>–</w:t>
+            </w:r>
+            <w:r>
+              <w:rPr>
+                <w:sz w:val="20"/>
+                <w:szCs w:val="20"/>
+              </w:rPr>
+              <w:t>141, 149</w:t>
+            </w:r>
+            <w:r>
+              <w:rPr>
+                <w:rFonts w:hint="cs"/>
+                <w:sz w:val="20"/>
+                <w:szCs w:val="20"/>
+              </w:rPr>
+              <w:t>–</w:t>
+            </w:r>
+            <w:r>
+              <w:rPr>
+                <w:sz w:val="20"/>
+                <w:szCs w:val="20"/>
+              </w:rPr>
+              <w:t xml:space="preserve">171 </w:t>
+            </w:r>
+            <w:r>
+              <w:rPr>
+                <w:sz w:val="20"/>
+                <w:szCs w:val="20"/>
+              </w:rPr>
+              <w:t>(</w:t>
+            </w:r>
+            <w:r>
+              <w:rPr>
+                <w:sz w:val="20"/>
+                <w:szCs w:val="20"/>
+              </w:rPr>
+              <w:t>project/filter/form markup</w:t>
+            </w:r>
+            <w:r>
+              <w:rPr>
+                <w:sz w:val="20"/>
+                <w:szCs w:val="20"/>
+              </w:rPr>
+              <w:t>),</w:t>
+            </w:r>
+            <w:r>
+              <w:rPr>
+                <w:sz w:val="20"/>
+                <w:szCs w:val="20"/>
+              </w:rPr>
+              <w:t xml:space="preserve"> WSP9/js/dom.js:3</w:t>
+            </w:r>
+            <w:r>
+              <w:rPr>
+                <w:rFonts w:hint="cs"/>
+                <w:sz w:val="20"/>
+                <w:szCs w:val="20"/>
+              </w:rPr>
+              <w:t>–</w:t>
+            </w:r>
+            <w:r>
+              <w:rPr>
+                <w:sz w:val="20"/>
+                <w:szCs w:val="20"/>
+              </w:rPr>
+              <w:t>4, 35</w:t>
+            </w:r>
+            <w:r>
+              <w:rPr>
+                <w:rFonts w:hint="cs"/>
+                <w:sz w:val="20"/>
+                <w:szCs w:val="20"/>
+              </w:rPr>
+              <w:t>–</w:t>
+            </w:r>
+            <w:r>
+              <w:rPr>
+                <w:sz w:val="20"/>
+                <w:szCs w:val="20"/>
+              </w:rPr>
+              <w:t xml:space="preserve">42 </w:t>
+            </w:r>
+            <w:r>
+              <w:rPr>
+                <w:sz w:val="20"/>
+                <w:szCs w:val="20"/>
+              </w:rPr>
+              <w:t>(selector disimpan dalam variabel)</w:t>
+            </w:r>
+            <w:r>
+              <w:rPr>
+                <w:sz w:val="20"/>
+                <w:szCs w:val="20"/>
+              </w:rPr>
+              <w:t>.</w:t>
+            </w:r>
           </w:p>
         </w:tc>
       </w:tr>
@@ -13571,7 +14050,18 @@
           <w:p>
             <w:pPr>
               <w:spacing w:before="20" w:after="20" w:line="252" w:lineRule="auto"/>
-            </w:pPr>
+              <w:rPr>
+                <w:sz w:val="20"/>
+                <w:szCs w:val="20"/>
+              </w:rPr>
+            </w:pPr>
+            <w:r>
+              <w:rPr>
+                <w:sz w:val="20"/>
+                <w:szCs w:val="20"/>
+              </w:rPr>
+              <w:t>25</w:t>
+            </w:r>
           </w:p>
         </w:tc>
         <w:tc>
@@ -13587,7 +14077,111 @@
           <w:p>
             <w:pPr>
               <w:spacing w:before="20" w:after="20" w:line="252" w:lineRule="auto"/>
-            </w:pPr>
+              <w:rPr>
+                <w:sz w:val="20"/>
+                <w:szCs w:val="20"/>
+              </w:rPr>
+            </w:pPr>
+            <w:r>
+              <w:rPr>
+                <w:sz w:val="20"/>
+                <w:szCs w:val="20"/>
+              </w:rPr>
+              <w:t>WSP9/js/app.js:14</w:t>
+            </w:r>
+            <w:r>
+              <w:rPr>
+                <w:rFonts w:hint="cs"/>
+                <w:sz w:val="20"/>
+                <w:szCs w:val="20"/>
+              </w:rPr>
+              <w:t>–</w:t>
+            </w:r>
+            <w:r>
+              <w:rPr>
+                <w:sz w:val="20"/>
+                <w:szCs w:val="20"/>
+              </w:rPr>
+              <w:t>27</w:t>
+            </w:r>
+            <w:r>
+              <w:rPr>
+                <w:sz w:val="20"/>
+                <w:szCs w:val="20"/>
+              </w:rPr>
+              <w:t xml:space="preserve"> (data proyek), </w:t>
+            </w:r>
+            <w:r>
+              <w:rPr>
+                <w:sz w:val="20"/>
+                <w:szCs w:val="20"/>
+              </w:rPr>
+              <w:t>WSP9/js/dom.js:7</w:t>
+            </w:r>
+            <w:r>
+              <w:rPr>
+                <w:rFonts w:hint="cs"/>
+                <w:sz w:val="20"/>
+                <w:szCs w:val="20"/>
+              </w:rPr>
+              <w:t>–</w:t>
+            </w:r>
+            <w:r>
+              <w:rPr>
+                <w:sz w:val="20"/>
+                <w:szCs w:val="20"/>
+              </w:rPr>
+              <w:t>17</w:t>
+            </w:r>
+            <w:r>
+              <w:rPr>
+                <w:sz w:val="20"/>
+                <w:szCs w:val="20"/>
+              </w:rPr>
+              <w:t xml:space="preserve"> (membuat kartu dengan </w:t>
+            </w:r>
+            <w:r>
+              <w:rPr>
+                <w:sz w:val="20"/>
+                <w:szCs w:val="20"/>
+              </w:rPr>
+              <w:t>createElement</w:t>
+            </w:r>
+            <w:r>
+              <w:rPr>
+                <w:sz w:val="20"/>
+                <w:szCs w:val="20"/>
+              </w:rPr>
+              <w:t xml:space="preserve"> dan </w:t>
+            </w:r>
+            <w:r>
+              <w:rPr>
+                <w:sz w:val="20"/>
+                <w:szCs w:val="20"/>
+              </w:rPr>
+              <w:t>textContent</w:t>
+            </w:r>
+            <w:r>
+              <w:rPr>
+                <w:sz w:val="20"/>
+                <w:szCs w:val="20"/>
+              </w:rPr>
+              <w:t xml:space="preserve">, menghapus list dengan </w:t>
+            </w:r>
+            <w:r>
+              <w:rPr>
+                <w:sz w:val="20"/>
+                <w:szCs w:val="20"/>
+              </w:rPr>
+              <w:t>replaceChildren()</w:t>
+            </w:r>
+            <w:r>
+              <w:rPr>
+                <w:sz w:val="20"/>
+                <w:szCs w:val="20"/>
+              </w:rPr>
+              <w:t>, dan render data).</w:t>
+            </w:r>
           </w:p>
         </w:tc>
       </w:tr>
@@ -13656,7 +14250,18 @@
           <w:p>
             <w:pPr>
               <w:spacing w:before="20" w:after="20" w:line="252" w:lineRule="auto"/>
-            </w:pPr>
+              <w:rPr>
+                <w:sz w:val="20"/>
+                <w:szCs w:val="20"/>
+              </w:rPr>
+            </w:pPr>
+            <w:r>
+              <w:rPr>
+                <w:sz w:val="20"/>
+                <w:szCs w:val="20"/>
+              </w:rPr>
+              <w:t>25</w:t>
+            </w:r>
           </w:p>
         </w:tc>
         <w:tc>
@@ -13672,7 +14277,94 @@
           <w:p>
             <w:pPr>
               <w:spacing w:before="20" w:after="20" w:line="252" w:lineRule="auto"/>
-            </w:pPr>
+              <w:rPr>
+                <w:sz w:val="20"/>
+                <w:szCs w:val="20"/>
+                <w:lang w:val="en-ID"/>
+              </w:rPr>
+            </w:pPr>
+            <w:r>
+              <w:rPr>
+                <w:sz w:val="20"/>
+                <w:szCs w:val="20"/>
+                <w:lang w:val="en-ID"/>
+              </w:rPr>
+              <w:t>WSP9/profil.html:133</w:t>
+            </w:r>
+            <w:r>
+              <w:rPr>
+                <w:rFonts w:hint="cs"/>
+                <w:sz w:val="20"/>
+                <w:szCs w:val="20"/>
+                <w:lang w:val="en-ID"/>
+              </w:rPr>
+              <w:t>–</w:t>
+            </w:r>
+            <w:r>
+              <w:rPr>
+                <w:sz w:val="20"/>
+                <w:szCs w:val="20"/>
+                <w:lang w:val="en-ID"/>
+              </w:rPr>
+              <w:t>138</w:t>
+            </w:r>
+            <w:r>
+              <w:rPr>
+                <w:sz w:val="20"/>
+                <w:szCs w:val="20"/>
+                <w:lang w:val="en-ID"/>
+              </w:rPr>
+              <w:t xml:space="preserve"> (tombol filter), </w:t>
+            </w:r>
+            <w:r>
+              <w:rPr>
+                <w:sz w:val="20"/>
+                <w:szCs w:val="20"/>
+                <w:lang w:val="en-ID"/>
+              </w:rPr>
+              <w:t>WSP9/js/dom.js:21</w:t>
+            </w:r>
+            <w:r>
+              <w:rPr>
+                <w:rFonts w:hint="cs"/>
+                <w:sz w:val="20"/>
+                <w:szCs w:val="20"/>
+                <w:lang w:val="en-ID"/>
+              </w:rPr>
+              <w:t>–</w:t>
+            </w:r>
+            <w:r>
+              <w:rPr>
+                <w:sz w:val="20"/>
+                <w:szCs w:val="20"/>
+                <w:lang w:val="en-ID"/>
+              </w:rPr>
+              <w:t>33</w:t>
+            </w:r>
+            <w:r>
+              <w:rPr>
+                <w:sz w:val="20"/>
+                <w:szCs w:val="20"/>
+                <w:lang w:val="en-ID"/>
+              </w:rPr>
+              <w:t xml:space="preserve"> (satu pendengar pada parent, </w:t>
+            </w:r>
+            <w:r>
+              <w:rPr>
+                <w:sz w:val="20"/>
+                <w:szCs w:val="20"/>
+                <w:lang w:val="en-ID"/>
+              </w:rPr>
+              <w:t>event.target.closest("button")</w:t>
+            </w:r>
+            <w:r>
+              <w:rPr>
+                <w:sz w:val="20"/>
+                <w:szCs w:val="20"/>
+                <w:lang w:val="en-ID"/>
+              </w:rPr>
+              <w:t>, dan filter kategori).</w:t>
+            </w:r>
           </w:p>
         </w:tc>
       </w:tr>
@@ -13741,7 +14433,18 @@
           <w:p>
             <w:pPr>
               <w:spacing w:before="20" w:after="20" w:line="252" w:lineRule="auto"/>
-            </w:pPr>
+              <w:rPr>
+                <w:sz w:val="20"/>
+                <w:szCs w:val="20"/>
+              </w:rPr>
+            </w:pPr>
+            <w:r>
+              <w:rPr>
+                <w:sz w:val="20"/>
+                <w:szCs w:val="20"/>
+              </w:rPr>
+              <w:t>20</w:t>
+            </w:r>
           </w:p>
         </w:tc>
         <w:tc>
@@ -13757,7 +14460,111 @@
           <w:p>
             <w:pPr>
               <w:spacing w:before="20" w:after="20" w:line="252" w:lineRule="auto"/>
-            </w:pPr>
+              <w:rPr>
+                <w:sz w:val="20"/>
+                <w:szCs w:val="20"/>
+              </w:rPr>
+            </w:pPr>
+            <w:r>
+              <w:rPr>
+                <w:sz w:val="20"/>
+                <w:szCs w:val="20"/>
+              </w:rPr>
+              <w:t>WSP9/profil.html:149</w:t>
+            </w:r>
+            <w:r>
+              <w:rPr>
+                <w:rFonts w:hint="cs"/>
+                <w:sz w:val="20"/>
+                <w:szCs w:val="20"/>
+              </w:rPr>
+              <w:t>–</w:t>
+            </w:r>
+            <w:r>
+              <w:rPr>
+                <w:sz w:val="20"/>
+                <w:szCs w:val="20"/>
+              </w:rPr>
+              <w:t>171</w:t>
+            </w:r>
+            <w:r>
+              <w:rPr>
+                <w:sz w:val="20"/>
+                <w:szCs w:val="20"/>
+              </w:rPr>
+              <w:t xml:space="preserve"> (form dan kolom), </w:t>
+            </w:r>
+            <w:r>
+              <w:rPr>
+                <w:sz w:val="20"/>
+                <w:szCs w:val="20"/>
+              </w:rPr>
+              <w:t>WSP9/js/dom.js:35</w:t>
+            </w:r>
+            <w:r>
+              <w:rPr>
+                <w:rFonts w:hint="cs"/>
+                <w:sz w:val="20"/>
+                <w:szCs w:val="20"/>
+              </w:rPr>
+              <w:t>–</w:t>
+            </w:r>
+            <w:r>
+              <w:rPr>
+                <w:sz w:val="20"/>
+                <w:szCs w:val="20"/>
+              </w:rPr>
+              <w:t>78</w:t>
+            </w:r>
+            <w:r>
+              <w:rPr>
+                <w:sz w:val="20"/>
+                <w:szCs w:val="20"/>
+              </w:rPr>
+              <w:t xml:space="preserve"> (validasi dan event handlers), </w:t>
+            </w:r>
+            <w:r>
+              <w:rPr>
+                <w:sz w:val="20"/>
+                <w:szCs w:val="20"/>
+              </w:rPr>
+              <w:t>WSP9/komponen.css</w:t>
+            </w:r>
+            <w:r>
+              <w:rPr>
+                <w:sz w:val="20"/>
+                <w:szCs w:val="20"/>
+              </w:rPr>
+              <w:t xml:space="preserve"> (pesan galat dan </w:t>
+            </w:r>
+            <w:r>
+              <w:rPr>
+                <w:sz w:val="20"/>
+                <w:szCs w:val="20"/>
+              </w:rPr>
+              <w:t xml:space="preserve">gaya </w:t>
+            </w:r>
+            <w:r>
+              <w:rPr>
+                <w:sz w:val="20"/>
+                <w:szCs w:val="20"/>
+              </w:rPr>
+              <w:t>invalid-field</w:t>
+            </w:r>
+            <w:r>
+              <w:rPr>
+                <w:sz w:val="20"/>
+                <w:szCs w:val="20"/>
+              </w:rPr>
+              <w:t>)</w:t>
+            </w:r>
+            <w:r>
+              <w:rPr>
+                <w:sz w:val="20"/>
+                <w:szCs w:val="20"/>
+              </w:rPr>
+              <w:t>.</w:t>
+            </w:r>
           </w:p>
         </w:tc>
       </w:tr>
@@ -13830,7 +14637,18 @@
           <w:p>
             <w:pPr>
               <w:spacing w:before="20" w:after="20" w:line="252" w:lineRule="auto"/>
-            </w:pPr>
+              <w:rPr>
+                <w:sz w:val="20"/>
+                <w:szCs w:val="20"/>
+              </w:rPr>
+            </w:pPr>
+            <w:r>
+              <w:rPr>
+                <w:sz w:val="20"/>
+                <w:szCs w:val="20"/>
+              </w:rPr>
+              <w:t>10</w:t>
+            </w:r>
           </w:p>
         </w:tc>
         <w:tc>
@@ -13846,7 +14664,39 @@
           <w:p>
             <w:pPr>
               <w:spacing w:before="20" w:after="20" w:line="252" w:lineRule="auto"/>
-            </w:pPr>
+              <w:rPr>
+                <w:sz w:val="20"/>
+                <w:szCs w:val="20"/>
+              </w:rPr>
+            </w:pPr>
+            <w:r>
+              <w:rPr>
+                <w:sz w:val="20"/>
+                <w:szCs w:val="20"/>
+              </w:rPr>
+              <w:t>README.md (</w:t>
+            </w:r>
+            <w:r>
+              <w:rPr>
+                <w:sz w:val="20"/>
+                <w:szCs w:val="20"/>
+              </w:rPr>
+              <w:t>Catatan penggunaan AI</w:t>
+            </w:r>
+            <w:r>
+              <w:rPr>
+                <w:sz w:val="20"/>
+                <w:szCs w:val="20"/>
+              </w:rPr>
+              <w:t>)</w:t>
+            </w:r>
+            <w:r>
+              <w:rPr>
+                <w:sz w:val="20"/>
+                <w:szCs w:val="20"/>
+              </w:rPr>
+              <w:t>.</w:t>
+            </w:r>
           </w:p>
         </w:tc>
       </w:tr>
@@ -13915,7 +14765,18 @@
           <w:p>
             <w:pPr>
               <w:spacing w:before="20" w:after="20" w:line="252" w:lineRule="auto"/>
-            </w:pPr>
+              <w:rPr>
+                <w:sz w:val="20"/>
+                <w:szCs w:val="20"/>
+              </w:rPr>
+            </w:pPr>
+            <w:r>
+              <w:rPr>
+                <w:sz w:val="20"/>
+                <w:szCs w:val="20"/>
+              </w:rPr>
+              <w:t>100</w:t>
+            </w:r>
           </w:p>
         </w:tc>
         <w:tc>
@@ -13931,11 +14792,30 @@
           <w:p>
             <w:pPr>
               <w:spacing w:before="20" w:after="20" w:line="252" w:lineRule="auto"/>
+              <w:rPr>
+                <w:sz w:val="20"/>
+                <w:szCs w:val="20"/>
+              </w:rPr>
             </w:pPr>
           </w:p>
         </w:tc>
       </w:tr>
     </w:tbl>
+    <w:p>
+      <w:pPr>
+        <w:spacing w:after="60"/>
+      </w:pPr>
+    </w:p>
+    <w:p>
+      <w:pPr>
+        <w:spacing w:after="60"/>
+      </w:pPr>
+    </w:p>
+    <w:p>
+      <w:pPr>
+        <w:spacing w:after="60"/>
+      </w:pPr>
+    </w:p>
     <w:p>
       <w:pPr>
         <w:spacing w:after="60"/>
@@ -13952,6 +14832,7 @@
           <w:b/>
           <w:color w:val="003796"/>
         </w:rPr>
+        <w:lastRenderedPageBreak/>
         <w:t>F.4  Catatan untuk pengampu</w:t>
       </w:r>
     </w:p>
@@ -13987,7 +14868,11 @@
               <w:right w:val="single" w:sz="4" w:space="0" w:color="B9C6E2"/>
             </w:tcBorders>
           </w:tcPr>
-          <w:p/>
+          <w:p>
+            <w:r>
+              <w:t xml:space="preserve">Mencocokkan nilai data-kategori tombol dengan nilai kategori proyek, lalu memastikan filter dan pesan </w:t>
+            </w:r>
+          </w:p>
         </w:tc>
       </w:tr>
       <w:tr>
@@ -14004,13 +14889,28 @@
               <w:right w:val="single" w:sz="4" w:space="0" w:color="B9C6E2"/>
             </w:tcBorders>
           </w:tcPr>
-          <w:p/>
+          <w:p>
+            <w:pPr>
+              <w:rPr>
+                <w:lang w:val="de-DE"/>
+              </w:rPr>
+            </w:pPr>
+            <w:r>
+              <w:rPr>
+                <w:lang w:val="de-DE"/>
+              </w:rPr>
+              <w:t>daftar kosong berubah sesuai hasilnya.</w:t>
+            </w:r>
+          </w:p>
         </w:tc>
       </w:tr>
     </w:tbl>
     <w:p>
       <w:pPr>
         <w:spacing w:after="60"/>
+        <w:rPr>
+          <w:lang w:val="de-DE"/>
+        </w:rPr>
       </w:pPr>
     </w:p>
     <w:p>
@@ -14045,7 +14945,11 @@
               <w:right w:val="single" w:sz="4" w:space="0" w:color="B9C6E2"/>
             </w:tcBorders>
           </w:tcPr>
-          <w:p/>
+          <w:p>
+            <w:r>
+              <w:t xml:space="preserve">Cara mengatur kelas tombol aktif dengan classList dan cara memisahkan logika data di app.js dari </w:t>
+            </w:r>
+          </w:p>
         </w:tc>
       </w:tr>
       <w:tr>
@@ -14062,7 +14966,11 @@
               <w:right w:val="single" w:sz="4" w:space="0" w:color="B9C6E2"/>
             </w:tcBorders>
           </w:tcPr>
-          <w:p/>
+          <w:p>
+            <w:r>
+              <w:t>interaksi DOM di dom.js.</w:t>
+            </w:r>
+          </w:p>
         </w:tc>
       </w:tr>
     </w:tbl>
@@ -14077,7 +14985,42 @@
           <w:rFonts w:cs="Carlito"/>
           <w:sz w:val="20"/>
         </w:rPr>
-        <w:t>Tanda tangan: ______________________________     Tanggal: ______________     Jam selesai: __________</w:t>
+        <w:t xml:space="preserve">Tanda tangan: </w:t>
+      </w:r>
+      <w:r>
+        <w:rPr>
+          <w:rFonts w:cs="Carlito"/>
+          <w:sz w:val="20"/>
+        </w:rPr>
+        <w:t>Muhamad Raynard Alif</w:t>
+      </w:r>
+      <w:r>
+        <w:rPr>
+          <w:rFonts w:cs="Carlito"/>
+          <w:sz w:val="20"/>
+        </w:rPr>
+        <w:t xml:space="preserve">    Tanggal: </w:t>
+      </w:r>
+      <w:r>
+        <w:rPr>
+          <w:rFonts w:cs="Carlito"/>
+          <w:sz w:val="20"/>
+        </w:rPr>
+        <w:t>12/10/2026</w:t>
+      </w:r>
+      <w:r>
+        <w:rPr>
+          <w:rFonts w:cs="Carlito"/>
+          <w:sz w:val="20"/>
+        </w:rPr>
+        <w:t xml:space="preserve">     Jam selesai: </w:t>
+      </w:r>
+      <w:r>
+        <w:rPr>
+          <w:rFonts w:cs="Carlito"/>
+          <w:sz w:val="20"/>
+        </w:rPr>
+        <w:t>21:49</w:t>
       </w:r>
     </w:p>
     <w:p>
@@ -14164,7 +15107,6 @@
                 <w:color w:val="E2E8F0"/>
                 <w:sz w:val="17"/>
               </w:rPr>
-              <w:lastRenderedPageBreak/>
               <w:t>git add .</w:t>
             </w:r>
             <w:r>

</xml_diff>